<commit_message>
lab06: improve localization and complete audited RSI report
</commit_message>
<xml_diff>
--- a/lab06/report/2024311281_孙驰_实验作业六.docx
+++ b/lab06/report/2024311281_孙驰_实验作业六.docx
@@ -23,7 +23,7 @@
     <w:p>
       <w:pPr>
         <w:keepLines/>
-        <w:spacing w:after="90" w:line="240" w:lineRule="auto"/>
+        <w:spacing w:after="70" w:line="240" w:lineRule="auto"/>
         <w:jc w:val="center"/>
       </w:pPr>
       <w:r>
@@ -33,7 +33,7 @@
           <w:szCs w:val="19"/>
           <w:color w:val="17212B"/>
         </w:rPr>
-        <w:t xml:space="preserve">SmolVLM-256M 精准定位的 RSI 递归自进化实验</w:t>
+        <w:t xml:space="preserve">SmolVLM 精准定位与 RSI 改进验证</w:t>
       </w:r>
     </w:p>
     <w:tbl>
@@ -78,8 +78,8 @@
             <w:r>
               <w:rPr>
                 <w:rFonts w:ascii="Arial" w:hAnsi="Arial" w:eastAsia="微软雅黑"/>
-                <w:sz w:val="18"/>
-                <w:szCs w:val="18"/>
+                <w:sz w:val="17"/>
+                <w:szCs w:val="17"/>
                 <w:color w:val="17212B"/>
                 <w:b/>
                 <w:bCs/>
@@ -108,8 +108,8 @@
             <w:r>
               <w:rPr>
                 <w:rFonts w:ascii="Arial" w:hAnsi="Arial" w:eastAsia="微软雅黑"/>
-                <w:sz w:val="18"/>
-                <w:szCs w:val="18"/>
+                <w:sz w:val="17"/>
+                <w:szCs w:val="17"/>
                 <w:color w:val="17212B"/>
                 <w:b/>
                 <w:bCs/>
@@ -143,8 +143,8 @@
             <w:r>
               <w:rPr>
                 <w:rFonts w:ascii="Arial" w:hAnsi="Arial" w:eastAsia="微软雅黑"/>
-                <w:sz w:val="18"/>
-                <w:szCs w:val="18"/>
+                <w:sz w:val="17"/>
+                <w:szCs w:val="17"/>
                 <w:color w:val="17212B"/>
               </w:rPr>
               <w:t xml:space="preserve">姓名／学号／班级</w:t>
@@ -171,8 +171,8 @@
             <w:r>
               <w:rPr>
                 <w:rFonts w:ascii="Arial" w:hAnsi="Arial" w:eastAsia="微软雅黑"/>
-                <w:sz w:val="18"/>
-                <w:szCs w:val="18"/>
+                <w:sz w:val="17"/>
+                <w:szCs w:val="17"/>
                 <w:color w:val="17212B"/>
               </w:rPr>
               <w:t xml:space="preserve">孙驰／2024311281／计算机10班</w:t>
@@ -204,11 +204,11 @@
             <w:r>
               <w:rPr>
                 <w:rFonts w:ascii="Arial" w:hAnsi="Arial" w:eastAsia="微软雅黑"/>
-                <w:sz w:val="18"/>
-                <w:szCs w:val="18"/>
+                <w:sz w:val="17"/>
+                <w:szCs w:val="17"/>
                 <w:color w:val="17212B"/>
               </w:rPr>
-              <w:t xml:space="preserve">日期／平台</w:t>
+              <w:t xml:space="preserve">日期／环境</w:t>
             </w:r>
           </w:p>
         </w:tc>
@@ -232,11 +232,11 @@
             <w:r>
               <w:rPr>
                 <w:rFonts w:ascii="Arial" w:hAnsi="Arial" w:eastAsia="微软雅黑"/>
-                <w:sz w:val="18"/>
-                <w:szCs w:val="18"/>
+                <w:sz w:val="17"/>
+                <w:szCs w:val="17"/>
                 <w:color w:val="17212B"/>
               </w:rPr>
-              <w:t xml:space="preserve">2026年10月22日；HPC gpu4，NVIDIA A30 24GB</w:t>
+              <w:t xml:space="preserve">2026年10月22日；HPC NVIDIA A30 24GB；NF4 QLoRA</w:t>
             </w:r>
           </w:p>
         </w:tc>
@@ -265,11 +265,11 @@
             <w:r>
               <w:rPr>
                 <w:rFonts w:ascii="Arial" w:hAnsi="Arial" w:eastAsia="微软雅黑"/>
-                <w:sz w:val="18"/>
-                <w:szCs w:val="18"/>
+                <w:sz w:val="17"/>
+                <w:szCs w:val="17"/>
                 <w:color w:val="17212B"/>
               </w:rPr>
-              <w:t xml:space="preserve">代码仓库</w:t>
+              <w:t xml:space="preserve">代码与记录</w:t>
             </w:r>
           </w:p>
         </w:tc>
@@ -293,11 +293,11 @@
             <w:r>
               <w:rPr>
                 <w:rFonts w:ascii="Arial" w:hAnsi="Arial" w:eastAsia="微软雅黑"/>
-                <w:sz w:val="18"/>
-                <w:szCs w:val="18"/>
+                <w:sz w:val="17"/>
+                <w:szCs w:val="17"/>
                 <w:color w:val="17212B"/>
               </w:rPr>
-              <w:t xml:space="preserve">https://github.com/s-max-oss/llm-course-labs/tree/main/lab06</w:t>
+              <w:t xml:space="preserve">github.com/s-max-oss/llm-course-labs/tree/main/lab06</w:t>
             </w:r>
           </w:p>
         </w:tc>
@@ -308,7 +308,7 @@
         <w:pStyle w:val="1"/>
         <w:keepNext/>
         <w:keepLines/>
-        <w:spacing w:after="70" w:line="240" w:lineRule="auto"/>
+        <w:spacing w:after="65" w:line="240" w:lineRule="auto"/>
       </w:pPr>
       <w:r>
         <w:rPr>
@@ -334,7 +334,7 @@
           <w:szCs w:val="19"/>
           <w:color w:val="17212B"/>
         </w:rPr>
-        <w:t xml:space="preserve">把彩色几何图形的目标位置映射到256×256画布上的4×4网格，比较基线、10步SFT、推理时工具纠错和两轮RSI后续训练。完成合成数据、颜色/形状像素验证器、高亮回灌、验证样本入池、逐题审计与图表；重点分辨参数更新与工具辅助的贡献。</w:t>
+        <w:t xml:space="preserve">完成256×256合成图的4×4网格定位、计数和存在性判断，比较基线、SFT、工具纠错及两轮RSI。先按指南10步设置复现，再针对定位0/8开展数据、输出编码、视觉适配和图像多样性对照；以留出新图检验改进，保留失败记录。</w:t>
       </w:r>
     </w:p>
     <w:p>
@@ -342,7 +342,7 @@
         <w:pStyle w:val="1"/>
         <w:keepNext/>
         <w:keepLines/>
-        <w:spacing w:after="70" w:line="240" w:lineRule="auto"/>
+        <w:spacing w:after="65" w:line="240" w:lineRule="auto"/>
       </w:pPr>
       <w:r>
         <w:rPr>
@@ -368,7 +368,7 @@
           <w:szCs w:val="19"/>
           <w:color w:val="17212B"/>
         </w:rPr>
-        <w:t xml:space="preserve">Python 3.10.20；torch 2.6.0+cu124；transformers 4.57.6；peft 0.17.1；bitsandbytes 0.48.1。A30上NF4双重量化、BF16计算；模型复用上次实验的离线权重，图像输入统一512像素单视图。作业号15391，墙钟4分16秒；运行后队列已清空。</w:t>
+        <w:t xml:space="preserve">Python 3.10.20；torch 2.6.0+cu124；transformers 4.57.6；peft 0.17.1；bitsandbytes 0.48.1。SmolVLM-256M离线权重，NF4双重量化、BF16计算，固定512px单视图；原始图仍为指南256px，修正样板480px笔误。</w:t>
       </w:r>
     </w:p>
     <w:tbl>
@@ -385,8 +385,8 @@
         <w:tblLayout w:type="fixed"/>
       </w:tblPr>
       <w:tblGrid>
-        <w:gridCol w:w="2850"/>
-        <w:gridCol w:w="6150"/>
+        <w:gridCol w:w="3700"/>
+        <w:gridCol w:w="5300"/>
       </w:tblGrid>
       <w:tr>
         <w:trPr>
@@ -395,7 +395,7 @@
         </w:trPr>
         <w:tc>
           <w:tcPr>
-            <w:tcW w:w="2850" w:type="dxa"/>
+            <w:tcW w:w="3700" w:type="dxa"/>
             <w:shd w:fill="DCEAF2"/>
             <w:vAlign w:val="center"/>
             <w:tcMar>
@@ -413,19 +413,19 @@
             <w:r>
               <w:rPr>
                 <w:rFonts w:ascii="Arial" w:hAnsi="Arial" w:eastAsia="微软雅黑"/>
-                <w:sz w:val="17"/>
-                <w:szCs w:val="17"/>
+                <w:sz w:val="16"/>
+                <w:szCs w:val="16"/>
                 <w:color w:val="17212B"/>
                 <w:b/>
                 <w:bCs/>
               </w:rPr>
-              <w:t xml:space="preserve">步骤／命令</w:t>
+              <w:t xml:space="preserve">命令／脚本</w:t>
             </w:r>
           </w:p>
         </w:tc>
         <w:tc>
           <w:tcPr>
-            <w:tcW w:w="6150" w:type="dxa"/>
+            <w:tcW w:w="5300" w:type="dxa"/>
             <w:shd w:fill="DCEAF2"/>
             <w:vAlign w:val="center"/>
             <w:tcMar>
@@ -443,13 +443,13 @@
             <w:r>
               <w:rPr>
                 <w:rFonts w:ascii="Arial" w:hAnsi="Arial" w:eastAsia="微软雅黑"/>
-                <w:sz w:val="17"/>
-                <w:szCs w:val="17"/>
+                <w:sz w:val="16"/>
+                <w:szCs w:val="16"/>
                 <w:color w:val="17212B"/>
                 <w:b/>
                 <w:bCs/>
               </w:rPr>
-              <w:t xml:space="preserve">作用与产物</w:t>
+              <w:t xml:space="preserve">配置与产物</w:t>
             </w:r>
           </w:p>
         </w:tc>
@@ -460,7 +460,7 @@
         </w:trPr>
         <w:tc>
           <w:tcPr>
-            <w:tcW w:w="2850" w:type="dxa"/>
+            <w:tcW w:w="3700" w:type="dxa"/>
             <w:shd w:fill="FFFFFF"/>
             <w:vAlign w:val="center"/>
             <w:tcMar>
@@ -478,17 +478,17 @@
             <w:r>
               <w:rPr>
                 <w:rFonts w:ascii="Arial" w:hAnsi="Arial" w:eastAsia="微软雅黑"/>
-                <w:sz w:val="17"/>
-                <w:szCs w:val="17"/>
+                <w:sz w:val="16"/>
+                <w:szCs w:val="16"/>
                 <w:color w:val="17212B"/>
               </w:rPr>
-              <w:t xml:space="preserve">make_data；make_sft</w:t>
+              <w:t xml:space="preserve">run_hpc.slurm</w:t>
             </w:r>
           </w:p>
         </w:tc>
         <w:tc>
           <w:tcPr>
-            <w:tcW w:w="6150" w:type="dxa"/>
+            <w:tcW w:w="5300" w:type="dxa"/>
             <w:shd w:fill="FFFFFF"/>
             <w:vAlign w:val="center"/>
             <w:tcMar>
@@ -506,11 +506,11 @@
             <w:r>
               <w:rPr>
                 <w:rFonts w:ascii="Arial" w:hAnsi="Arial" w:eastAsia="微软雅黑"/>
-                <w:sz w:val="17"/>
-                <w:szCs w:val="17"/>
+                <w:sz w:val="16"/>
+                <w:szCs w:val="16"/>
                 <w:color w:val="17212B"/>
               </w:rPr>
-              <w:t xml:space="preserve">40张训练图、15张留出图；15条GT种子样本</w:t>
+              <w:t xml:space="preserve">40张训练图、15张评测图；15种子；10步SFT、2×10步RSI</w:t>
             </w:r>
           </w:p>
         </w:tc>
@@ -521,7 +521,7 @@
         </w:trPr>
         <w:tc>
           <w:tcPr>
-            <w:tcW w:w="2850" w:type="dxa"/>
+            <w:tcW w:w="3700" w:type="dxa"/>
             <w:shd w:fill="F8FAFC"/>
             <w:vAlign w:val="center"/>
             <w:tcMar>
@@ -539,17 +539,17 @@
             <w:r>
               <w:rPr>
                 <w:rFonts w:ascii="Arial" w:hAnsi="Arial" w:eastAsia="微软雅黑"/>
-                <w:sz w:val="17"/>
-                <w:szCs w:val="17"/>
+                <w:sz w:val="16"/>
+                <w:szCs w:val="16"/>
                 <w:color w:val="17212B"/>
               </w:rPr>
-              <w:t xml:space="preserve">infer；sft --steps 10</w:t>
+              <w:t xml:space="preserve">run_improvement／run_visual_grounding.slurm</w:t>
             </w:r>
           </w:p>
         </w:tc>
         <w:tc>
           <w:tcPr>
-            <w:tcW w:w="6150" w:type="dxa"/>
+            <w:tcW w:w="5300" w:type="dxa"/>
             <w:shd w:fill="F8FAFC"/>
             <w:vAlign w:val="center"/>
             <w:tcMar>
@@ -567,11 +567,11 @@
             <w:r>
               <w:rPr>
                 <w:rFonts w:ascii="Arial" w:hAnsi="Arial" w:eastAsia="微软雅黑"/>
-                <w:sz w:val="17"/>
-                <w:szCs w:val="17"/>
+                <w:sz w:val="16"/>
+                <w:szCs w:val="16"/>
                 <w:color w:val="17212B"/>
               </w:rPr>
-              <w:t xml:space="preserve">15题基线；SFT适配器与逐步损失</w:t>
+              <w:t xml:space="preserve">语言LoRA三组各400步；视觉+连接层LoRA 1200步</w:t>
             </w:r>
           </w:p>
         </w:tc>
@@ -582,7 +582,7 @@
         </w:trPr>
         <w:tc>
           <w:tcPr>
-            <w:tcW w:w="2850" w:type="dxa"/>
+            <w:tcW w:w="3700" w:type="dxa"/>
             <w:shd w:fill="FFFFFF"/>
             <w:vAlign w:val="center"/>
             <w:tcMar>
@@ -600,17 +600,17 @@
             <w:r>
               <w:rPr>
                 <w:rFonts w:ascii="Arial" w:hAnsi="Arial" w:eastAsia="微软雅黑"/>
-                <w:sz w:val="17"/>
-                <w:szCs w:val="17"/>
+                <w:sz w:val="16"/>
+                <w:szCs w:val="16"/>
                 <w:color w:val="17212B"/>
               </w:rPr>
-              <w:t xml:space="preserve">eval；rsi --rounds 2 --steps 10</w:t>
+              <w:t xml:space="preserve">run_augmented_grounding／run_final.slurm</w:t>
             </w:r>
           </w:p>
         </w:tc>
         <w:tc>
           <w:tcPr>
-            <w:tcW w:w="6150" w:type="dxa"/>
+            <w:tcW w:w="5300" w:type="dxa"/>
             <w:shd w:fill="FFFFFF"/>
             <w:vAlign w:val="center"/>
             <w:tcMar>
@@ -628,11 +628,11 @@
             <w:r>
               <w:rPr>
                 <w:rFonts w:ascii="Arial" w:hAnsi="Arial" w:eastAsia="微软雅黑"/>
-                <w:sz w:val="17"/>
-                <w:szCs w:val="17"/>
+                <w:sz w:val="16"/>
+                <w:szCs w:val="16"/>
                 <w:color w:val="17212B"/>
               </w:rPr>
-              <w:t xml:space="preserve">三阶段评测；两轮反馈、数据池快照、适配器</w:t>
+              <w:t xml:space="preserve">4000张变化图课程训练；联合SFT 400步、RSI 2×80步</w:t>
             </w:r>
           </w:p>
         </w:tc>
@@ -646,11 +646,11 @@
       <w:r>
         <w:rPr>
           <w:rFonts w:ascii="Arial" w:hAnsi="Arial" w:eastAsia="微软雅黑"/>
-          <w:sz w:val="19"/>
-          <w:szCs w:val="19"/>
+          <w:sz w:val="18"/>
+          <w:szCs w:val="18"/>
           <w:color w:val="17212B"/>
         </w:rPr>
-        <w:t xml:space="preserve">完整命令、原始Slurm日志和逐题JSON见仓库lab06/run_hpc.slurm、provenance及results；评测阶段计时分别为baseline 14.0s、sft_eval 12.1s、sft_tool_eval 23.7s。</w:t>
+        <w:t xml:space="preserve">扩展HPC累计103.7GPU分钟（含开发），最终作业15397耗时00:25:43、退出码0:0，结束后队列为空。CPU为Python 3.11.16/torch 2.14.0+cpu，FP32、8线程完整六阶段耗时11.5分钟，6/6退出码0；与NF4成绩分开。</w:t>
       </w:r>
     </w:p>
     <w:p>
@@ -658,7 +658,7 @@
         <w:pStyle w:val="1"/>
         <w:keepNext/>
         <w:keepLines/>
-        <w:spacing w:after="70" w:line="240" w:lineRule="auto"/>
+        <w:spacing w:after="65" w:line="240" w:lineRule="auto"/>
       </w:pPr>
       <w:r>
         <w:rPr>
@@ -684,7 +684,7 @@
           <w:szCs w:val="19"/>
           <w:color w:val="17212B"/>
         </w:rPr>
-        <w:t xml:space="preserve">定位：框中心(cx,cy)按floor(4·cy/256)、floor(4·cx/256)转成行列，输出“第r行第c列”，兼容rXcY与X,Y；评测另算预测格框对GT对象框的IoU。输入和答案分别编码，prompt标签设为−100，只对答案token计算损失。</w:t>
+        <w:t xml:space="preserve">目标框中心按r=floor(cy/64)+1、c=floor(cx/64)+1求1起始行列，输出rXcY，评分映射为中文坐标；仅完整有效答案计分。IoU为预测格框与目标对象框的交并比，正确格不等于IoU=1。prompt标签置−100，只训练答案token。</w:t>
       </w:r>
     </w:p>
     <w:p>
@@ -699,7 +699,7 @@
           <w:szCs w:val="19"/>
           <w:color w:val="17212B"/>
         </w:rPr>
-        <w:t xml:space="preserve">SFT：冻结基座，仅在语言注意力q/k/v/o注入LoRA（r=8，α=16，dropout=0.05），可训练921600/257406528=0.3580%。RSI：错误答案若有可解析格则高亮回灌自查；像素验证器按颜色连通块及角点区分圆/方，提供核验结论与候选格覆盖率，不提示目标答案；只有验证正确且未重复的训练图样本入池，再训练10步。</w:t>
+        <w:t xml:space="preserve">默认语言q/k/v/o LoRA有921600个参数。扩展到视觉注意力、跨模态连接层及语言模块后，可训练1614336个参数，占0.6255%；非重入检查点与首步非零梯度检查保证视觉模块实际更新。固定128图明显过拟合后，改用逐步不同的4000图，从单目标递进到2–4目标。</w:t>
       </w:r>
     </w:p>
     <w:p>
@@ -714,7 +714,45 @@
           <w:szCs w:val="19"/>
           <w:color w:val="17212B"/>
         </w:rPr>
-        <w:t xml:space="preserve">参考脚本会把评测图用于种子SFT，且以标准答案判断纠错触发。本实现用t00–t14做种子、t15–t29做反馈、e00–e14固定留出评测；反馈决策只读图像和题目，GT仅事后评分。样板的“480px”和“make_seed”与指南不一致，实际采用256px及make_sft。</w:t>
+        <w:t xml:space="preserve">定位训练、开发验证、最终测试各覆盖16格×8类别；验证及测试各128张，另补0–4计数与均衡存在性，总计各184题，图像哈希不跨集重复。按开发定位率、再按总正确率选阶段，平分取较早者；最终测试不参与选型或自举。</w:t>
+      </w:r>
+    </w:p>
+    <w:p>
+      <w:pPr>
+        <w:keepLines/>
+        <w:spacing w:after="50" w:line="240" w:lineRule="auto"/>
+      </w:pPr>
+      <w:r>
+        <w:rPr>
+          <w:rFonts w:ascii="Arial" w:hAnsi="Arial" w:eastAsia="微软雅黑"/>
+          <w:sz w:val="18"/>
+          <w:szCs w:val="18"/>
+          <w:color w:val="17212B"/>
+        </w:rPr>
+        <w:t xml:space="preserve">RSI反馈只用训练图：紫框自查、检测框提示后仍错，则模型给16格/0–4/有无的合法候选评分，验证器依次核验；仅通过核验、首次纠正且未重复的候选入池，来源注明自查、检测框或候选核验。弱提示、检测框、有限候选核验均单列；搜索依赖工具。</w:t>
+      </w:r>
+    </w:p>
+    <w:p>
+      <w:pPr>
+        <w:keepLines/>
+        <w:spacing w:after="25" w:line="240" w:lineRule="auto"/>
+      </w:pPr>
+      <w:r>
+        <w:rPr>
+          <w:rFonts w:ascii="Arial" w:hAnsi="Arial" w:eastAsia="微软雅黑"/>
+          <w:sz w:val="14"/>
+          <w:szCs w:val="14"/>
+          <w:color w:val="17212B"/>
+        </w:rPr>
+        <w:t xml:space="preserve">运行日志节选（完整输出见provenance/final-15397.log）：</w:t>
+        <w:br/>
+        <w:t xml:space="preserve">[rsi1] pool=4119 added=7 corrected=15/15</w:t>
+        <w:br/>
+        <w:t xml:space="preserve">[rsi2] pool=4120 added=1 corrected=15/15</w:t>
+        <w:br/>
+        <w:t xml:space="preserve">[final] selected=sft loc=109/128 total=144/184</w:t>
+        <w:br/>
+        <w:t xml:space="preserve">[complete] optimized SFT, two RSI rounds and sealed final test</w:t>
       </w:r>
     </w:p>
     <w:p>
@@ -723,7 +761,7 @@
         <w:keepNext/>
         <w:pageBreakBefore/>
         <w:keepLines/>
-        <w:spacing w:after="70" w:line="240" w:lineRule="auto"/>
+        <w:spacing w:after="65" w:line="240" w:lineRule="auto"/>
       </w:pPr>
       <w:r>
         <w:rPr>
@@ -741,18 +779,18 @@
       <w:pPr>
         <w:keepNext/>
         <w:keepLines/>
-        <w:spacing w:after="35" w:line="240" w:lineRule="auto"/>
+        <w:spacing w:after="30" w:line="240" w:lineRule="auto"/>
       </w:pPr>
       <w:r>
         <w:rPr>
           <w:rFonts w:ascii="Arial" w:hAnsi="Arial" w:eastAsia="微软雅黑"/>
-          <w:sz w:val="18"/>
-          <w:szCs w:val="18"/>
+          <w:sz w:val="17"/>
+          <w:szCs w:val="17"/>
           <w:color w:val="17212B"/>
           <w:b/>
           <w:bCs/>
         </w:rPr>
-        <w:t xml:space="preserve">表6  留出15题逐阶段结果（loc 8、count 4、exist 3）</w:t>
+        <w:t xml:space="preserve">表6  指南15题的默认参照与扩展对照（定位8、计数4、存在性3）</w:t>
       </w:r>
     </w:p>
     <w:tbl>
@@ -769,12 +807,12 @@
         <w:tblLayout w:type="fixed"/>
       </w:tblPr>
       <w:tblGrid>
-        <w:gridCol w:w="2600"/>
-        <w:gridCol w:w="1060"/>
-        <w:gridCol w:w="1060"/>
-        <w:gridCol w:w="1060"/>
-        <w:gridCol w:w="1100"/>
-        <w:gridCol w:w="2120"/>
+        <w:gridCol w:w="2700"/>
+        <w:gridCol w:w="1000"/>
+        <w:gridCol w:w="1000"/>
+        <w:gridCol w:w="1000"/>
+        <w:gridCol w:w="1200"/>
+        <w:gridCol w:w="2100"/>
       </w:tblGrid>
       <w:tr>
         <w:trPr>
@@ -783,7 +821,7 @@
         </w:trPr>
         <w:tc>
           <w:tcPr>
-            <w:tcW w:w="2600" w:type="dxa"/>
+            <w:tcW w:w="2700" w:type="dxa"/>
             <w:shd w:fill="DCEAF2"/>
             <w:vAlign w:val="center"/>
             <w:tcMar>
@@ -813,7 +851,7 @@
         </w:tc>
         <w:tc>
           <w:tcPr>
-            <w:tcW w:w="1060" w:type="dxa"/>
+            <w:tcW w:w="1000" w:type="dxa"/>
             <w:shd w:fill="DCEAF2"/>
             <w:vAlign w:val="center"/>
             <w:tcMar>
@@ -837,13 +875,13 @@
                 <w:b/>
                 <w:bCs/>
               </w:rPr>
-              <w:t xml:space="preserve">loc</w:t>
+              <w:t xml:space="preserve">定位</w:t>
             </w:r>
           </w:p>
         </w:tc>
         <w:tc>
           <w:tcPr>
-            <w:tcW w:w="1060" w:type="dxa"/>
+            <w:tcW w:w="1000" w:type="dxa"/>
             <w:shd w:fill="DCEAF2"/>
             <w:vAlign w:val="center"/>
             <w:tcMar>
@@ -867,13 +905,13 @@
                 <w:b/>
                 <w:bCs/>
               </w:rPr>
-              <w:t xml:space="preserve">count</w:t>
+              <w:t xml:space="preserve">计数</w:t>
             </w:r>
           </w:p>
         </w:tc>
         <w:tc>
           <w:tcPr>
-            <w:tcW w:w="1060" w:type="dxa"/>
+            <w:tcW w:w="1000" w:type="dxa"/>
             <w:shd w:fill="DCEAF2"/>
             <w:vAlign w:val="center"/>
             <w:tcMar>
@@ -897,13 +935,13 @@
                 <w:b/>
                 <w:bCs/>
               </w:rPr>
-              <w:t xml:space="preserve">exist</w:t>
+              <w:t xml:space="preserve">存在</w:t>
             </w:r>
           </w:p>
         </w:tc>
         <w:tc>
           <w:tcPr>
-            <w:tcW w:w="1100" w:type="dxa"/>
+            <w:tcW w:w="1200" w:type="dxa"/>
             <w:shd w:fill="DCEAF2"/>
             <w:vAlign w:val="center"/>
             <w:tcMar>
@@ -933,7 +971,7 @@
         </w:tc>
         <w:tc>
           <w:tcPr>
-            <w:tcW w:w="2120" w:type="dxa"/>
+            <w:tcW w:w="2100" w:type="dxa"/>
             <w:shd w:fill="DCEAF2"/>
             <w:vAlign w:val="center"/>
             <w:tcMar>
@@ -957,7 +995,7 @@
                 <w:b/>
                 <w:bCs/>
               </w:rPr>
-              <w:t xml:space="preserve">平均IoU</w:t>
+              <w:t xml:space="preserve">IoU</w:t>
             </w:r>
           </w:p>
         </w:tc>
@@ -968,7 +1006,7 @@
         </w:trPr>
         <w:tc>
           <w:tcPr>
-            <w:tcW w:w="2600" w:type="dxa"/>
+            <w:tcW w:w="2700" w:type="dxa"/>
             <w:shd w:fill="FFFFFF"/>
             <w:vAlign w:val="center"/>
             <w:tcMar>
@@ -990,13 +1028,13 @@
                 <w:szCs w:val="16"/>
                 <w:color w:val="17212B"/>
               </w:rPr>
-              <w:t xml:space="preserve">基线</w:t>
+              <w:t xml:space="preserve">原基线</w:t>
             </w:r>
           </w:p>
         </w:tc>
         <w:tc>
           <w:tcPr>
-            <w:tcW w:w="1060" w:type="dxa"/>
+            <w:tcW w:w="1000" w:type="dxa"/>
             <w:shd w:fill="FFFFFF"/>
             <w:vAlign w:val="center"/>
             <w:tcMar>
@@ -1024,7 +1062,7 @@
         </w:tc>
         <w:tc>
           <w:tcPr>
-            <w:tcW w:w="1060" w:type="dxa"/>
+            <w:tcW w:w="1000" w:type="dxa"/>
             <w:shd w:fill="FFFFFF"/>
             <w:vAlign w:val="center"/>
             <w:tcMar>
@@ -1052,7 +1090,7 @@
         </w:tc>
         <w:tc>
           <w:tcPr>
-            <w:tcW w:w="1060" w:type="dxa"/>
+            <w:tcW w:w="1000" w:type="dxa"/>
             <w:shd w:fill="FFFFFF"/>
             <w:vAlign w:val="center"/>
             <w:tcMar>
@@ -1080,7 +1118,7 @@
         </w:tc>
         <w:tc>
           <w:tcPr>
-            <w:tcW w:w="1100" w:type="dxa"/>
+            <w:tcW w:w="1200" w:type="dxa"/>
             <w:shd w:fill="FFFFFF"/>
             <w:vAlign w:val="center"/>
             <w:tcMar>
@@ -1108,7 +1146,7 @@
         </w:tc>
         <w:tc>
           <w:tcPr>
-            <w:tcW w:w="2120" w:type="dxa"/>
+            <w:tcW w:w="2100" w:type="dxa"/>
             <w:shd w:fill="FFFFFF"/>
             <w:vAlign w:val="center"/>
             <w:tcMar>
@@ -1141,7 +1179,7 @@
         </w:trPr>
         <w:tc>
           <w:tcPr>
-            <w:tcW w:w="2600" w:type="dxa"/>
+            <w:tcW w:w="2700" w:type="dxa"/>
             <w:shd w:fill="F8FAFC"/>
             <w:vAlign w:val="center"/>
             <w:tcMar>
@@ -1163,13 +1201,13 @@
                 <w:szCs w:val="16"/>
                 <w:color w:val="17212B"/>
               </w:rPr>
-              <w:t xml:space="preserve">SFT 10步</w:t>
+              <w:t xml:space="preserve">原10步SFT</w:t>
             </w:r>
           </w:p>
         </w:tc>
         <w:tc>
           <w:tcPr>
-            <w:tcW w:w="1060" w:type="dxa"/>
+            <w:tcW w:w="1000" w:type="dxa"/>
             <w:shd w:fill="F8FAFC"/>
             <w:vAlign w:val="center"/>
             <w:tcMar>
@@ -1197,7 +1235,7 @@
         </w:tc>
         <w:tc>
           <w:tcPr>
-            <w:tcW w:w="1060" w:type="dxa"/>
+            <w:tcW w:w="1000" w:type="dxa"/>
             <w:shd w:fill="F8FAFC"/>
             <w:vAlign w:val="center"/>
             <w:tcMar>
@@ -1225,7 +1263,7 @@
         </w:tc>
         <w:tc>
           <w:tcPr>
-            <w:tcW w:w="1060" w:type="dxa"/>
+            <w:tcW w:w="1000" w:type="dxa"/>
             <w:shd w:fill="F8FAFC"/>
             <w:vAlign w:val="center"/>
             <w:tcMar>
@@ -1253,7 +1291,7 @@
         </w:tc>
         <w:tc>
           <w:tcPr>
-            <w:tcW w:w="1100" w:type="dxa"/>
+            <w:tcW w:w="1200" w:type="dxa"/>
             <w:shd w:fill="F8FAFC"/>
             <w:vAlign w:val="center"/>
             <w:tcMar>
@@ -1281,7 +1319,7 @@
         </w:tc>
         <w:tc>
           <w:tcPr>
-            <w:tcW w:w="2120" w:type="dxa"/>
+            <w:tcW w:w="2100" w:type="dxa"/>
             <w:shd w:fill="F8FAFC"/>
             <w:vAlign w:val="center"/>
             <w:tcMar>
@@ -1314,7 +1352,7 @@
         </w:trPr>
         <w:tc>
           <w:tcPr>
-            <w:tcW w:w="2600" w:type="dxa"/>
+            <w:tcW w:w="2700" w:type="dxa"/>
             <w:shd w:fill="FFFFFF"/>
             <w:vAlign w:val="center"/>
             <w:tcMar>
@@ -1336,13 +1374,13 @@
                 <w:szCs w:val="16"/>
                 <w:color w:val="17212B"/>
               </w:rPr>
-              <w:t xml:space="preserve">SFT+验证器</w:t>
+              <w:t xml:space="preserve">原SFT+验证器</w:t>
             </w:r>
           </w:p>
         </w:tc>
         <w:tc>
           <w:tcPr>
-            <w:tcW w:w="1060" w:type="dxa"/>
+            <w:tcW w:w="1000" w:type="dxa"/>
             <w:shd w:fill="FFFFFF"/>
             <w:vAlign w:val="center"/>
             <w:tcMar>
@@ -1370,7 +1408,7 @@
         </w:tc>
         <w:tc>
           <w:tcPr>
-            <w:tcW w:w="1060" w:type="dxa"/>
+            <w:tcW w:w="1000" w:type="dxa"/>
             <w:shd w:fill="FFFFFF"/>
             <w:vAlign w:val="center"/>
             <w:tcMar>
@@ -1398,7 +1436,7 @@
         </w:tc>
         <w:tc>
           <w:tcPr>
-            <w:tcW w:w="1060" w:type="dxa"/>
+            <w:tcW w:w="1000" w:type="dxa"/>
             <w:shd w:fill="FFFFFF"/>
             <w:vAlign w:val="center"/>
             <w:tcMar>
@@ -1426,7 +1464,7 @@
         </w:tc>
         <w:tc>
           <w:tcPr>
-            <w:tcW w:w="1100" w:type="dxa"/>
+            <w:tcW w:w="1200" w:type="dxa"/>
             <w:shd w:fill="FFFFFF"/>
             <w:vAlign w:val="center"/>
             <w:tcMar>
@@ -1454,7 +1492,7 @@
         </w:tc>
         <w:tc>
           <w:tcPr>
-            <w:tcW w:w="2120" w:type="dxa"/>
+            <w:tcW w:w="2100" w:type="dxa"/>
             <w:shd w:fill="FFFFFF"/>
             <w:vAlign w:val="center"/>
             <w:tcMar>
@@ -1487,7 +1525,7 @@
         </w:trPr>
         <w:tc>
           <w:tcPr>
-            <w:tcW w:w="2600" w:type="dxa"/>
+            <w:tcW w:w="2700" w:type="dxa"/>
             <w:shd w:fill="F8FAFC"/>
             <w:vAlign w:val="center"/>
             <w:tcMar>
@@ -1509,13 +1547,13 @@
                 <w:szCs w:val="16"/>
                 <w:color w:val="17212B"/>
               </w:rPr>
-              <w:t xml:space="preserve">RSI第1轮</w:t>
+              <w:t xml:space="preserve">原RSI第1轮</w:t>
             </w:r>
           </w:p>
         </w:tc>
         <w:tc>
           <w:tcPr>
-            <w:tcW w:w="1060" w:type="dxa"/>
+            <w:tcW w:w="1000" w:type="dxa"/>
             <w:shd w:fill="F8FAFC"/>
             <w:vAlign w:val="center"/>
             <w:tcMar>
@@ -1543,7 +1581,7 @@
         </w:tc>
         <w:tc>
           <w:tcPr>
-            <w:tcW w:w="1060" w:type="dxa"/>
+            <w:tcW w:w="1000" w:type="dxa"/>
             <w:shd w:fill="F8FAFC"/>
             <w:vAlign w:val="center"/>
             <w:tcMar>
@@ -1571,7 +1609,7 @@
         </w:tc>
         <w:tc>
           <w:tcPr>
-            <w:tcW w:w="1060" w:type="dxa"/>
+            <w:tcW w:w="1000" w:type="dxa"/>
             <w:shd w:fill="F8FAFC"/>
             <w:vAlign w:val="center"/>
             <w:tcMar>
@@ -1599,7 +1637,7 @@
         </w:tc>
         <w:tc>
           <w:tcPr>
-            <w:tcW w:w="1100" w:type="dxa"/>
+            <w:tcW w:w="1200" w:type="dxa"/>
             <w:shd w:fill="F8FAFC"/>
             <w:vAlign w:val="center"/>
             <w:tcMar>
@@ -1627,7 +1665,7 @@
         </w:tc>
         <w:tc>
           <w:tcPr>
-            <w:tcW w:w="2120" w:type="dxa"/>
+            <w:tcW w:w="2100" w:type="dxa"/>
             <w:shd w:fill="F8FAFC"/>
             <w:vAlign w:val="center"/>
             <w:tcMar>
@@ -1660,7 +1698,7 @@
         </w:trPr>
         <w:tc>
           <w:tcPr>
-            <w:tcW w:w="2600" w:type="dxa"/>
+            <w:tcW w:w="2700" w:type="dxa"/>
             <w:shd w:fill="FFFFFF"/>
             <w:vAlign w:val="center"/>
             <w:tcMar>
@@ -1682,13 +1720,13 @@
                 <w:szCs w:val="16"/>
                 <w:color w:val="17212B"/>
               </w:rPr>
-              <w:t xml:space="preserve">RSI第2轮</w:t>
+              <w:t xml:space="preserve">原RSI第2轮</w:t>
             </w:r>
           </w:p>
         </w:tc>
         <w:tc>
           <w:tcPr>
-            <w:tcW w:w="1060" w:type="dxa"/>
+            <w:tcW w:w="1000" w:type="dxa"/>
             <w:shd w:fill="FFFFFF"/>
             <w:vAlign w:val="center"/>
             <w:tcMar>
@@ -1716,7 +1754,7 @@
         </w:tc>
         <w:tc>
           <w:tcPr>
-            <w:tcW w:w="1060" w:type="dxa"/>
+            <w:tcW w:w="1000" w:type="dxa"/>
             <w:shd w:fill="FFFFFF"/>
             <w:vAlign w:val="center"/>
             <w:tcMar>
@@ -1744,7 +1782,7 @@
         </w:tc>
         <w:tc>
           <w:tcPr>
-            <w:tcW w:w="1060" w:type="dxa"/>
+            <w:tcW w:w="1000" w:type="dxa"/>
             <w:shd w:fill="FFFFFF"/>
             <w:vAlign w:val="center"/>
             <w:tcMar>
@@ -1772,7 +1810,7 @@
         </w:tc>
         <w:tc>
           <w:tcPr>
-            <w:tcW w:w="1100" w:type="dxa"/>
+            <w:tcW w:w="1200" w:type="dxa"/>
             <w:shd w:fill="FFFFFF"/>
             <w:vAlign w:val="center"/>
             <w:tcMar>
@@ -1800,7 +1838,7 @@
         </w:tc>
         <w:tc>
           <w:tcPr>
-            <w:tcW w:w="2120" w:type="dxa"/>
+            <w:tcW w:w="2100" w:type="dxa"/>
             <w:shd w:fill="FFFFFF"/>
             <w:vAlign w:val="center"/>
             <w:tcMar>
@@ -1827,23 +1865,1076 @@
           </w:p>
         </w:tc>
       </w:tr>
+      <w:tr>
+        <w:trPr>
+          <w:cantSplit/>
+        </w:trPr>
+        <w:tc>
+          <w:tcPr>
+            <w:tcW w:w="2700" w:type="dxa"/>
+            <w:shd w:fill="F8FAFC"/>
+            <w:vAlign w:val="center"/>
+            <w:tcMar>
+              <w:top w:w="30" w:type="dxa"/>
+              <w:bottom w:w="30" w:type="dxa"/>
+              <w:left w:w="55" w:type="dxa"/>
+              <w:right w:w="55" w:type="dxa"/>
+            </w:tcMar>
+          </w:tcPr>
+          <w:p>
+            <w:pPr>
+              <w:keepLines/>
+              <w:spacing w:after="0" w:line="240" w:lineRule="auto"/>
+            </w:pPr>
+            <w:r>
+              <w:rPr>
+                <w:rFonts w:ascii="Arial" w:hAnsi="Arial" w:eastAsia="微软雅黑"/>
+                <w:sz w:val="16"/>
+                <w:szCs w:val="16"/>
+                <w:color w:val="17212B"/>
+              </w:rPr>
+              <w:t xml:space="preserve">改进SFT独立</w:t>
+            </w:r>
+          </w:p>
+        </w:tc>
+        <w:tc>
+          <w:tcPr>
+            <w:tcW w:w="1000" w:type="dxa"/>
+            <w:shd w:fill="F8FAFC"/>
+            <w:vAlign w:val="center"/>
+            <w:tcMar>
+              <w:top w:w="30" w:type="dxa"/>
+              <w:bottom w:w="30" w:type="dxa"/>
+              <w:left w:w="55" w:type="dxa"/>
+              <w:right w:w="55" w:type="dxa"/>
+            </w:tcMar>
+          </w:tcPr>
+          <w:p>
+            <w:pPr>
+              <w:keepLines/>
+              <w:spacing w:after="0" w:line="240" w:lineRule="auto"/>
+            </w:pPr>
+            <w:r>
+              <w:rPr>
+                <w:rFonts w:ascii="Arial" w:hAnsi="Arial" w:eastAsia="微软雅黑"/>
+                <w:sz w:val="16"/>
+                <w:szCs w:val="16"/>
+                <w:color w:val="17212B"/>
+              </w:rPr>
+              <w:t xml:space="preserve">8/8</w:t>
+            </w:r>
+          </w:p>
+        </w:tc>
+        <w:tc>
+          <w:tcPr>
+            <w:tcW w:w="1000" w:type="dxa"/>
+            <w:shd w:fill="F8FAFC"/>
+            <w:vAlign w:val="center"/>
+            <w:tcMar>
+              <w:top w:w="30" w:type="dxa"/>
+              <w:bottom w:w="30" w:type="dxa"/>
+              <w:left w:w="55" w:type="dxa"/>
+              <w:right w:w="55" w:type="dxa"/>
+            </w:tcMar>
+          </w:tcPr>
+          <w:p>
+            <w:pPr>
+              <w:keepLines/>
+              <w:spacing w:after="0" w:line="240" w:lineRule="auto"/>
+            </w:pPr>
+            <w:r>
+              <w:rPr>
+                <w:rFonts w:ascii="Arial" w:hAnsi="Arial" w:eastAsia="微软雅黑"/>
+                <w:sz w:val="16"/>
+                <w:szCs w:val="16"/>
+                <w:color w:val="17212B"/>
+              </w:rPr>
+              <w:t xml:space="preserve">2/4</w:t>
+            </w:r>
+          </w:p>
+        </w:tc>
+        <w:tc>
+          <w:tcPr>
+            <w:tcW w:w="1000" w:type="dxa"/>
+            <w:shd w:fill="F8FAFC"/>
+            <w:vAlign w:val="center"/>
+            <w:tcMar>
+              <w:top w:w="30" w:type="dxa"/>
+              <w:bottom w:w="30" w:type="dxa"/>
+              <w:left w:w="55" w:type="dxa"/>
+              <w:right w:w="55" w:type="dxa"/>
+            </w:tcMar>
+          </w:tcPr>
+          <w:p>
+            <w:pPr>
+              <w:keepLines/>
+              <w:spacing w:after="0" w:line="240" w:lineRule="auto"/>
+            </w:pPr>
+            <w:r>
+              <w:rPr>
+                <w:rFonts w:ascii="Arial" w:hAnsi="Arial" w:eastAsia="微软雅黑"/>
+                <w:sz w:val="16"/>
+                <w:szCs w:val="16"/>
+                <w:color w:val="17212B"/>
+              </w:rPr>
+              <w:t xml:space="preserve">2/3</w:t>
+            </w:r>
+          </w:p>
+        </w:tc>
+        <w:tc>
+          <w:tcPr>
+            <w:tcW w:w="1200" w:type="dxa"/>
+            <w:shd w:fill="F8FAFC"/>
+            <w:vAlign w:val="center"/>
+            <w:tcMar>
+              <w:top w:w="30" w:type="dxa"/>
+              <w:bottom w:w="30" w:type="dxa"/>
+              <w:left w:w="55" w:type="dxa"/>
+              <w:right w:w="55" w:type="dxa"/>
+            </w:tcMar>
+          </w:tcPr>
+          <w:p>
+            <w:pPr>
+              <w:keepLines/>
+              <w:spacing w:after="0" w:line="240" w:lineRule="auto"/>
+            </w:pPr>
+            <w:r>
+              <w:rPr>
+                <w:rFonts w:ascii="Arial" w:hAnsi="Arial" w:eastAsia="微软雅黑"/>
+                <w:sz w:val="16"/>
+                <w:szCs w:val="16"/>
+                <w:color w:val="17212B"/>
+              </w:rPr>
+              <w:t xml:space="preserve">12/15</w:t>
+            </w:r>
+          </w:p>
+        </w:tc>
+        <w:tc>
+          <w:tcPr>
+            <w:tcW w:w="2100" w:type="dxa"/>
+            <w:shd w:fill="F8FAFC"/>
+            <w:vAlign w:val="center"/>
+            <w:tcMar>
+              <w:top w:w="30" w:type="dxa"/>
+              <w:bottom w:w="30" w:type="dxa"/>
+              <w:left w:w="55" w:type="dxa"/>
+              <w:right w:w="55" w:type="dxa"/>
+            </w:tcMar>
+          </w:tcPr>
+          <w:p>
+            <w:pPr>
+              <w:keepLines/>
+              <w:spacing w:after="0" w:line="240" w:lineRule="auto"/>
+            </w:pPr>
+            <w:r>
+              <w:rPr>
+                <w:rFonts w:ascii="Arial" w:hAnsi="Arial" w:eastAsia="微软雅黑"/>
+                <w:sz w:val="16"/>
+                <w:szCs w:val="16"/>
+                <w:color w:val="17212B"/>
+              </w:rPr>
+              <w:t xml:space="preserve">0.393</w:t>
+            </w:r>
+          </w:p>
+        </w:tc>
+      </w:tr>
+      <w:tr>
+        <w:trPr>
+          <w:cantSplit/>
+        </w:trPr>
+        <w:tc>
+          <w:tcPr>
+            <w:tcW w:w="2700" w:type="dxa"/>
+            <w:shd w:fill="FFFFFF"/>
+            <w:vAlign w:val="center"/>
+            <w:tcMar>
+              <w:top w:w="30" w:type="dxa"/>
+              <w:bottom w:w="30" w:type="dxa"/>
+              <w:left w:w="55" w:type="dxa"/>
+              <w:right w:w="55" w:type="dxa"/>
+            </w:tcMar>
+          </w:tcPr>
+          <w:p>
+            <w:pPr>
+              <w:keepLines/>
+              <w:spacing w:after="0" w:line="240" w:lineRule="auto"/>
+            </w:pPr>
+            <w:r>
+              <w:rPr>
+                <w:rFonts w:ascii="Arial" w:hAnsi="Arial" w:eastAsia="微软雅黑"/>
+                <w:sz w:val="16"/>
+                <w:szCs w:val="16"/>
+                <w:color w:val="17212B"/>
+              </w:rPr>
+              <w:t xml:space="preserve">改进SFT+弱提示</w:t>
+            </w:r>
+          </w:p>
+        </w:tc>
+        <w:tc>
+          <w:tcPr>
+            <w:tcW w:w="1000" w:type="dxa"/>
+            <w:shd w:fill="FFFFFF"/>
+            <w:vAlign w:val="center"/>
+            <w:tcMar>
+              <w:top w:w="30" w:type="dxa"/>
+              <w:bottom w:w="30" w:type="dxa"/>
+              <w:left w:w="55" w:type="dxa"/>
+              <w:right w:w="55" w:type="dxa"/>
+            </w:tcMar>
+          </w:tcPr>
+          <w:p>
+            <w:pPr>
+              <w:keepLines/>
+              <w:spacing w:after="0" w:line="240" w:lineRule="auto"/>
+            </w:pPr>
+            <w:r>
+              <w:rPr>
+                <w:rFonts w:ascii="Arial" w:hAnsi="Arial" w:eastAsia="微软雅黑"/>
+                <w:sz w:val="16"/>
+                <w:szCs w:val="16"/>
+                <w:color w:val="17212B"/>
+              </w:rPr>
+              <w:t xml:space="preserve">8/8</w:t>
+            </w:r>
+          </w:p>
+        </w:tc>
+        <w:tc>
+          <w:tcPr>
+            <w:tcW w:w="1000" w:type="dxa"/>
+            <w:shd w:fill="FFFFFF"/>
+            <w:vAlign w:val="center"/>
+            <w:tcMar>
+              <w:top w:w="30" w:type="dxa"/>
+              <w:bottom w:w="30" w:type="dxa"/>
+              <w:left w:w="55" w:type="dxa"/>
+              <w:right w:w="55" w:type="dxa"/>
+            </w:tcMar>
+          </w:tcPr>
+          <w:p>
+            <w:pPr>
+              <w:keepLines/>
+              <w:spacing w:after="0" w:line="240" w:lineRule="auto"/>
+            </w:pPr>
+            <w:r>
+              <w:rPr>
+                <w:rFonts w:ascii="Arial" w:hAnsi="Arial" w:eastAsia="微软雅黑"/>
+                <w:sz w:val="16"/>
+                <w:szCs w:val="16"/>
+                <w:color w:val="17212B"/>
+              </w:rPr>
+              <w:t xml:space="preserve">2/4</w:t>
+            </w:r>
+          </w:p>
+        </w:tc>
+        <w:tc>
+          <w:tcPr>
+            <w:tcW w:w="1000" w:type="dxa"/>
+            <w:shd w:fill="FFFFFF"/>
+            <w:vAlign w:val="center"/>
+            <w:tcMar>
+              <w:top w:w="30" w:type="dxa"/>
+              <w:bottom w:w="30" w:type="dxa"/>
+              <w:left w:w="55" w:type="dxa"/>
+              <w:right w:w="55" w:type="dxa"/>
+            </w:tcMar>
+          </w:tcPr>
+          <w:p>
+            <w:pPr>
+              <w:keepLines/>
+              <w:spacing w:after="0" w:line="240" w:lineRule="auto"/>
+            </w:pPr>
+            <w:r>
+              <w:rPr>
+                <w:rFonts w:ascii="Arial" w:hAnsi="Arial" w:eastAsia="微软雅黑"/>
+                <w:sz w:val="16"/>
+                <w:szCs w:val="16"/>
+                <w:color w:val="17212B"/>
+              </w:rPr>
+              <w:t xml:space="preserve">3/3</w:t>
+            </w:r>
+          </w:p>
+        </w:tc>
+        <w:tc>
+          <w:tcPr>
+            <w:tcW w:w="1200" w:type="dxa"/>
+            <w:shd w:fill="FFFFFF"/>
+            <w:vAlign w:val="center"/>
+            <w:tcMar>
+              <w:top w:w="30" w:type="dxa"/>
+              <w:bottom w:w="30" w:type="dxa"/>
+              <w:left w:w="55" w:type="dxa"/>
+              <w:right w:w="55" w:type="dxa"/>
+            </w:tcMar>
+          </w:tcPr>
+          <w:p>
+            <w:pPr>
+              <w:keepLines/>
+              <w:spacing w:after="0" w:line="240" w:lineRule="auto"/>
+            </w:pPr>
+            <w:r>
+              <w:rPr>
+                <w:rFonts w:ascii="Arial" w:hAnsi="Arial" w:eastAsia="微软雅黑"/>
+                <w:sz w:val="16"/>
+                <w:szCs w:val="16"/>
+                <w:color w:val="17212B"/>
+              </w:rPr>
+              <w:t xml:space="preserve">13/15</w:t>
+            </w:r>
+          </w:p>
+        </w:tc>
+        <w:tc>
+          <w:tcPr>
+            <w:tcW w:w="2100" w:type="dxa"/>
+            <w:shd w:fill="FFFFFF"/>
+            <w:vAlign w:val="center"/>
+            <w:tcMar>
+              <w:top w:w="30" w:type="dxa"/>
+              <w:bottom w:w="30" w:type="dxa"/>
+              <w:left w:w="55" w:type="dxa"/>
+              <w:right w:w="55" w:type="dxa"/>
+            </w:tcMar>
+          </w:tcPr>
+          <w:p>
+            <w:pPr>
+              <w:keepLines/>
+              <w:spacing w:after="0" w:line="240" w:lineRule="auto"/>
+            </w:pPr>
+            <w:r>
+              <w:rPr>
+                <w:rFonts w:ascii="Arial" w:hAnsi="Arial" w:eastAsia="微软雅黑"/>
+                <w:sz w:val="16"/>
+                <w:szCs w:val="16"/>
+                <w:color w:val="17212B"/>
+              </w:rPr>
+              <w:t xml:space="preserve">0.393</w:t>
+            </w:r>
+          </w:p>
+        </w:tc>
+      </w:tr>
+      <w:tr>
+        <w:trPr>
+          <w:cantSplit/>
+        </w:trPr>
+        <w:tc>
+          <w:tcPr>
+            <w:tcW w:w="2700" w:type="dxa"/>
+            <w:shd w:fill="F8FAFC"/>
+            <w:vAlign w:val="center"/>
+            <w:tcMar>
+              <w:top w:w="30" w:type="dxa"/>
+              <w:bottom w:w="30" w:type="dxa"/>
+              <w:left w:w="55" w:type="dxa"/>
+              <w:right w:w="55" w:type="dxa"/>
+            </w:tcMar>
+          </w:tcPr>
+          <w:p>
+            <w:pPr>
+              <w:keepLines/>
+              <w:spacing w:after="0" w:line="240" w:lineRule="auto"/>
+            </w:pPr>
+            <w:r>
+              <w:rPr>
+                <w:rFonts w:ascii="Arial" w:hAnsi="Arial" w:eastAsia="微软雅黑"/>
+                <w:sz w:val="16"/>
+                <w:szCs w:val="16"/>
+                <w:color w:val="17212B"/>
+              </w:rPr>
+              <w:t xml:space="preserve">改进SFT+检测框</w:t>
+            </w:r>
+          </w:p>
+        </w:tc>
+        <w:tc>
+          <w:tcPr>
+            <w:tcW w:w="1000" w:type="dxa"/>
+            <w:shd w:fill="F8FAFC"/>
+            <w:vAlign w:val="center"/>
+            <w:tcMar>
+              <w:top w:w="30" w:type="dxa"/>
+              <w:bottom w:w="30" w:type="dxa"/>
+              <w:left w:w="55" w:type="dxa"/>
+              <w:right w:w="55" w:type="dxa"/>
+            </w:tcMar>
+          </w:tcPr>
+          <w:p>
+            <w:pPr>
+              <w:keepLines/>
+              <w:spacing w:after="0" w:line="240" w:lineRule="auto"/>
+            </w:pPr>
+            <w:r>
+              <w:rPr>
+                <w:rFonts w:ascii="Arial" w:hAnsi="Arial" w:eastAsia="微软雅黑"/>
+                <w:sz w:val="16"/>
+                <w:szCs w:val="16"/>
+                <w:color w:val="17212B"/>
+              </w:rPr>
+              <w:t xml:space="preserve">8/8</w:t>
+            </w:r>
+          </w:p>
+        </w:tc>
+        <w:tc>
+          <w:tcPr>
+            <w:tcW w:w="1000" w:type="dxa"/>
+            <w:shd w:fill="F8FAFC"/>
+            <w:vAlign w:val="center"/>
+            <w:tcMar>
+              <w:top w:w="30" w:type="dxa"/>
+              <w:bottom w:w="30" w:type="dxa"/>
+              <w:left w:w="55" w:type="dxa"/>
+              <w:right w:w="55" w:type="dxa"/>
+            </w:tcMar>
+          </w:tcPr>
+          <w:p>
+            <w:pPr>
+              <w:keepLines/>
+              <w:spacing w:after="0" w:line="240" w:lineRule="auto"/>
+            </w:pPr>
+            <w:r>
+              <w:rPr>
+                <w:rFonts w:ascii="Arial" w:hAnsi="Arial" w:eastAsia="微软雅黑"/>
+                <w:sz w:val="16"/>
+                <w:szCs w:val="16"/>
+                <w:color w:val="17212B"/>
+              </w:rPr>
+              <w:t xml:space="preserve">3/4</w:t>
+            </w:r>
+          </w:p>
+        </w:tc>
+        <w:tc>
+          <w:tcPr>
+            <w:tcW w:w="1000" w:type="dxa"/>
+            <w:shd w:fill="F8FAFC"/>
+            <w:vAlign w:val="center"/>
+            <w:tcMar>
+              <w:top w:w="30" w:type="dxa"/>
+              <w:bottom w:w="30" w:type="dxa"/>
+              <w:left w:w="55" w:type="dxa"/>
+              <w:right w:w="55" w:type="dxa"/>
+            </w:tcMar>
+          </w:tcPr>
+          <w:p>
+            <w:pPr>
+              <w:keepLines/>
+              <w:spacing w:after="0" w:line="240" w:lineRule="auto"/>
+            </w:pPr>
+            <w:r>
+              <w:rPr>
+                <w:rFonts w:ascii="Arial" w:hAnsi="Arial" w:eastAsia="微软雅黑"/>
+                <w:sz w:val="16"/>
+                <w:szCs w:val="16"/>
+                <w:color w:val="17212B"/>
+              </w:rPr>
+              <w:t xml:space="preserve">3/3</w:t>
+            </w:r>
+          </w:p>
+        </w:tc>
+        <w:tc>
+          <w:tcPr>
+            <w:tcW w:w="1200" w:type="dxa"/>
+            <w:shd w:fill="F8FAFC"/>
+            <w:vAlign w:val="center"/>
+            <w:tcMar>
+              <w:top w:w="30" w:type="dxa"/>
+              <w:bottom w:w="30" w:type="dxa"/>
+              <w:left w:w="55" w:type="dxa"/>
+              <w:right w:w="55" w:type="dxa"/>
+            </w:tcMar>
+          </w:tcPr>
+          <w:p>
+            <w:pPr>
+              <w:keepLines/>
+              <w:spacing w:after="0" w:line="240" w:lineRule="auto"/>
+            </w:pPr>
+            <w:r>
+              <w:rPr>
+                <w:rFonts w:ascii="Arial" w:hAnsi="Arial" w:eastAsia="微软雅黑"/>
+                <w:sz w:val="16"/>
+                <w:szCs w:val="16"/>
+                <w:color w:val="17212B"/>
+              </w:rPr>
+              <w:t xml:space="preserve">14/15</w:t>
+            </w:r>
+          </w:p>
+        </w:tc>
+        <w:tc>
+          <w:tcPr>
+            <w:tcW w:w="2100" w:type="dxa"/>
+            <w:shd w:fill="F8FAFC"/>
+            <w:vAlign w:val="center"/>
+            <w:tcMar>
+              <w:top w:w="30" w:type="dxa"/>
+              <w:bottom w:w="30" w:type="dxa"/>
+              <w:left w:w="55" w:type="dxa"/>
+              <w:right w:w="55" w:type="dxa"/>
+            </w:tcMar>
+          </w:tcPr>
+          <w:p>
+            <w:pPr>
+              <w:keepLines/>
+              <w:spacing w:after="0" w:line="240" w:lineRule="auto"/>
+            </w:pPr>
+            <w:r>
+              <w:rPr>
+                <w:rFonts w:ascii="Arial" w:hAnsi="Arial" w:eastAsia="微软雅黑"/>
+                <w:sz w:val="16"/>
+                <w:szCs w:val="16"/>
+                <w:color w:val="17212B"/>
+              </w:rPr>
+              <w:t xml:space="preserve">0.393</w:t>
+            </w:r>
+          </w:p>
+        </w:tc>
+      </w:tr>
+      <w:tr>
+        <w:trPr>
+          <w:cantSplit/>
+        </w:trPr>
+        <w:tc>
+          <w:tcPr>
+            <w:tcW w:w="2700" w:type="dxa"/>
+            <w:shd w:fill="FFFFFF"/>
+            <w:vAlign w:val="center"/>
+            <w:tcMar>
+              <w:top w:w="30" w:type="dxa"/>
+              <w:bottom w:w="30" w:type="dxa"/>
+              <w:left w:w="55" w:type="dxa"/>
+              <w:right w:w="55" w:type="dxa"/>
+            </w:tcMar>
+          </w:tcPr>
+          <w:p>
+            <w:pPr>
+              <w:keepLines/>
+              <w:spacing w:after="0" w:line="240" w:lineRule="auto"/>
+            </w:pPr>
+            <w:r>
+              <w:rPr>
+                <w:rFonts w:ascii="Arial" w:hAnsi="Arial" w:eastAsia="微软雅黑"/>
+                <w:sz w:val="16"/>
+                <w:szCs w:val="16"/>
+                <w:color w:val="17212B"/>
+              </w:rPr>
+              <w:t xml:space="preserve">改进SFT+候选核验</w:t>
+            </w:r>
+          </w:p>
+        </w:tc>
+        <w:tc>
+          <w:tcPr>
+            <w:tcW w:w="1000" w:type="dxa"/>
+            <w:shd w:fill="FFFFFF"/>
+            <w:vAlign w:val="center"/>
+            <w:tcMar>
+              <w:top w:w="30" w:type="dxa"/>
+              <w:bottom w:w="30" w:type="dxa"/>
+              <w:left w:w="55" w:type="dxa"/>
+              <w:right w:w="55" w:type="dxa"/>
+            </w:tcMar>
+          </w:tcPr>
+          <w:p>
+            <w:pPr>
+              <w:keepLines/>
+              <w:spacing w:after="0" w:line="240" w:lineRule="auto"/>
+            </w:pPr>
+            <w:r>
+              <w:rPr>
+                <w:rFonts w:ascii="Arial" w:hAnsi="Arial" w:eastAsia="微软雅黑"/>
+                <w:sz w:val="16"/>
+                <w:szCs w:val="16"/>
+                <w:color w:val="17212B"/>
+              </w:rPr>
+              <w:t xml:space="preserve">8/8</w:t>
+            </w:r>
+          </w:p>
+        </w:tc>
+        <w:tc>
+          <w:tcPr>
+            <w:tcW w:w="1000" w:type="dxa"/>
+            <w:shd w:fill="FFFFFF"/>
+            <w:vAlign w:val="center"/>
+            <w:tcMar>
+              <w:top w:w="30" w:type="dxa"/>
+              <w:bottom w:w="30" w:type="dxa"/>
+              <w:left w:w="55" w:type="dxa"/>
+              <w:right w:w="55" w:type="dxa"/>
+            </w:tcMar>
+          </w:tcPr>
+          <w:p>
+            <w:pPr>
+              <w:keepLines/>
+              <w:spacing w:after="0" w:line="240" w:lineRule="auto"/>
+            </w:pPr>
+            <w:r>
+              <w:rPr>
+                <w:rFonts w:ascii="Arial" w:hAnsi="Arial" w:eastAsia="微软雅黑"/>
+                <w:sz w:val="16"/>
+                <w:szCs w:val="16"/>
+                <w:color w:val="17212B"/>
+              </w:rPr>
+              <w:t xml:space="preserve">4/4</w:t>
+            </w:r>
+          </w:p>
+        </w:tc>
+        <w:tc>
+          <w:tcPr>
+            <w:tcW w:w="1000" w:type="dxa"/>
+            <w:shd w:fill="FFFFFF"/>
+            <w:vAlign w:val="center"/>
+            <w:tcMar>
+              <w:top w:w="30" w:type="dxa"/>
+              <w:bottom w:w="30" w:type="dxa"/>
+              <w:left w:w="55" w:type="dxa"/>
+              <w:right w:w="55" w:type="dxa"/>
+            </w:tcMar>
+          </w:tcPr>
+          <w:p>
+            <w:pPr>
+              <w:keepLines/>
+              <w:spacing w:after="0" w:line="240" w:lineRule="auto"/>
+            </w:pPr>
+            <w:r>
+              <w:rPr>
+                <w:rFonts w:ascii="Arial" w:hAnsi="Arial" w:eastAsia="微软雅黑"/>
+                <w:sz w:val="16"/>
+                <w:szCs w:val="16"/>
+                <w:color w:val="17212B"/>
+              </w:rPr>
+              <w:t xml:space="preserve">3/3</w:t>
+            </w:r>
+          </w:p>
+        </w:tc>
+        <w:tc>
+          <w:tcPr>
+            <w:tcW w:w="1200" w:type="dxa"/>
+            <w:shd w:fill="FFFFFF"/>
+            <w:vAlign w:val="center"/>
+            <w:tcMar>
+              <w:top w:w="30" w:type="dxa"/>
+              <w:bottom w:w="30" w:type="dxa"/>
+              <w:left w:w="55" w:type="dxa"/>
+              <w:right w:w="55" w:type="dxa"/>
+            </w:tcMar>
+          </w:tcPr>
+          <w:p>
+            <w:pPr>
+              <w:keepLines/>
+              <w:spacing w:after="0" w:line="240" w:lineRule="auto"/>
+            </w:pPr>
+            <w:r>
+              <w:rPr>
+                <w:rFonts w:ascii="Arial" w:hAnsi="Arial" w:eastAsia="微软雅黑"/>
+                <w:sz w:val="16"/>
+                <w:szCs w:val="16"/>
+                <w:color w:val="17212B"/>
+              </w:rPr>
+              <w:t xml:space="preserve">15/15</w:t>
+            </w:r>
+          </w:p>
+        </w:tc>
+        <w:tc>
+          <w:tcPr>
+            <w:tcW w:w="2100" w:type="dxa"/>
+            <w:shd w:fill="FFFFFF"/>
+            <w:vAlign w:val="center"/>
+            <w:tcMar>
+              <w:top w:w="30" w:type="dxa"/>
+              <w:bottom w:w="30" w:type="dxa"/>
+              <w:left w:w="55" w:type="dxa"/>
+              <w:right w:w="55" w:type="dxa"/>
+            </w:tcMar>
+          </w:tcPr>
+          <w:p>
+            <w:pPr>
+              <w:keepLines/>
+              <w:spacing w:after="0" w:line="240" w:lineRule="auto"/>
+            </w:pPr>
+            <w:r>
+              <w:rPr>
+                <w:rFonts w:ascii="Arial" w:hAnsi="Arial" w:eastAsia="微软雅黑"/>
+                <w:sz w:val="16"/>
+                <w:szCs w:val="16"/>
+                <w:color w:val="17212B"/>
+              </w:rPr>
+              <w:t xml:space="preserve">0.393</w:t>
+            </w:r>
+          </w:p>
+        </w:tc>
+      </w:tr>
+      <w:tr>
+        <w:trPr>
+          <w:cantSplit/>
+        </w:trPr>
+        <w:tc>
+          <w:tcPr>
+            <w:tcW w:w="2700" w:type="dxa"/>
+            <w:shd w:fill="F8FAFC"/>
+            <w:vAlign w:val="center"/>
+            <w:tcMar>
+              <w:top w:w="30" w:type="dxa"/>
+              <w:bottom w:w="30" w:type="dxa"/>
+              <w:left w:w="55" w:type="dxa"/>
+              <w:right w:w="55" w:type="dxa"/>
+            </w:tcMar>
+          </w:tcPr>
+          <w:p>
+            <w:pPr>
+              <w:keepLines/>
+              <w:spacing w:after="0" w:line="240" w:lineRule="auto"/>
+            </w:pPr>
+            <w:r>
+              <w:rPr>
+                <w:rFonts w:ascii="Arial" w:hAnsi="Arial" w:eastAsia="微软雅黑"/>
+                <w:sz w:val="16"/>
+                <w:szCs w:val="16"/>
+                <w:color w:val="17212B"/>
+              </w:rPr>
+              <w:t xml:space="preserve">RSI第1轮独立</w:t>
+            </w:r>
+          </w:p>
+        </w:tc>
+        <w:tc>
+          <w:tcPr>
+            <w:tcW w:w="1000" w:type="dxa"/>
+            <w:shd w:fill="F8FAFC"/>
+            <w:vAlign w:val="center"/>
+            <w:tcMar>
+              <w:top w:w="30" w:type="dxa"/>
+              <w:bottom w:w="30" w:type="dxa"/>
+              <w:left w:w="55" w:type="dxa"/>
+              <w:right w:w="55" w:type="dxa"/>
+            </w:tcMar>
+          </w:tcPr>
+          <w:p>
+            <w:pPr>
+              <w:keepLines/>
+              <w:spacing w:after="0" w:line="240" w:lineRule="auto"/>
+            </w:pPr>
+            <w:r>
+              <w:rPr>
+                <w:rFonts w:ascii="Arial" w:hAnsi="Arial" w:eastAsia="微软雅黑"/>
+                <w:sz w:val="16"/>
+                <w:szCs w:val="16"/>
+                <w:color w:val="17212B"/>
+              </w:rPr>
+              <w:t xml:space="preserve">8/8</w:t>
+            </w:r>
+          </w:p>
+        </w:tc>
+        <w:tc>
+          <w:tcPr>
+            <w:tcW w:w="1000" w:type="dxa"/>
+            <w:shd w:fill="F8FAFC"/>
+            <w:vAlign w:val="center"/>
+            <w:tcMar>
+              <w:top w:w="30" w:type="dxa"/>
+              <w:bottom w:w="30" w:type="dxa"/>
+              <w:left w:w="55" w:type="dxa"/>
+              <w:right w:w="55" w:type="dxa"/>
+            </w:tcMar>
+          </w:tcPr>
+          <w:p>
+            <w:pPr>
+              <w:keepLines/>
+              <w:spacing w:after="0" w:line="240" w:lineRule="auto"/>
+            </w:pPr>
+            <w:r>
+              <w:rPr>
+                <w:rFonts w:ascii="Arial" w:hAnsi="Arial" w:eastAsia="微软雅黑"/>
+                <w:sz w:val="16"/>
+                <w:szCs w:val="16"/>
+                <w:color w:val="17212B"/>
+              </w:rPr>
+              <w:t xml:space="preserve">2/4</w:t>
+            </w:r>
+          </w:p>
+        </w:tc>
+        <w:tc>
+          <w:tcPr>
+            <w:tcW w:w="1000" w:type="dxa"/>
+            <w:shd w:fill="F8FAFC"/>
+            <w:vAlign w:val="center"/>
+            <w:tcMar>
+              <w:top w:w="30" w:type="dxa"/>
+              <w:bottom w:w="30" w:type="dxa"/>
+              <w:left w:w="55" w:type="dxa"/>
+              <w:right w:w="55" w:type="dxa"/>
+            </w:tcMar>
+          </w:tcPr>
+          <w:p>
+            <w:pPr>
+              <w:keepLines/>
+              <w:spacing w:after="0" w:line="240" w:lineRule="auto"/>
+            </w:pPr>
+            <w:r>
+              <w:rPr>
+                <w:rFonts w:ascii="Arial" w:hAnsi="Arial" w:eastAsia="微软雅黑"/>
+                <w:sz w:val="16"/>
+                <w:szCs w:val="16"/>
+                <w:color w:val="17212B"/>
+              </w:rPr>
+              <w:t xml:space="preserve">2/3</w:t>
+            </w:r>
+          </w:p>
+        </w:tc>
+        <w:tc>
+          <w:tcPr>
+            <w:tcW w:w="1200" w:type="dxa"/>
+            <w:shd w:fill="F8FAFC"/>
+            <w:vAlign w:val="center"/>
+            <w:tcMar>
+              <w:top w:w="30" w:type="dxa"/>
+              <w:bottom w:w="30" w:type="dxa"/>
+              <w:left w:w="55" w:type="dxa"/>
+              <w:right w:w="55" w:type="dxa"/>
+            </w:tcMar>
+          </w:tcPr>
+          <w:p>
+            <w:pPr>
+              <w:keepLines/>
+              <w:spacing w:after="0" w:line="240" w:lineRule="auto"/>
+            </w:pPr>
+            <w:r>
+              <w:rPr>
+                <w:rFonts w:ascii="Arial" w:hAnsi="Arial" w:eastAsia="微软雅黑"/>
+                <w:sz w:val="16"/>
+                <w:szCs w:val="16"/>
+                <w:color w:val="17212B"/>
+              </w:rPr>
+              <w:t xml:space="preserve">12/15</w:t>
+            </w:r>
+          </w:p>
+        </w:tc>
+        <w:tc>
+          <w:tcPr>
+            <w:tcW w:w="2100" w:type="dxa"/>
+            <w:shd w:fill="F8FAFC"/>
+            <w:vAlign w:val="center"/>
+            <w:tcMar>
+              <w:top w:w="30" w:type="dxa"/>
+              <w:bottom w:w="30" w:type="dxa"/>
+              <w:left w:w="55" w:type="dxa"/>
+              <w:right w:w="55" w:type="dxa"/>
+            </w:tcMar>
+          </w:tcPr>
+          <w:p>
+            <w:pPr>
+              <w:keepLines/>
+              <w:spacing w:after="0" w:line="240" w:lineRule="auto"/>
+            </w:pPr>
+            <w:r>
+              <w:rPr>
+                <w:rFonts w:ascii="Arial" w:hAnsi="Arial" w:eastAsia="微软雅黑"/>
+                <w:sz w:val="16"/>
+                <w:szCs w:val="16"/>
+                <w:color w:val="17212B"/>
+              </w:rPr>
+              <w:t xml:space="preserve">0.393</w:t>
+            </w:r>
+          </w:p>
+        </w:tc>
+      </w:tr>
+      <w:tr>
+        <w:trPr>
+          <w:cantSplit/>
+        </w:trPr>
+        <w:tc>
+          <w:tcPr>
+            <w:tcW w:w="2700" w:type="dxa"/>
+            <w:shd w:fill="FFFFFF"/>
+            <w:vAlign w:val="center"/>
+            <w:tcMar>
+              <w:top w:w="30" w:type="dxa"/>
+              <w:bottom w:w="30" w:type="dxa"/>
+              <w:left w:w="55" w:type="dxa"/>
+              <w:right w:w="55" w:type="dxa"/>
+            </w:tcMar>
+          </w:tcPr>
+          <w:p>
+            <w:pPr>
+              <w:keepLines/>
+              <w:spacing w:after="0" w:line="240" w:lineRule="auto"/>
+            </w:pPr>
+            <w:r>
+              <w:rPr>
+                <w:rFonts w:ascii="Arial" w:hAnsi="Arial" w:eastAsia="微软雅黑"/>
+                <w:sz w:val="16"/>
+                <w:szCs w:val="16"/>
+                <w:color w:val="17212B"/>
+              </w:rPr>
+              <w:t xml:space="preserve">RSI第2轮独立</w:t>
+            </w:r>
+          </w:p>
+        </w:tc>
+        <w:tc>
+          <w:tcPr>
+            <w:tcW w:w="1000" w:type="dxa"/>
+            <w:shd w:fill="FFFFFF"/>
+            <w:vAlign w:val="center"/>
+            <w:tcMar>
+              <w:top w:w="30" w:type="dxa"/>
+              <w:bottom w:w="30" w:type="dxa"/>
+              <w:left w:w="55" w:type="dxa"/>
+              <w:right w:w="55" w:type="dxa"/>
+            </w:tcMar>
+          </w:tcPr>
+          <w:p>
+            <w:pPr>
+              <w:keepLines/>
+              <w:spacing w:after="0" w:line="240" w:lineRule="auto"/>
+            </w:pPr>
+            <w:r>
+              <w:rPr>
+                <w:rFonts w:ascii="Arial" w:hAnsi="Arial" w:eastAsia="微软雅黑"/>
+                <w:sz w:val="16"/>
+                <w:szCs w:val="16"/>
+                <w:color w:val="17212B"/>
+              </w:rPr>
+              <w:t xml:space="preserve">8/8</w:t>
+            </w:r>
+          </w:p>
+        </w:tc>
+        <w:tc>
+          <w:tcPr>
+            <w:tcW w:w="1000" w:type="dxa"/>
+            <w:shd w:fill="FFFFFF"/>
+            <w:vAlign w:val="center"/>
+            <w:tcMar>
+              <w:top w:w="30" w:type="dxa"/>
+              <w:bottom w:w="30" w:type="dxa"/>
+              <w:left w:w="55" w:type="dxa"/>
+              <w:right w:w="55" w:type="dxa"/>
+            </w:tcMar>
+          </w:tcPr>
+          <w:p>
+            <w:pPr>
+              <w:keepLines/>
+              <w:spacing w:after="0" w:line="240" w:lineRule="auto"/>
+            </w:pPr>
+            <w:r>
+              <w:rPr>
+                <w:rFonts w:ascii="Arial" w:hAnsi="Arial" w:eastAsia="微软雅黑"/>
+                <w:sz w:val="16"/>
+                <w:szCs w:val="16"/>
+                <w:color w:val="17212B"/>
+              </w:rPr>
+              <w:t xml:space="preserve">2/4</w:t>
+            </w:r>
+          </w:p>
+        </w:tc>
+        <w:tc>
+          <w:tcPr>
+            <w:tcW w:w="1000" w:type="dxa"/>
+            <w:shd w:fill="FFFFFF"/>
+            <w:vAlign w:val="center"/>
+            <w:tcMar>
+              <w:top w:w="30" w:type="dxa"/>
+              <w:bottom w:w="30" w:type="dxa"/>
+              <w:left w:w="55" w:type="dxa"/>
+              <w:right w:w="55" w:type="dxa"/>
+            </w:tcMar>
+          </w:tcPr>
+          <w:p>
+            <w:pPr>
+              <w:keepLines/>
+              <w:spacing w:after="0" w:line="240" w:lineRule="auto"/>
+            </w:pPr>
+            <w:r>
+              <w:rPr>
+                <w:rFonts w:ascii="Arial" w:hAnsi="Arial" w:eastAsia="微软雅黑"/>
+                <w:sz w:val="16"/>
+                <w:szCs w:val="16"/>
+                <w:color w:val="17212B"/>
+              </w:rPr>
+              <w:t xml:space="preserve">3/3</w:t>
+            </w:r>
+          </w:p>
+        </w:tc>
+        <w:tc>
+          <w:tcPr>
+            <w:tcW w:w="1200" w:type="dxa"/>
+            <w:shd w:fill="FFFFFF"/>
+            <w:vAlign w:val="center"/>
+            <w:tcMar>
+              <w:top w:w="30" w:type="dxa"/>
+              <w:bottom w:w="30" w:type="dxa"/>
+              <w:left w:w="55" w:type="dxa"/>
+              <w:right w:w="55" w:type="dxa"/>
+            </w:tcMar>
+          </w:tcPr>
+          <w:p>
+            <w:pPr>
+              <w:keepLines/>
+              <w:spacing w:after="0" w:line="240" w:lineRule="auto"/>
+            </w:pPr>
+            <w:r>
+              <w:rPr>
+                <w:rFonts w:ascii="Arial" w:hAnsi="Arial" w:eastAsia="微软雅黑"/>
+                <w:sz w:val="16"/>
+                <w:szCs w:val="16"/>
+                <w:color w:val="17212B"/>
+              </w:rPr>
+              <w:t xml:space="preserve">13/15</w:t>
+            </w:r>
+          </w:p>
+        </w:tc>
+        <w:tc>
+          <w:tcPr>
+            <w:tcW w:w="2100" w:type="dxa"/>
+            <w:shd w:fill="FFFFFF"/>
+            <w:vAlign w:val="center"/>
+            <w:tcMar>
+              <w:top w:w="30" w:type="dxa"/>
+              <w:bottom w:w="30" w:type="dxa"/>
+              <w:left w:w="55" w:type="dxa"/>
+              <w:right w:w="55" w:type="dxa"/>
+            </w:tcMar>
+          </w:tcPr>
+          <w:p>
+            <w:pPr>
+              <w:keepLines/>
+              <w:spacing w:after="0" w:line="240" w:lineRule="auto"/>
+            </w:pPr>
+            <w:r>
+              <w:rPr>
+                <w:rFonts w:ascii="Arial" w:hAnsi="Arial" w:eastAsia="微软雅黑"/>
+                <w:sz w:val="16"/>
+                <w:szCs w:val="16"/>
+                <w:color w:val="17212B"/>
+              </w:rPr>
+              <w:t xml:space="preserve">0.393</w:t>
+            </w:r>
+          </w:p>
+        </w:tc>
+      </w:tr>
     </w:tbl>
+    <w:p>
+      <w:pPr>
+        <w:keepLines/>
+        <w:spacing w:after="25" w:line="240" w:lineRule="auto"/>
+      </w:pPr>
+      <w:r>
+        <w:rPr>
+          <w:rFonts w:ascii="Arial" w:hAnsi="Arial" w:eastAsia="微软雅黑"/>
+          <w:sz w:val="16"/>
+          <w:szCs w:val="16"/>
+          <w:color w:val="17212B"/>
+        </w:rPr>
+        <w:t xml:space="preserve">默认两轮：池15→17→17，新增2、0条，轮末独立7/15、4/15。下表为扩展闭环。</w:t>
+      </w:r>
+    </w:p>
     <w:p>
       <w:pPr>
         <w:keepNext/>
         <w:keepLines/>
-        <w:spacing w:after="35" w:line="240" w:lineRule="auto"/>
+        <w:spacing w:after="30" w:line="240" w:lineRule="auto"/>
       </w:pPr>
       <w:r>
         <w:rPr>
           <w:rFonts w:ascii="Arial" w:hAnsi="Arial" w:eastAsia="微软雅黑"/>
-          <w:sz w:val="18"/>
-          <w:szCs w:val="18"/>
+          <w:sz w:val="17"/>
+          <w:szCs w:val="17"/>
           <w:color w:val="17212B"/>
           <w:b/>
           <w:bCs/>
         </w:rPr>
-        <w:t xml:space="preserve">表7  训练图反馈轮次（轮末准确率为留出评测）</w:t>
+        <w:t xml:space="preserve">表7  扩展两轮反馈（轮末独立依次12/15、13/15，见表6）</w:t>
       </w:r>
     </w:p>
     <w:tbl>
@@ -1860,13 +2951,12 @@
         <w:tblLayout w:type="fixed"/>
       </w:tblPr>
       <w:tblGrid>
-        <w:gridCol w:w="1450"/>
+        <w:gridCol w:w="900"/>
+        <w:gridCol w:w="1400"/>
+        <w:gridCol w:w="1400"/>
+        <w:gridCol w:w="2700"/>
+        <w:gridCol w:w="1500"/>
         <w:gridCol w:w="1100"/>
-        <w:gridCol w:w="1100"/>
-        <w:gridCol w:w="1100"/>
-        <w:gridCol w:w="1400"/>
-        <w:gridCol w:w="1600"/>
-        <w:gridCol w:w="1250"/>
       </w:tblGrid>
       <w:tr>
         <w:trPr>
@@ -1875,7 +2965,7 @@
         </w:trPr>
         <w:tc>
           <w:tcPr>
-            <w:tcW w:w="1450" w:type="dxa"/>
+            <w:tcW w:w="900" w:type="dxa"/>
             <w:shd w:fill="DCEAF2"/>
             <w:vAlign w:val="center"/>
             <w:tcMar>
@@ -1905,7 +2995,7 @@
         </w:tc>
         <w:tc>
           <w:tcPr>
-            <w:tcW w:w="1100" w:type="dxa"/>
+            <w:tcW w:w="1400" w:type="dxa"/>
             <w:shd w:fill="DCEAF2"/>
             <w:vAlign w:val="center"/>
             <w:tcMar>
@@ -1935,7 +3025,7 @@
         </w:tc>
         <w:tc>
           <w:tcPr>
-            <w:tcW w:w="1100" w:type="dxa"/>
+            <w:tcW w:w="1400" w:type="dxa"/>
             <w:shd w:fill="DCEAF2"/>
             <w:vAlign w:val="center"/>
             <w:tcMar>
@@ -1959,7 +3049,67 @@
                 <w:b/>
                 <w:bCs/>
               </w:rPr>
-              <w:t xml:space="preserve">直接对</w:t>
+              <w:t xml:space="preserve">直接对/15</w:t>
+            </w:r>
+          </w:p>
+        </w:tc>
+        <w:tc>
+          <w:tcPr>
+            <w:tcW w:w="2700" w:type="dxa"/>
+            <w:shd w:fill="DCEAF2"/>
+            <w:vAlign w:val="center"/>
+            <w:tcMar>
+              <w:top w:w="30" w:type="dxa"/>
+              <w:bottom w:w="30" w:type="dxa"/>
+              <w:left w:w="55" w:type="dxa"/>
+              <w:right w:w="55" w:type="dxa"/>
+            </w:tcMar>
+          </w:tcPr>
+          <w:p>
+            <w:pPr>
+              <w:keepLines/>
+              <w:spacing w:after="0" w:line="240" w:lineRule="auto"/>
+            </w:pPr>
+            <w:r>
+              <w:rPr>
+                <w:rFonts w:ascii="Arial" w:hAnsi="Arial" w:eastAsia="微软雅黑"/>
+                <w:sz w:val="16"/>
+                <w:szCs w:val="16"/>
+                <w:color w:val="17212B"/>
+                <w:b/>
+                <w:bCs/>
+              </w:rPr>
+              <w:t xml:space="preserve">自查/框/搜索次数</w:t>
+            </w:r>
+          </w:p>
+        </w:tc>
+        <w:tc>
+          <w:tcPr>
+            <w:tcW w:w="1500" w:type="dxa"/>
+            <w:shd w:fill="DCEAF2"/>
+            <w:vAlign w:val="center"/>
+            <w:tcMar>
+              <w:top w:w="30" w:type="dxa"/>
+              <w:bottom w:w="30" w:type="dxa"/>
+              <w:left w:w="55" w:type="dxa"/>
+              <w:right w:w="55" w:type="dxa"/>
+            </w:tcMar>
+          </w:tcPr>
+          <w:p>
+            <w:pPr>
+              <w:keepLines/>
+              <w:spacing w:after="0" w:line="240" w:lineRule="auto"/>
+            </w:pPr>
+            <w:r>
+              <w:rPr>
+                <w:rFonts w:ascii="Arial" w:hAnsi="Arial" w:eastAsia="微软雅黑"/>
+                <w:sz w:val="16"/>
+                <w:szCs w:val="16"/>
+                <w:color w:val="17212B"/>
+                <w:b/>
+                <w:bCs/>
+              </w:rPr>
+              <w:t xml:space="preserve">纠错后/15</w:t>
             </w:r>
           </w:p>
         </w:tc>
@@ -1989,97 +3139,7 @@
                 <w:b/>
                 <w:bCs/>
               </w:rPr>
-              <w:t xml:space="preserve">自查</w:t>
-            </w:r>
-          </w:p>
-        </w:tc>
-        <w:tc>
-          <w:tcPr>
-            <w:tcW w:w="1400" w:type="dxa"/>
-            <w:shd w:fill="DCEAF2"/>
-            <w:vAlign w:val="center"/>
-            <w:tcMar>
-              <w:top w:w="30" w:type="dxa"/>
-              <w:bottom w:w="30" w:type="dxa"/>
-              <w:left w:w="55" w:type="dxa"/>
-              <w:right w:w="55" w:type="dxa"/>
-            </w:tcMar>
-          </w:tcPr>
-          <w:p>
-            <w:pPr>
-              <w:keepLines/>
-              <w:spacing w:after="0" w:line="240" w:lineRule="auto"/>
-            </w:pPr>
-            <w:r>
-              <w:rPr>
-                <w:rFonts w:ascii="Arial" w:hAnsi="Arial" w:eastAsia="微软雅黑"/>
-                <w:sz w:val="16"/>
-                <w:szCs w:val="16"/>
-                <w:color w:val="17212B"/>
-                <w:b/>
-                <w:bCs/>
-              </w:rPr>
-              <w:t xml:space="preserve">工具重答</w:t>
-            </w:r>
-          </w:p>
-        </w:tc>
-        <w:tc>
-          <w:tcPr>
-            <w:tcW w:w="1600" w:type="dxa"/>
-            <w:shd w:fill="DCEAF2"/>
-            <w:vAlign w:val="center"/>
-            <w:tcMar>
-              <w:top w:w="30" w:type="dxa"/>
-              <w:bottom w:w="30" w:type="dxa"/>
-              <w:left w:w="55" w:type="dxa"/>
-              <w:right w:w="55" w:type="dxa"/>
-            </w:tcMar>
-          </w:tcPr>
-          <w:p>
-            <w:pPr>
-              <w:keepLines/>
-              <w:spacing w:after="0" w:line="240" w:lineRule="auto"/>
-            </w:pPr>
-            <w:r>
-              <w:rPr>
-                <w:rFonts w:ascii="Arial" w:hAnsi="Arial" w:eastAsia="微软雅黑"/>
-                <w:sz w:val="16"/>
-                <w:szCs w:val="16"/>
-                <w:color w:val="17212B"/>
-                <w:b/>
-                <w:bCs/>
-              </w:rPr>
-              <w:t xml:space="preserve">纠错后对</w:t>
-            </w:r>
-          </w:p>
-        </w:tc>
-        <w:tc>
-          <w:tcPr>
-            <w:tcW w:w="1250" w:type="dxa"/>
-            <w:shd w:fill="DCEAF2"/>
-            <w:vAlign w:val="center"/>
-            <w:tcMar>
-              <w:top w:w="30" w:type="dxa"/>
-              <w:bottom w:w="30" w:type="dxa"/>
-              <w:left w:w="55" w:type="dxa"/>
-              <w:right w:w="55" w:type="dxa"/>
-            </w:tcMar>
-          </w:tcPr>
-          <w:p>
-            <w:pPr>
-              <w:keepLines/>
-              <w:spacing w:after="0" w:line="240" w:lineRule="auto"/>
-            </w:pPr>
-            <w:r>
-              <w:rPr>
-                <w:rFonts w:ascii="Arial" w:hAnsi="Arial" w:eastAsia="微软雅黑"/>
-                <w:sz w:val="16"/>
-                <w:szCs w:val="16"/>
-                <w:color w:val="17212B"/>
-                <w:b/>
-                <w:bCs/>
-              </w:rPr>
-              <w:t xml:space="preserve">轮末/15</w:t>
+              <w:t xml:space="preserve">新增</w:t>
             </w:r>
           </w:p>
         </w:tc>
@@ -2090,7 +3150,7 @@
         </w:trPr>
         <w:tc>
           <w:tcPr>
-            <w:tcW w:w="1450" w:type="dxa"/>
+            <w:tcW w:w="900" w:type="dxa"/>
             <w:shd w:fill="FFFFFF"/>
             <w:vAlign w:val="center"/>
             <w:tcMar>
@@ -2112,13 +3172,97 @@
                 <w:szCs w:val="16"/>
                 <w:color w:val="17212B"/>
               </w:rPr>
-              <w:t xml:space="preserve">初始种子</w:t>
+              <w:t xml:space="preserve">1</w:t>
             </w:r>
           </w:p>
         </w:tc>
         <w:tc>
           <w:tcPr>
-            <w:tcW w:w="1100" w:type="dxa"/>
+            <w:tcW w:w="1400" w:type="dxa"/>
+            <w:shd w:fill="FFFFFF"/>
+            <w:vAlign w:val="center"/>
+            <w:tcMar>
+              <w:top w:w="30" w:type="dxa"/>
+              <w:bottom w:w="30" w:type="dxa"/>
+              <w:left w:w="55" w:type="dxa"/>
+              <w:right w:w="55" w:type="dxa"/>
+            </w:tcMar>
+          </w:tcPr>
+          <w:p>
+            <w:pPr>
+              <w:keepLines/>
+              <w:spacing w:after="0" w:line="240" w:lineRule="auto"/>
+            </w:pPr>
+            <w:r>
+              <w:rPr>
+                <w:rFonts w:ascii="Arial" w:hAnsi="Arial" w:eastAsia="微软雅黑"/>
+                <w:sz w:val="16"/>
+                <w:szCs w:val="16"/>
+                <w:color w:val="17212B"/>
+              </w:rPr>
+              <w:t xml:space="preserve">4119</w:t>
+            </w:r>
+          </w:p>
+        </w:tc>
+        <w:tc>
+          <w:tcPr>
+            <w:tcW w:w="1400" w:type="dxa"/>
+            <w:shd w:fill="FFFFFF"/>
+            <w:vAlign w:val="center"/>
+            <w:tcMar>
+              <w:top w:w="30" w:type="dxa"/>
+              <w:bottom w:w="30" w:type="dxa"/>
+              <w:left w:w="55" w:type="dxa"/>
+              <w:right w:w="55" w:type="dxa"/>
+            </w:tcMar>
+          </w:tcPr>
+          <w:p>
+            <w:pPr>
+              <w:keepLines/>
+              <w:spacing w:after="0" w:line="240" w:lineRule="auto"/>
+            </w:pPr>
+            <w:r>
+              <w:rPr>
+                <w:rFonts w:ascii="Arial" w:hAnsi="Arial" w:eastAsia="微软雅黑"/>
+                <w:sz w:val="16"/>
+                <w:szCs w:val="16"/>
+                <w:color w:val="17212B"/>
+              </w:rPr>
+              <w:t xml:space="preserve">8</w:t>
+            </w:r>
+          </w:p>
+        </w:tc>
+        <w:tc>
+          <w:tcPr>
+            <w:tcW w:w="2700" w:type="dxa"/>
+            <w:shd w:fill="FFFFFF"/>
+            <w:vAlign w:val="center"/>
+            <w:tcMar>
+              <w:top w:w="30" w:type="dxa"/>
+              <w:bottom w:w="30" w:type="dxa"/>
+              <w:left w:w="55" w:type="dxa"/>
+              <w:right w:w="55" w:type="dxa"/>
+            </w:tcMar>
+          </w:tcPr>
+          <w:p>
+            <w:pPr>
+              <w:keepLines/>
+              <w:spacing w:after="0" w:line="240" w:lineRule="auto"/>
+            </w:pPr>
+            <w:r>
+              <w:rPr>
+                <w:rFonts w:ascii="Arial" w:hAnsi="Arial" w:eastAsia="微软雅黑"/>
+                <w:sz w:val="16"/>
+                <w:szCs w:val="16"/>
+                <w:color w:val="17212B"/>
+              </w:rPr>
+              <w:t xml:space="preserve">2/7/4</w:t>
+            </w:r>
+          </w:p>
+        </w:tc>
+        <w:tc>
+          <w:tcPr>
+            <w:tcW w:w="1500" w:type="dxa"/>
             <w:shd w:fill="FFFFFF"/>
             <w:vAlign w:val="center"/>
             <w:tcMar>
@@ -2168,119 +3312,7 @@
                 <w:szCs w:val="16"/>
                 <w:color w:val="17212B"/>
               </w:rPr>
-              <w:t xml:space="preserve">—</w:t>
-            </w:r>
-          </w:p>
-        </w:tc>
-        <w:tc>
-          <w:tcPr>
-            <w:tcW w:w="1100" w:type="dxa"/>
-            <w:shd w:fill="FFFFFF"/>
-            <w:vAlign w:val="center"/>
-            <w:tcMar>
-              <w:top w:w="30" w:type="dxa"/>
-              <w:bottom w:w="30" w:type="dxa"/>
-              <w:left w:w="55" w:type="dxa"/>
-              <w:right w:w="55" w:type="dxa"/>
-            </w:tcMar>
-          </w:tcPr>
-          <w:p>
-            <w:pPr>
-              <w:keepLines/>
-              <w:spacing w:after="0" w:line="240" w:lineRule="auto"/>
-            </w:pPr>
-            <w:r>
-              <w:rPr>
-                <w:rFonts w:ascii="Arial" w:hAnsi="Arial" w:eastAsia="微软雅黑"/>
-                <w:sz w:val="16"/>
-                <w:szCs w:val="16"/>
-                <w:color w:val="17212B"/>
-              </w:rPr>
-              <w:t xml:space="preserve">—</w:t>
-            </w:r>
-          </w:p>
-        </w:tc>
-        <w:tc>
-          <w:tcPr>
-            <w:tcW w:w="1400" w:type="dxa"/>
-            <w:shd w:fill="FFFFFF"/>
-            <w:vAlign w:val="center"/>
-            <w:tcMar>
-              <w:top w:w="30" w:type="dxa"/>
-              <w:bottom w:w="30" w:type="dxa"/>
-              <w:left w:w="55" w:type="dxa"/>
-              <w:right w:w="55" w:type="dxa"/>
-            </w:tcMar>
-          </w:tcPr>
-          <w:p>
-            <w:pPr>
-              <w:keepLines/>
-              <w:spacing w:after="0" w:line="240" w:lineRule="auto"/>
-            </w:pPr>
-            <w:r>
-              <w:rPr>
-                <w:rFonts w:ascii="Arial" w:hAnsi="Arial" w:eastAsia="微软雅黑"/>
-                <w:sz w:val="16"/>
-                <w:szCs w:val="16"/>
-                <w:color w:val="17212B"/>
-              </w:rPr>
-              <w:t xml:space="preserve">—</w:t>
-            </w:r>
-          </w:p>
-        </w:tc>
-        <w:tc>
-          <w:tcPr>
-            <w:tcW w:w="1600" w:type="dxa"/>
-            <w:shd w:fill="FFFFFF"/>
-            <w:vAlign w:val="center"/>
-            <w:tcMar>
-              <w:top w:w="30" w:type="dxa"/>
-              <w:bottom w:w="30" w:type="dxa"/>
-              <w:left w:w="55" w:type="dxa"/>
-              <w:right w:w="55" w:type="dxa"/>
-            </w:tcMar>
-          </w:tcPr>
-          <w:p>
-            <w:pPr>
-              <w:keepLines/>
-              <w:spacing w:after="0" w:line="240" w:lineRule="auto"/>
-            </w:pPr>
-            <w:r>
-              <w:rPr>
-                <w:rFonts w:ascii="Arial" w:hAnsi="Arial" w:eastAsia="微软雅黑"/>
-                <w:sz w:val="16"/>
-                <w:szCs w:val="16"/>
-                <w:color w:val="17212B"/>
-              </w:rPr>
-              <w:t xml:space="preserve">—</w:t>
-            </w:r>
-          </w:p>
-        </w:tc>
-        <w:tc>
-          <w:tcPr>
-            <w:tcW w:w="1250" w:type="dxa"/>
-            <w:shd w:fill="FFFFFF"/>
-            <w:vAlign w:val="center"/>
-            <w:tcMar>
-              <w:top w:w="30" w:type="dxa"/>
-              <w:bottom w:w="30" w:type="dxa"/>
-              <w:left w:w="55" w:type="dxa"/>
-              <w:right w:w="55" w:type="dxa"/>
-            </w:tcMar>
-          </w:tcPr>
-          <w:p>
-            <w:pPr>
-              <w:keepLines/>
-              <w:spacing w:after="0" w:line="240" w:lineRule="auto"/>
-            </w:pPr>
-            <w:r>
-              <w:rPr>
-                <w:rFonts w:ascii="Arial" w:hAnsi="Arial" w:eastAsia="微软雅黑"/>
-                <w:sz w:val="16"/>
-                <w:szCs w:val="16"/>
-                <w:color w:val="17212B"/>
-              </w:rPr>
-              <w:t xml:space="preserve">4/15</w:t>
+              <w:t xml:space="preserve">7</w:t>
             </w:r>
           </w:p>
         </w:tc>
@@ -2291,7 +3323,7 @@
         </w:trPr>
         <w:tc>
           <w:tcPr>
-            <w:tcW w:w="1450" w:type="dxa"/>
+            <w:tcW w:w="900" w:type="dxa"/>
             <w:shd w:fill="F8FAFC"/>
             <w:vAlign w:val="center"/>
             <w:tcMar>
@@ -2313,7 +3345,119 @@
                 <w:szCs w:val="16"/>
                 <w:color w:val="17212B"/>
               </w:rPr>
-              <w:t xml:space="preserve">第1轮</w:t>
+              <w:t xml:space="preserve">2</w:t>
+            </w:r>
+          </w:p>
+        </w:tc>
+        <w:tc>
+          <w:tcPr>
+            <w:tcW w:w="1400" w:type="dxa"/>
+            <w:shd w:fill="F8FAFC"/>
+            <w:vAlign w:val="center"/>
+            <w:tcMar>
+              <w:top w:w="30" w:type="dxa"/>
+              <w:bottom w:w="30" w:type="dxa"/>
+              <w:left w:w="55" w:type="dxa"/>
+              <w:right w:w="55" w:type="dxa"/>
+            </w:tcMar>
+          </w:tcPr>
+          <w:p>
+            <w:pPr>
+              <w:keepLines/>
+              <w:spacing w:after="0" w:line="240" w:lineRule="auto"/>
+            </w:pPr>
+            <w:r>
+              <w:rPr>
+                <w:rFonts w:ascii="Arial" w:hAnsi="Arial" w:eastAsia="微软雅黑"/>
+                <w:sz w:val="16"/>
+                <w:szCs w:val="16"/>
+                <w:color w:val="17212B"/>
+              </w:rPr>
+              <w:t xml:space="preserve">4120</w:t>
+            </w:r>
+          </w:p>
+        </w:tc>
+        <w:tc>
+          <w:tcPr>
+            <w:tcW w:w="1400" w:type="dxa"/>
+            <w:shd w:fill="F8FAFC"/>
+            <w:vAlign w:val="center"/>
+            <w:tcMar>
+              <w:top w:w="30" w:type="dxa"/>
+              <w:bottom w:w="30" w:type="dxa"/>
+              <w:left w:w="55" w:type="dxa"/>
+              <w:right w:w="55" w:type="dxa"/>
+            </w:tcMar>
+          </w:tcPr>
+          <w:p>
+            <w:pPr>
+              <w:keepLines/>
+              <w:spacing w:after="0" w:line="240" w:lineRule="auto"/>
+            </w:pPr>
+            <w:r>
+              <w:rPr>
+                <w:rFonts w:ascii="Arial" w:hAnsi="Arial" w:eastAsia="微软雅黑"/>
+                <w:sz w:val="16"/>
+                <w:szCs w:val="16"/>
+                <w:color w:val="17212B"/>
+              </w:rPr>
+              <w:t xml:space="preserve">12</w:t>
+            </w:r>
+          </w:p>
+        </w:tc>
+        <w:tc>
+          <w:tcPr>
+            <w:tcW w:w="2700" w:type="dxa"/>
+            <w:shd w:fill="F8FAFC"/>
+            <w:vAlign w:val="center"/>
+            <w:tcMar>
+              <w:top w:w="30" w:type="dxa"/>
+              <w:bottom w:w="30" w:type="dxa"/>
+              <w:left w:w="55" w:type="dxa"/>
+              <w:right w:w="55" w:type="dxa"/>
+            </w:tcMar>
+          </w:tcPr>
+          <w:p>
+            <w:pPr>
+              <w:keepLines/>
+              <w:spacing w:after="0" w:line="240" w:lineRule="auto"/>
+            </w:pPr>
+            <w:r>
+              <w:rPr>
+                <w:rFonts w:ascii="Arial" w:hAnsi="Arial" w:eastAsia="微软雅黑"/>
+                <w:sz w:val="16"/>
+                <w:szCs w:val="16"/>
+                <w:color w:val="17212B"/>
+              </w:rPr>
+              <w:t xml:space="preserve">2/3/2</w:t>
+            </w:r>
+          </w:p>
+        </w:tc>
+        <w:tc>
+          <w:tcPr>
+            <w:tcW w:w="1500" w:type="dxa"/>
+            <w:shd w:fill="F8FAFC"/>
+            <w:vAlign w:val="center"/>
+            <w:tcMar>
+              <w:top w:w="30" w:type="dxa"/>
+              <w:bottom w:w="30" w:type="dxa"/>
+              <w:left w:w="55" w:type="dxa"/>
+              <w:right w:w="55" w:type="dxa"/>
+            </w:tcMar>
+          </w:tcPr>
+          <w:p>
+            <w:pPr>
+              <w:keepLines/>
+              <w:spacing w:after="0" w:line="240" w:lineRule="auto"/>
+            </w:pPr>
+            <w:r>
+              <w:rPr>
+                <w:rFonts w:ascii="Arial" w:hAnsi="Arial" w:eastAsia="微软雅黑"/>
+                <w:sz w:val="16"/>
+                <w:szCs w:val="16"/>
+                <w:color w:val="17212B"/>
+              </w:rPr>
+              <w:t xml:space="preserve">15</w:t>
             </w:r>
           </w:p>
         </w:tc>
@@ -2341,348 +3485,7 @@
                 <w:szCs w:val="16"/>
                 <w:color w:val="17212B"/>
               </w:rPr>
-              <w:t xml:space="preserve">17</w:t>
-            </w:r>
-          </w:p>
-        </w:tc>
-        <w:tc>
-          <w:tcPr>
-            <w:tcW w:w="1100" w:type="dxa"/>
-            <w:shd w:fill="F8FAFC"/>
-            <w:vAlign w:val="center"/>
-            <w:tcMar>
-              <w:top w:w="30" w:type="dxa"/>
-              <w:bottom w:w="30" w:type="dxa"/>
-              <w:left w:w="55" w:type="dxa"/>
-              <w:right w:w="55" w:type="dxa"/>
-            </w:tcMar>
-          </w:tcPr>
-          <w:p>
-            <w:pPr>
-              <w:keepLines/>
-              <w:spacing w:after="0" w:line="240" w:lineRule="auto"/>
-            </w:pPr>
-            <w:r>
-              <w:rPr>
-                <w:rFonts w:ascii="Arial" w:hAnsi="Arial" w:eastAsia="微软雅黑"/>
-                <w:sz w:val="16"/>
-                <w:szCs w:val="16"/>
-                <w:color w:val="17212B"/>
-              </w:rPr>
-              <w:t xml:space="preserve">5/15</w:t>
-            </w:r>
-          </w:p>
-        </w:tc>
-        <w:tc>
-          <w:tcPr>
-            <w:tcW w:w="1100" w:type="dxa"/>
-            <w:shd w:fill="F8FAFC"/>
-            <w:vAlign w:val="center"/>
-            <w:tcMar>
-              <w:top w:w="30" w:type="dxa"/>
-              <w:bottom w:w="30" w:type="dxa"/>
-              <w:left w:w="55" w:type="dxa"/>
-              <w:right w:w="55" w:type="dxa"/>
-            </w:tcMar>
-          </w:tcPr>
-          <w:p>
-            <w:pPr>
-              <w:keepLines/>
-              <w:spacing w:after="0" w:line="240" w:lineRule="auto"/>
-            </w:pPr>
-            <w:r>
-              <w:rPr>
-                <w:rFonts w:ascii="Arial" w:hAnsi="Arial" w:eastAsia="微软雅黑"/>
-                <w:sz w:val="16"/>
-                <w:szCs w:val="16"/>
-                <w:color w:val="17212B"/>
-              </w:rPr>
-              <w:t xml:space="preserve">0</w:t>
-            </w:r>
-          </w:p>
-        </w:tc>
-        <w:tc>
-          <w:tcPr>
-            <w:tcW w:w="1400" w:type="dxa"/>
-            <w:shd w:fill="F8FAFC"/>
-            <w:vAlign w:val="center"/>
-            <w:tcMar>
-              <w:top w:w="30" w:type="dxa"/>
-              <w:bottom w:w="30" w:type="dxa"/>
-              <w:left w:w="55" w:type="dxa"/>
-              <w:right w:w="55" w:type="dxa"/>
-            </w:tcMar>
-          </w:tcPr>
-          <w:p>
-            <w:pPr>
-              <w:keepLines/>
-              <w:spacing w:after="0" w:line="240" w:lineRule="auto"/>
-            </w:pPr>
-            <w:r>
-              <w:rPr>
-                <w:rFonts w:ascii="Arial" w:hAnsi="Arial" w:eastAsia="微软雅黑"/>
-                <w:sz w:val="16"/>
-                <w:szCs w:val="16"/>
-                <w:color w:val="17212B"/>
-              </w:rPr>
-              <w:t xml:space="preserve">10</w:t>
-            </w:r>
-          </w:p>
-        </w:tc>
-        <w:tc>
-          <w:tcPr>
-            <w:tcW w:w="1600" w:type="dxa"/>
-            <w:shd w:fill="F8FAFC"/>
-            <w:vAlign w:val="center"/>
-            <w:tcMar>
-              <w:top w:w="30" w:type="dxa"/>
-              <w:bottom w:w="30" w:type="dxa"/>
-              <w:left w:w="55" w:type="dxa"/>
-              <w:right w:w="55" w:type="dxa"/>
-            </w:tcMar>
-          </w:tcPr>
-          <w:p>
-            <w:pPr>
-              <w:keepLines/>
-              <w:spacing w:after="0" w:line="240" w:lineRule="auto"/>
-            </w:pPr>
-            <w:r>
-              <w:rPr>
-                <w:rFonts w:ascii="Arial" w:hAnsi="Arial" w:eastAsia="微软雅黑"/>
-                <w:sz w:val="16"/>
-                <w:szCs w:val="16"/>
-                <w:color w:val="17212B"/>
-              </w:rPr>
-              <w:t xml:space="preserve">7/15</w:t>
-            </w:r>
-          </w:p>
-        </w:tc>
-        <w:tc>
-          <w:tcPr>
-            <w:tcW w:w="1250" w:type="dxa"/>
-            <w:shd w:fill="F8FAFC"/>
-            <w:vAlign w:val="center"/>
-            <w:tcMar>
-              <w:top w:w="30" w:type="dxa"/>
-              <w:bottom w:w="30" w:type="dxa"/>
-              <w:left w:w="55" w:type="dxa"/>
-              <w:right w:w="55" w:type="dxa"/>
-            </w:tcMar>
-          </w:tcPr>
-          <w:p>
-            <w:pPr>
-              <w:keepLines/>
-              <w:spacing w:after="0" w:line="240" w:lineRule="auto"/>
-            </w:pPr>
-            <w:r>
-              <w:rPr>
-                <w:rFonts w:ascii="Arial" w:hAnsi="Arial" w:eastAsia="微软雅黑"/>
-                <w:sz w:val="16"/>
-                <w:szCs w:val="16"/>
-                <w:color w:val="17212B"/>
-              </w:rPr>
-              <w:t xml:space="preserve">7/15</w:t>
-            </w:r>
-          </w:p>
-        </w:tc>
-      </w:tr>
-      <w:tr>
-        <w:trPr>
-          <w:cantSplit/>
-        </w:trPr>
-        <w:tc>
-          <w:tcPr>
-            <w:tcW w:w="1450" w:type="dxa"/>
-            <w:shd w:fill="FFFFFF"/>
-            <w:vAlign w:val="center"/>
-            <w:tcMar>
-              <w:top w:w="30" w:type="dxa"/>
-              <w:bottom w:w="30" w:type="dxa"/>
-              <w:left w:w="55" w:type="dxa"/>
-              <w:right w:w="55" w:type="dxa"/>
-            </w:tcMar>
-          </w:tcPr>
-          <w:p>
-            <w:pPr>
-              <w:keepLines/>
-              <w:spacing w:after="0" w:line="240" w:lineRule="auto"/>
-            </w:pPr>
-            <w:r>
-              <w:rPr>
-                <w:rFonts w:ascii="Arial" w:hAnsi="Arial" w:eastAsia="微软雅黑"/>
-                <w:sz w:val="16"/>
-                <w:szCs w:val="16"/>
-                <w:color w:val="17212B"/>
-              </w:rPr>
-              <w:t xml:space="preserve">第2轮</w:t>
-            </w:r>
-          </w:p>
-        </w:tc>
-        <w:tc>
-          <w:tcPr>
-            <w:tcW w:w="1100" w:type="dxa"/>
-            <w:shd w:fill="FFFFFF"/>
-            <w:vAlign w:val="center"/>
-            <w:tcMar>
-              <w:top w:w="30" w:type="dxa"/>
-              <w:bottom w:w="30" w:type="dxa"/>
-              <w:left w:w="55" w:type="dxa"/>
-              <w:right w:w="55" w:type="dxa"/>
-            </w:tcMar>
-          </w:tcPr>
-          <w:p>
-            <w:pPr>
-              <w:keepLines/>
-              <w:spacing w:after="0" w:line="240" w:lineRule="auto"/>
-            </w:pPr>
-            <w:r>
-              <w:rPr>
-                <w:rFonts w:ascii="Arial" w:hAnsi="Arial" w:eastAsia="微软雅黑"/>
-                <w:sz w:val="16"/>
-                <w:szCs w:val="16"/>
-                <w:color w:val="17212B"/>
-              </w:rPr>
-              <w:t xml:space="preserve">17</w:t>
-            </w:r>
-          </w:p>
-        </w:tc>
-        <w:tc>
-          <w:tcPr>
-            <w:tcW w:w="1100" w:type="dxa"/>
-            <w:shd w:fill="FFFFFF"/>
-            <w:vAlign w:val="center"/>
-            <w:tcMar>
-              <w:top w:w="30" w:type="dxa"/>
-              <w:bottom w:w="30" w:type="dxa"/>
-              <w:left w:w="55" w:type="dxa"/>
-              <w:right w:w="55" w:type="dxa"/>
-            </w:tcMar>
-          </w:tcPr>
-          <w:p>
-            <w:pPr>
-              <w:keepLines/>
-              <w:spacing w:after="0" w:line="240" w:lineRule="auto"/>
-            </w:pPr>
-            <w:r>
-              <w:rPr>
-                <w:rFonts w:ascii="Arial" w:hAnsi="Arial" w:eastAsia="微软雅黑"/>
-                <w:sz w:val="16"/>
-                <w:szCs w:val="16"/>
-                <w:color w:val="17212B"/>
-              </w:rPr>
-              <w:t xml:space="preserve">6/15</w:t>
-            </w:r>
-          </w:p>
-        </w:tc>
-        <w:tc>
-          <w:tcPr>
-            <w:tcW w:w="1100" w:type="dxa"/>
-            <w:shd w:fill="FFFFFF"/>
-            <w:vAlign w:val="center"/>
-            <w:tcMar>
-              <w:top w:w="30" w:type="dxa"/>
-              <w:bottom w:w="30" w:type="dxa"/>
-              <w:left w:w="55" w:type="dxa"/>
-              <w:right w:w="55" w:type="dxa"/>
-            </w:tcMar>
-          </w:tcPr>
-          <w:p>
-            <w:pPr>
-              <w:keepLines/>
-              <w:spacing w:after="0" w:line="240" w:lineRule="auto"/>
-            </w:pPr>
-            <w:r>
-              <w:rPr>
-                <w:rFonts w:ascii="Arial" w:hAnsi="Arial" w:eastAsia="微软雅黑"/>
-                <w:sz w:val="16"/>
-                <w:szCs w:val="16"/>
-                <w:color w:val="17212B"/>
-              </w:rPr>
               <w:t xml:space="preserve">1</w:t>
-            </w:r>
-          </w:p>
-        </w:tc>
-        <w:tc>
-          <w:tcPr>
-            <w:tcW w:w="1400" w:type="dxa"/>
-            <w:shd w:fill="FFFFFF"/>
-            <w:vAlign w:val="center"/>
-            <w:tcMar>
-              <w:top w:w="30" w:type="dxa"/>
-              <w:bottom w:w="30" w:type="dxa"/>
-              <w:left w:w="55" w:type="dxa"/>
-              <w:right w:w="55" w:type="dxa"/>
-            </w:tcMar>
-          </w:tcPr>
-          <w:p>
-            <w:pPr>
-              <w:keepLines/>
-              <w:spacing w:after="0" w:line="240" w:lineRule="auto"/>
-            </w:pPr>
-            <w:r>
-              <w:rPr>
-                <w:rFonts w:ascii="Arial" w:hAnsi="Arial" w:eastAsia="微软雅黑"/>
-                <w:sz w:val="16"/>
-                <w:szCs w:val="16"/>
-                <w:color w:val="17212B"/>
-              </w:rPr>
-              <w:t xml:space="preserve">9</w:t>
-            </w:r>
-          </w:p>
-        </w:tc>
-        <w:tc>
-          <w:tcPr>
-            <w:tcW w:w="1600" w:type="dxa"/>
-            <w:shd w:fill="FFFFFF"/>
-            <w:vAlign w:val="center"/>
-            <w:tcMar>
-              <w:top w:w="30" w:type="dxa"/>
-              <w:bottom w:w="30" w:type="dxa"/>
-              <w:left w:w="55" w:type="dxa"/>
-              <w:right w:w="55" w:type="dxa"/>
-            </w:tcMar>
-          </w:tcPr>
-          <w:p>
-            <w:pPr>
-              <w:keepLines/>
-              <w:spacing w:after="0" w:line="240" w:lineRule="auto"/>
-            </w:pPr>
-            <w:r>
-              <w:rPr>
-                <w:rFonts w:ascii="Arial" w:hAnsi="Arial" w:eastAsia="微软雅黑"/>
-                <w:sz w:val="16"/>
-                <w:szCs w:val="16"/>
-                <w:color w:val="17212B"/>
-              </w:rPr>
-              <w:t xml:space="preserve">7/15</w:t>
-            </w:r>
-          </w:p>
-        </w:tc>
-        <w:tc>
-          <w:tcPr>
-            <w:tcW w:w="1250" w:type="dxa"/>
-            <w:shd w:fill="FFFFFF"/>
-            <w:vAlign w:val="center"/>
-            <w:tcMar>
-              <w:top w:w="30" w:type="dxa"/>
-              <w:bottom w:w="30" w:type="dxa"/>
-              <w:left w:w="55" w:type="dxa"/>
-              <w:right w:w="55" w:type="dxa"/>
-            </w:tcMar>
-          </w:tcPr>
-          <w:p>
-            <w:pPr>
-              <w:keepLines/>
-              <w:spacing w:after="0" w:line="240" w:lineRule="auto"/>
-            </w:pPr>
-            <w:r>
-              <w:rPr>
-                <w:rFonts w:ascii="Arial" w:hAnsi="Arial" w:eastAsia="微软雅黑"/>
-                <w:sz w:val="16"/>
-                <w:szCs w:val="16"/>
-                <w:color w:val="17212B"/>
-              </w:rPr>
-              <w:t xml:space="preserve">4/15</w:t>
             </w:r>
           </w:p>
         </w:tc>
@@ -2696,29 +3499,29 @@
       <w:r>
         <w:rPr>
           <w:rFonts w:ascii="Arial" w:hAnsi="Arial" w:eastAsia="微软雅黑"/>
-          <w:sz w:val="19"/>
-          <w:szCs w:val="19"/>
+          <w:sz w:val="18"/>
+          <w:szCs w:val="18"/>
           <w:color w:val="17212B"/>
         </w:rPr>
-        <w:t xml:space="preserve">留出集工具纠错尝试0次高亮自查、11次验证器重答；由错变对3题，由对变错0题。两轮反馈新增2、0条，最终池17条。</w:t>
+        <w:t xml:space="preserve">按开发集选择sft。最终独立测试：定位109/128、计数22/40、存在性13/16，总计144/184；定位IoU=0.325。同模型弱提示、检测框、候选核验的定位依次118/128、120/128、128/128；工具分数单列。</w:t>
       </w:r>
     </w:p>
     <w:p>
       <w:pPr>
         <w:keepNext/>
         <w:keepLines/>
-        <w:spacing w:after="35" w:line="240" w:lineRule="auto"/>
+        <w:spacing w:after="30" w:line="240" w:lineRule="auto"/>
       </w:pPr>
       <w:r>
         <w:rPr>
           <w:rFonts w:ascii="Arial" w:hAnsi="Arial" w:eastAsia="微软雅黑"/>
-          <w:sz w:val="18"/>
-          <w:szCs w:val="18"/>
+          <w:sz w:val="17"/>
+          <w:szCs w:val="17"/>
           <w:color w:val="17212B"/>
           <w:b/>
           <w:bCs/>
         </w:rPr>
-        <w:t xml:space="preserve">代表性逐题输出摘录（完整原文见results；未发生的路径按实际注明）</w:t>
+        <w:t xml:space="preserve">代表性路径（E为旧评测，F为最终测试题，逐题原文可查）</w:t>
       </w:r>
     </w:p>
     <w:tbl>
@@ -2735,12 +3538,10 @@
         <w:tblLayout w:type="fixed"/>
       </w:tblPr>
       <w:tblGrid>
-        <w:gridCol w:w="1200"/>
-        <w:gridCol w:w="900"/>
-        <w:gridCol w:w="2200"/>
-        <w:gridCol w:w="1600"/>
-        <w:gridCol w:w="2200"/>
-        <w:gridCol w:w="900"/>
+        <w:gridCol w:w="1300"/>
+        <w:gridCol w:w="1850"/>
+        <w:gridCol w:w="3800"/>
+        <w:gridCol w:w="2050"/>
       </w:tblGrid>
       <w:tr>
         <w:trPr>
@@ -2749,7 +3550,7 @@
         </w:trPr>
         <w:tc>
           <w:tcPr>
-            <w:tcW w:w="1200" w:type="dxa"/>
+            <w:tcW w:w="1300" w:type="dxa"/>
             <w:shd w:fill="DCEAF2"/>
             <w:vAlign w:val="center"/>
             <w:tcMar>
@@ -2773,13 +3574,13 @@
                 <w:b/>
                 <w:bCs/>
               </w:rPr>
-              <w:t xml:space="preserve">样例</w:t>
+              <w:t xml:space="preserve">路径</w:t>
             </w:r>
           </w:p>
         </w:tc>
         <w:tc>
           <w:tcPr>
-            <w:tcW w:w="900" w:type="dxa"/>
+            <w:tcW w:w="1850" w:type="dxa"/>
             <w:shd w:fill="DCEAF2"/>
             <w:vAlign w:val="center"/>
             <w:tcMar>
@@ -2803,13 +3604,13 @@
                 <w:b/>
                 <w:bCs/>
               </w:rPr>
-              <w:t xml:space="preserve">图名</w:t>
+              <w:t xml:space="preserve">题号／目标</w:t>
             </w:r>
           </w:p>
         </w:tc>
         <w:tc>
           <w:tcPr>
-            <w:tcW w:w="2200" w:type="dxa"/>
+            <w:tcW w:w="3800" w:type="dxa"/>
             <w:shd w:fill="DCEAF2"/>
             <w:vAlign w:val="center"/>
             <w:tcMar>
@@ -2833,13 +3634,13 @@
                 <w:b/>
                 <w:bCs/>
               </w:rPr>
-              <w:t xml:space="preserve">问题</w:t>
+              <w:t xml:space="preserve">原始→最终</w:t>
             </w:r>
           </w:p>
         </w:tc>
         <w:tc>
           <w:tcPr>
-            <w:tcW w:w="1600" w:type="dxa"/>
+            <w:tcW w:w="2050" w:type="dxa"/>
             <w:shd w:fill="DCEAF2"/>
             <w:vAlign w:val="center"/>
             <w:tcMar>
@@ -2863,67 +3664,7 @@
                 <w:b/>
                 <w:bCs/>
               </w:rPr>
-              <w:t xml:space="preserve">原始输出</w:t>
-            </w:r>
-          </w:p>
-        </w:tc>
-        <w:tc>
-          <w:tcPr>
-            <w:tcW w:w="2200" w:type="dxa"/>
-            <w:shd w:fill="DCEAF2"/>
-            <w:vAlign w:val="center"/>
-            <w:tcMar>
-              <w:top w:w="30" w:type="dxa"/>
-              <w:bottom w:w="30" w:type="dxa"/>
-              <w:left w:w="55" w:type="dxa"/>
-              <w:right w:w="55" w:type="dxa"/>
-            </w:tcMar>
-          </w:tcPr>
-          <w:p>
-            <w:pPr>
-              <w:keepLines/>
-              <w:spacing w:after="0" w:line="240" w:lineRule="auto"/>
-            </w:pPr>
-            <w:r>
-              <w:rPr>
-                <w:rFonts w:ascii="Arial" w:hAnsi="Arial" w:eastAsia="微软雅黑"/>
-                <w:sz w:val="15"/>
-                <w:szCs w:val="15"/>
-                <w:color w:val="17212B"/>
-                <w:b/>
-                <w:bCs/>
-              </w:rPr>
-              <w:t xml:space="preserve">路径与最终输出</w:t>
-            </w:r>
-          </w:p>
-        </w:tc>
-        <w:tc>
-          <w:tcPr>
-            <w:tcW w:w="900" w:type="dxa"/>
-            <w:shd w:fill="DCEAF2"/>
-            <w:vAlign w:val="center"/>
-            <w:tcMar>
-              <w:top w:w="30" w:type="dxa"/>
-              <w:bottom w:w="30" w:type="dxa"/>
-              <w:left w:w="55" w:type="dxa"/>
-              <w:right w:w="55" w:type="dxa"/>
-            </w:tcMar>
-          </w:tcPr>
-          <w:p>
-            <w:pPr>
-              <w:keepLines/>
-              <w:spacing w:after="0" w:line="240" w:lineRule="auto"/>
-            </w:pPr>
-            <w:r>
-              <w:rPr>
-                <w:rFonts w:ascii="Arial" w:hAnsi="Arial" w:eastAsia="微软雅黑"/>
-                <w:sz w:val="15"/>
-                <w:szCs w:val="15"/>
-                <w:color w:val="17212B"/>
-                <w:b/>
-                <w:bCs/>
-              </w:rPr>
-              <w:t xml:space="preserve">结论</w:t>
+              <w:t xml:space="preserve">GT／判断</w:t>
             </w:r>
           </w:p>
         </w:tc>
@@ -2934,7 +3675,7 @@
         </w:trPr>
         <w:tc>
           <w:tcPr>
-            <w:tcW w:w="1200" w:type="dxa"/>
+            <w:tcW w:w="1300" w:type="dxa"/>
             <w:shd w:fill="FFFFFF"/>
             <w:vAlign w:val="center"/>
             <w:tcMar>
@@ -2962,7 +3703,7 @@
         </w:tc>
         <w:tc>
           <w:tcPr>
-            <w:tcW w:w="900" w:type="dxa"/>
+            <w:tcW w:w="1850" w:type="dxa"/>
             <w:shd w:fill="FFFFFF"/>
             <w:vAlign w:val="center"/>
             <w:tcMar>
@@ -2984,13 +3725,13 @@
                 <w:szCs w:val="15"/>
                 <w:color w:val="17212B"/>
               </w:rPr>
-              <w:t xml:space="preserve">e08</w:t>
+              <w:t xml:space="preserve">E00 绿圆</w:t>
             </w:r>
           </w:p>
         </w:tc>
         <w:tc>
           <w:tcPr>
-            <w:tcW w:w="2200" w:type="dxa"/>
+            <w:tcW w:w="3800" w:type="dxa"/>
             <w:shd w:fill="FFFFFF"/>
             <w:vAlign w:val="center"/>
             <w:tcMar>
@@ -3012,13 +3753,13 @@
                 <w:szCs w:val="15"/>
                 <w:color w:val="17212B"/>
               </w:rPr>
-              <w:t xml:space="preserve">图中有几个红色圆形？</w:t>
+              <w:t xml:space="preserve">r3c4 → r3c4</w:t>
             </w:r>
           </w:p>
         </w:tc>
         <w:tc>
           <w:tcPr>
-            <w:tcW w:w="1600" w:type="dxa"/>
+            <w:tcW w:w="2050" w:type="dxa"/>
             <w:shd w:fill="FFFFFF"/>
             <w:vAlign w:val="center"/>
             <w:tcMar>
@@ -3040,63 +3781,7 @@
                 <w:szCs w:val="15"/>
                 <w:color w:val="17212B"/>
               </w:rPr>
-              <w:t xml:space="preserve">1.</w:t>
-            </w:r>
-          </w:p>
-        </w:tc>
-        <w:tc>
-          <w:tcPr>
-            <w:tcW w:w="2200" w:type="dxa"/>
-            <w:shd w:fill="FFFFFF"/>
-            <w:vAlign w:val="center"/>
-            <w:tcMar>
-              <w:top w:w="30" w:type="dxa"/>
-              <w:bottom w:w="30" w:type="dxa"/>
-              <w:left w:w="55" w:type="dxa"/>
-              <w:right w:w="55" w:type="dxa"/>
-            </w:tcMar>
-          </w:tcPr>
-          <w:p>
-            <w:pPr>
-              <w:keepLines/>
-              <w:spacing w:after="0" w:line="240" w:lineRule="auto"/>
-            </w:pPr>
-            <w:r>
-              <w:rPr>
-                <w:rFonts w:ascii="Arial" w:hAnsi="Arial" w:eastAsia="微软雅黑"/>
-                <w:sz w:val="15"/>
-                <w:szCs w:val="15"/>
-                <w:color w:val="17212B"/>
-              </w:rPr>
-              <w:t xml:space="preserve">—→1.</w:t>
-            </w:r>
-          </w:p>
-        </w:tc>
-        <w:tc>
-          <w:tcPr>
-            <w:tcW w:w="900" w:type="dxa"/>
-            <w:shd w:fill="FFFFFF"/>
-            <w:vAlign w:val="center"/>
-            <w:tcMar>
-              <w:top w:w="30" w:type="dxa"/>
-              <w:bottom w:w="30" w:type="dxa"/>
-              <w:left w:w="55" w:type="dxa"/>
-              <w:right w:w="55" w:type="dxa"/>
-            </w:tcMar>
-          </w:tcPr>
-          <w:p>
-            <w:pPr>
-              <w:keepLines/>
-              <w:spacing w:after="0" w:line="240" w:lineRule="auto"/>
-            </w:pPr>
-            <w:r>
-              <w:rPr>
-                <w:rFonts w:ascii="Arial" w:hAnsi="Arial" w:eastAsia="微软雅黑"/>
-                <w:sz w:val="15"/>
-                <w:szCs w:val="15"/>
-                <w:color w:val="17212B"/>
-              </w:rPr>
-              <w:t xml:space="preserve">正确；GT 1个</w:t>
+              <w:t xml:space="preserve">第3行第4列／正确</w:t>
             </w:r>
           </w:p>
         </w:tc>
@@ -3107,7 +3792,7 @@
         </w:trPr>
         <w:tc>
           <w:tcPr>
-            <w:tcW w:w="1200" w:type="dxa"/>
+            <w:tcW w:w="1300" w:type="dxa"/>
             <w:shd w:fill="F8FAFC"/>
             <w:vAlign w:val="center"/>
             <w:tcMar>
@@ -3135,7 +3820,7 @@
         </w:tc>
         <w:tc>
           <w:tcPr>
-            <w:tcW w:w="900" w:type="dxa"/>
+            <w:tcW w:w="1850" w:type="dxa"/>
             <w:shd w:fill="F8FAFC"/>
             <w:vAlign w:val="center"/>
             <w:tcMar>
@@ -3157,13 +3842,13 @@
                 <w:szCs w:val="15"/>
                 <w:color w:val="17212B"/>
               </w:rPr>
-              <w:t xml:space="preserve">本轮无符合条件的样例</w:t>
+              <w:t xml:space="preserve">F02_00 红圆</w:t>
             </w:r>
           </w:p>
         </w:tc>
         <w:tc>
           <w:tcPr>
-            <w:tcW w:w="2200" w:type="dxa"/>
+            <w:tcW w:w="3800" w:type="dxa"/>
             <w:shd w:fill="F8FAFC"/>
             <w:vAlign w:val="center"/>
             <w:tcMar>
@@ -3185,13 +3870,13 @@
                 <w:szCs w:val="15"/>
                 <w:color w:val="17212B"/>
               </w:rPr>
-              <w:t xml:space="preserve">—</w:t>
+              <w:t xml:space="preserve">r1c1 → r1c3</w:t>
             </w:r>
           </w:p>
         </w:tc>
         <w:tc>
           <w:tcPr>
-            <w:tcW w:w="1600" w:type="dxa"/>
+            <w:tcW w:w="2050" w:type="dxa"/>
             <w:shd w:fill="F8FAFC"/>
             <w:vAlign w:val="center"/>
             <w:tcMar>
@@ -3213,13 +3898,135 @@
                 <w:szCs w:val="15"/>
                 <w:color w:val="17212B"/>
               </w:rPr>
-              <w:t xml:space="preserve">—</w:t>
+              <w:t xml:space="preserve">第1行第3列／正确</w:t>
+            </w:r>
+          </w:p>
+        </w:tc>
+      </w:tr>
+      <w:tr>
+        <w:trPr>
+          <w:cantSplit/>
+        </w:trPr>
+        <w:tc>
+          <w:tcPr>
+            <w:tcW w:w="1300" w:type="dxa"/>
+            <w:shd w:fill="FFFFFF"/>
+            <w:vAlign w:val="center"/>
+            <w:tcMar>
+              <w:top w:w="30" w:type="dxa"/>
+              <w:bottom w:w="30" w:type="dxa"/>
+              <w:left w:w="55" w:type="dxa"/>
+              <w:right w:w="55" w:type="dxa"/>
+            </w:tcMar>
+          </w:tcPr>
+          <w:p>
+            <w:pPr>
+              <w:keepLines/>
+              <w:spacing w:after="0" w:line="240" w:lineRule="auto"/>
+            </w:pPr>
+            <w:r>
+              <w:rPr>
+                <w:rFonts w:ascii="Arial" w:hAnsi="Arial" w:eastAsia="微软雅黑"/>
+                <w:sz w:val="15"/>
+                <w:szCs w:val="15"/>
+                <w:color w:val="17212B"/>
+              </w:rPr>
+              <w:t xml:space="preserve">检测框改对</w:t>
             </w:r>
           </w:p>
         </w:tc>
         <w:tc>
           <w:tcPr>
-            <w:tcW w:w="2200" w:type="dxa"/>
+            <w:tcW w:w="1850" w:type="dxa"/>
+            <w:shd w:fill="FFFFFF"/>
+            <w:vAlign w:val="center"/>
+            <w:tcMar>
+              <w:top w:w="30" w:type="dxa"/>
+              <w:bottom w:w="30" w:type="dxa"/>
+              <w:left w:w="55" w:type="dxa"/>
+              <w:right w:w="55" w:type="dxa"/>
+            </w:tcMar>
+          </w:tcPr>
+          <w:p>
+            <w:pPr>
+              <w:keepLines/>
+              <w:spacing w:after="0" w:line="240" w:lineRule="auto"/>
+            </w:pPr>
+            <w:r>
+              <w:rPr>
+                <w:rFonts w:ascii="Arial" w:hAnsi="Arial" w:eastAsia="微软雅黑"/>
+                <w:sz w:val="15"/>
+                <w:szCs w:val="15"/>
+                <w:color w:val="17212B"/>
+              </w:rPr>
+              <w:t xml:space="preserve">E10 绿方</w:t>
+            </w:r>
+          </w:p>
+        </w:tc>
+        <w:tc>
+          <w:tcPr>
+            <w:tcW w:w="3800" w:type="dxa"/>
+            <w:shd w:fill="FFFFFF"/>
+            <w:vAlign w:val="center"/>
+            <w:tcMar>
+              <w:top w:w="30" w:type="dxa"/>
+              <w:bottom w:w="30" w:type="dxa"/>
+              <w:left w:w="55" w:type="dxa"/>
+              <w:right w:w="55" w:type="dxa"/>
+            </w:tcMar>
+          </w:tcPr>
+          <w:p>
+            <w:pPr>
+              <w:keepLines/>
+              <w:spacing w:after="0" w:line="240" w:lineRule="auto"/>
+            </w:pPr>
+            <w:r>
+              <w:rPr>
+                <w:rFonts w:ascii="Arial" w:hAnsi="Arial" w:eastAsia="微软雅黑"/>
+                <w:sz w:val="15"/>
+                <w:szCs w:val="15"/>
+                <w:color w:val="17212B"/>
+              </w:rPr>
+              <w:t xml:space="preserve">0 → 1</w:t>
+            </w:r>
+          </w:p>
+        </w:tc>
+        <w:tc>
+          <w:tcPr>
+            <w:tcW w:w="2050" w:type="dxa"/>
+            <w:shd w:fill="FFFFFF"/>
+            <w:vAlign w:val="center"/>
+            <w:tcMar>
+              <w:top w:w="30" w:type="dxa"/>
+              <w:bottom w:w="30" w:type="dxa"/>
+              <w:left w:w="55" w:type="dxa"/>
+              <w:right w:w="55" w:type="dxa"/>
+            </w:tcMar>
+          </w:tcPr>
+          <w:p>
+            <w:pPr>
+              <w:keepLines/>
+              <w:spacing w:after="0" w:line="240" w:lineRule="auto"/>
+            </w:pPr>
+            <w:r>
+              <w:rPr>
+                <w:rFonts w:ascii="Arial" w:hAnsi="Arial" w:eastAsia="微软雅黑"/>
+                <w:sz w:val="15"/>
+                <w:szCs w:val="15"/>
+                <w:color w:val="17212B"/>
+              </w:rPr>
+              <w:t xml:space="preserve">1个／正确</w:t>
+            </w:r>
+          </w:p>
+        </w:tc>
+      </w:tr>
+      <w:tr>
+        <w:trPr>
+          <w:cantSplit/>
+        </w:trPr>
+        <w:tc>
+          <w:tcPr>
+            <w:tcW w:w="1300" w:type="dxa"/>
             <w:shd w:fill="F8FAFC"/>
             <w:vAlign w:val="center"/>
             <w:tcMar>
@@ -3241,13 +4048,13 @@
                 <w:szCs w:val="15"/>
                 <w:color w:val="17212B"/>
               </w:rPr>
-              <w:t xml:space="preserve">—</w:t>
+              <w:t xml:space="preserve">候选核验</w:t>
             </w:r>
           </w:p>
         </w:tc>
         <w:tc>
           <w:tcPr>
-            <w:tcW w:w="900" w:type="dxa"/>
+            <w:tcW w:w="1850" w:type="dxa"/>
             <w:shd w:fill="F8FAFC"/>
             <w:vAlign w:val="center"/>
             <w:tcMar>
@@ -3269,7 +4076,63 @@
                 <w:szCs w:val="15"/>
                 <w:color w:val="17212B"/>
               </w:rPr>
-              <w:t xml:space="preserve">—</w:t>
+              <w:t xml:space="preserve">E08 红圆</w:t>
+            </w:r>
+          </w:p>
+        </w:tc>
+        <w:tc>
+          <w:tcPr>
+            <w:tcW w:w="3800" w:type="dxa"/>
+            <w:shd w:fill="F8FAFC"/>
+            <w:vAlign w:val="center"/>
+            <w:tcMar>
+              <w:top w:w="30" w:type="dxa"/>
+              <w:bottom w:w="30" w:type="dxa"/>
+              <w:left w:w="55" w:type="dxa"/>
+              <w:right w:w="55" w:type="dxa"/>
+            </w:tcMar>
+          </w:tcPr>
+          <w:p>
+            <w:pPr>
+              <w:keepLines/>
+              <w:spacing w:after="0" w:line="240" w:lineRule="auto"/>
+            </w:pPr>
+            <w:r>
+              <w:rPr>
+                <w:rFonts w:ascii="Arial" w:hAnsi="Arial" w:eastAsia="微软雅黑"/>
+                <w:sz w:val="15"/>
+                <w:szCs w:val="15"/>
+                <w:color w:val="17212B"/>
+              </w:rPr>
+              <w:t xml:space="preserve">2 → 1</w:t>
+            </w:r>
+          </w:p>
+        </w:tc>
+        <w:tc>
+          <w:tcPr>
+            <w:tcW w:w="2050" w:type="dxa"/>
+            <w:shd w:fill="F8FAFC"/>
+            <w:vAlign w:val="center"/>
+            <w:tcMar>
+              <w:top w:w="30" w:type="dxa"/>
+              <w:bottom w:w="30" w:type="dxa"/>
+              <w:left w:w="55" w:type="dxa"/>
+              <w:right w:w="55" w:type="dxa"/>
+            </w:tcMar>
+          </w:tcPr>
+          <w:p>
+            <w:pPr>
+              <w:keepLines/>
+              <w:spacing w:after="0" w:line="240" w:lineRule="auto"/>
+            </w:pPr>
+            <w:r>
+              <w:rPr>
+                <w:rFonts w:ascii="Arial" w:hAnsi="Arial" w:eastAsia="微软雅黑"/>
+                <w:sz w:val="15"/>
+                <w:szCs w:val="15"/>
+                <w:color w:val="17212B"/>
+              </w:rPr>
+              <w:t xml:space="preserve">1个／正确</w:t>
             </w:r>
           </w:p>
         </w:tc>
@@ -3280,7 +4143,7 @@
         </w:trPr>
         <w:tc>
           <w:tcPr>
-            <w:tcW w:w="1200" w:type="dxa"/>
+            <w:tcW w:w="1300" w:type="dxa"/>
             <w:shd w:fill="FFFFFF"/>
             <w:vAlign w:val="center"/>
             <w:tcMar>
@@ -3302,13 +4165,13 @@
                 <w:szCs w:val="15"/>
                 <w:color w:val="17212B"/>
               </w:rPr>
-              <w:t xml:space="preserve">验证器改对</w:t>
+              <w:t xml:space="preserve">检测框仍错</w:t>
             </w:r>
           </w:p>
         </w:tc>
         <w:tc>
           <w:tcPr>
-            <w:tcW w:w="900" w:type="dxa"/>
+            <w:tcW w:w="1850" w:type="dxa"/>
             <w:shd w:fill="FFFFFF"/>
             <w:vAlign w:val="center"/>
             <w:tcMar>
@@ -3330,13 +4193,13 @@
                 <w:szCs w:val="15"/>
                 <w:color w:val="17212B"/>
               </w:rPr>
-              <w:t xml:space="preserve">e14</w:t>
+              <w:t xml:space="preserve">E08 红圆</w:t>
             </w:r>
           </w:p>
         </w:tc>
         <w:tc>
           <w:tcPr>
-            <w:tcW w:w="2200" w:type="dxa"/>
+            <w:tcW w:w="3800" w:type="dxa"/>
             <w:shd w:fill="FFFFFF"/>
             <w:vAlign w:val="center"/>
             <w:tcMar>
@@ -3358,13 +4221,13 @@
                 <w:szCs w:val="15"/>
                 <w:color w:val="17212B"/>
               </w:rPr>
-              <w:t xml:space="preserve">图中有没有绿色方形？</w:t>
+              <w:t xml:space="preserve">2 → 2</w:t>
             </w:r>
           </w:p>
         </w:tc>
         <w:tc>
           <w:tcPr>
-            <w:tcW w:w="1600" w:type="dxa"/>
+            <w:tcW w:w="2050" w:type="dxa"/>
             <w:shd w:fill="FFFFFF"/>
             <w:vAlign w:val="center"/>
             <w:tcMar>
@@ -3386,236 +4249,7 @@
                 <w:szCs w:val="15"/>
                 <w:color w:val="17212B"/>
               </w:rPr>
-              <w:t xml:space="preserve">Yes.</w:t>
-            </w:r>
-          </w:p>
-        </w:tc>
-        <w:tc>
-          <w:tcPr>
-            <w:tcW w:w="2200" w:type="dxa"/>
-            <w:shd w:fill="FFFFFF"/>
-            <w:vAlign w:val="center"/>
-            <w:tcMar>
-              <w:top w:w="30" w:type="dxa"/>
-              <w:bottom w:w="30" w:type="dxa"/>
-              <w:left w:w="55" w:type="dxa"/>
-              <w:right w:w="55" w:type="dxa"/>
-            </w:tcMar>
-          </w:tcPr>
-          <w:p>
-            <w:pPr>
-              <w:keepLines/>
-              <w:spacing w:after="0" w:line="240" w:lineRule="auto"/>
-            </w:pPr>
-            <w:r>
-              <w:rPr>
-                <w:rFonts w:ascii="Arial" w:hAnsi="Arial" w:eastAsia="微软雅黑"/>
-                <w:sz w:val="15"/>
-                <w:szCs w:val="15"/>
-                <w:color w:val="17212B"/>
-              </w:rPr>
-              <w:t xml:space="preserve">验证器重答→没有绿色方形。</w:t>
-            </w:r>
-          </w:p>
-        </w:tc>
-        <w:tc>
-          <w:tcPr>
-            <w:tcW w:w="900" w:type="dxa"/>
-            <w:shd w:fill="FFFFFF"/>
-            <w:vAlign w:val="center"/>
-            <w:tcMar>
-              <w:top w:w="30" w:type="dxa"/>
-              <w:bottom w:w="30" w:type="dxa"/>
-              <w:left w:w="55" w:type="dxa"/>
-              <w:right w:w="55" w:type="dxa"/>
-            </w:tcMar>
-          </w:tcPr>
-          <w:p>
-            <w:pPr>
-              <w:keepLines/>
-              <w:spacing w:after="0" w:line="240" w:lineRule="auto"/>
-            </w:pPr>
-            <w:r>
-              <w:rPr>
-                <w:rFonts w:ascii="Arial" w:hAnsi="Arial" w:eastAsia="微软雅黑"/>
-                <w:sz w:val="15"/>
-                <w:szCs w:val="15"/>
-                <w:color w:val="17212B"/>
-              </w:rPr>
-              <w:t xml:space="preserve">正确；GT 没有</w:t>
-            </w:r>
-          </w:p>
-        </w:tc>
-      </w:tr>
-      <w:tr>
-        <w:trPr>
-          <w:cantSplit/>
-        </w:trPr>
-        <w:tc>
-          <w:tcPr>
-            <w:tcW w:w="1200" w:type="dxa"/>
-            <w:shd w:fill="F8FAFC"/>
-            <w:vAlign w:val="center"/>
-            <w:tcMar>
-              <w:top w:w="30" w:type="dxa"/>
-              <w:bottom w:w="30" w:type="dxa"/>
-              <w:left w:w="55" w:type="dxa"/>
-              <w:right w:w="55" w:type="dxa"/>
-            </w:tcMar>
-          </w:tcPr>
-          <w:p>
-            <w:pPr>
-              <w:keepLines/>
-              <w:spacing w:after="0" w:line="240" w:lineRule="auto"/>
-            </w:pPr>
-            <w:r>
-              <w:rPr>
-                <w:rFonts w:ascii="Arial" w:hAnsi="Arial" w:eastAsia="微软雅黑"/>
-                <w:sz w:val="15"/>
-                <w:szCs w:val="15"/>
-                <w:color w:val="17212B"/>
-              </w:rPr>
-              <w:t xml:space="preserve">仍然失败</w:t>
-            </w:r>
-          </w:p>
-        </w:tc>
-        <w:tc>
-          <w:tcPr>
-            <w:tcW w:w="900" w:type="dxa"/>
-            <w:shd w:fill="F8FAFC"/>
-            <w:vAlign w:val="center"/>
-            <w:tcMar>
-              <w:top w:w="30" w:type="dxa"/>
-              <w:bottom w:w="30" w:type="dxa"/>
-              <w:left w:w="55" w:type="dxa"/>
-              <w:right w:w="55" w:type="dxa"/>
-            </w:tcMar>
-          </w:tcPr>
-          <w:p>
-            <w:pPr>
-              <w:keepLines/>
-              <w:spacing w:after="0" w:line="240" w:lineRule="auto"/>
-            </w:pPr>
-            <w:r>
-              <w:rPr>
-                <w:rFonts w:ascii="Arial" w:hAnsi="Arial" w:eastAsia="微软雅黑"/>
-                <w:sz w:val="15"/>
-                <w:szCs w:val="15"/>
-                <w:color w:val="17212B"/>
-              </w:rPr>
-              <w:t xml:space="preserve">e00</w:t>
-            </w:r>
-          </w:p>
-        </w:tc>
-        <w:tc>
-          <w:tcPr>
-            <w:tcW w:w="2200" w:type="dxa"/>
-            <w:shd w:fill="F8FAFC"/>
-            <w:vAlign w:val="center"/>
-            <w:tcMar>
-              <w:top w:w="30" w:type="dxa"/>
-              <w:bottom w:w="30" w:type="dxa"/>
-              <w:left w:w="55" w:type="dxa"/>
-              <w:right w:w="55" w:type="dxa"/>
-            </w:tcMar>
-          </w:tcPr>
-          <w:p>
-            <w:pPr>
-              <w:keepLines/>
-              <w:spacing w:after="0" w:line="240" w:lineRule="auto"/>
-            </w:pPr>
-            <w:r>
-              <w:rPr>
-                <w:rFonts w:ascii="Arial" w:hAnsi="Arial" w:eastAsia="微软雅黑"/>
-                <w:sz w:val="15"/>
-                <w:szCs w:val="15"/>
-                <w:color w:val="17212B"/>
-              </w:rPr>
-              <w:t xml:space="preserve">图中的绿色圆形位于第几行第几列？请用“第X行第Y列”回答…</w:t>
-            </w:r>
-          </w:p>
-        </w:tc>
-        <w:tc>
-          <w:tcPr>
-            <w:tcW w:w="1600" w:type="dxa"/>
-            <w:shd w:fill="F8FAFC"/>
-            <w:vAlign w:val="center"/>
-            <w:tcMar>
-              <w:top w:w="30" w:type="dxa"/>
-              <w:bottom w:w="30" w:type="dxa"/>
-              <w:left w:w="55" w:type="dxa"/>
-              <w:right w:w="55" w:type="dxa"/>
-            </w:tcMar>
-          </w:tcPr>
-          <w:p>
-            <w:pPr>
-              <w:keepLines/>
-              <w:spacing w:after="0" w:line="240" w:lineRule="auto"/>
-            </w:pPr>
-            <w:r>
-              <w:rPr>
-                <w:rFonts w:ascii="Arial" w:hAnsi="Arial" w:eastAsia="微软雅黑"/>
-                <w:sz w:val="15"/>
-                <w:szCs w:val="15"/>
-                <w:color w:val="17212B"/>
-              </w:rPr>
-              <w:t xml:space="preserve">4×4 = 16</w:t>
-            </w:r>
-          </w:p>
-        </w:tc>
-        <w:tc>
-          <w:tcPr>
-            <w:tcW w:w="2200" w:type="dxa"/>
-            <w:shd w:fill="F8FAFC"/>
-            <w:vAlign w:val="center"/>
-            <w:tcMar>
-              <w:top w:w="30" w:type="dxa"/>
-              <w:bottom w:w="30" w:type="dxa"/>
-              <w:left w:w="55" w:type="dxa"/>
-              <w:right w:w="55" w:type="dxa"/>
-            </w:tcMar>
-          </w:tcPr>
-          <w:p>
-            <w:pPr>
-              <w:keepLines/>
-              <w:spacing w:after="0" w:line="240" w:lineRule="auto"/>
-            </w:pPr>
-            <w:r>
-              <w:rPr>
-                <w:rFonts w:ascii="Arial" w:hAnsi="Arial" w:eastAsia="微软雅黑"/>
-                <w:sz w:val="15"/>
-                <w:szCs w:val="15"/>
-                <w:color w:val="17212B"/>
-              </w:rPr>
-              <w:t xml:space="preserve">验证器重答→4×4 = 16</w:t>
-            </w:r>
-          </w:p>
-        </w:tc>
-        <w:tc>
-          <w:tcPr>
-            <w:tcW w:w="900" w:type="dxa"/>
-            <w:shd w:fill="F8FAFC"/>
-            <w:vAlign w:val="center"/>
-            <w:tcMar>
-              <w:top w:w="30" w:type="dxa"/>
-              <w:bottom w:w="30" w:type="dxa"/>
-              <w:left w:w="55" w:type="dxa"/>
-              <w:right w:w="55" w:type="dxa"/>
-            </w:tcMar>
-          </w:tcPr>
-          <w:p>
-            <w:pPr>
-              <w:keepLines/>
-              <w:spacing w:after="0" w:line="240" w:lineRule="auto"/>
-            </w:pPr>
-            <w:r>
-              <w:rPr>
-                <w:rFonts w:ascii="Arial" w:hAnsi="Arial" w:eastAsia="微软雅黑"/>
-                <w:sz w:val="15"/>
-                <w:szCs w:val="15"/>
-                <w:color w:val="17212B"/>
-              </w:rPr>
-              <w:t xml:space="preserve">仍错；GT 第3行第4列</w:t>
+              <w:t xml:space="preserve">1个／仍错</w:t>
             </w:r>
           </w:p>
         </w:tc>
@@ -3630,7 +4264,7 @@
       </w:pPr>
       <w:r>
         <w:pict>
-          <v:shape id="lab06_accuracy" type="#_x0000_t75" style="width:390pt;height:173.3pt">
+          <v:shape id="lab06_accuracy" type="#_x0000_t75" style="width:440pt;height:132.0pt">
             <v:imagedata r:id="rId9" o:title="accuracy"/>
           </v:shape>
         </w:pict>
@@ -3639,7 +4273,7 @@
     <w:p>
       <w:pPr>
         <w:keepLines/>
-        <w:spacing w:after="40" w:line="240" w:lineRule="auto"/>
+        <w:spacing w:after="30" w:line="240" w:lineRule="auto"/>
         <w:jc w:val="center"/>
       </w:pPr>
       <w:r>
@@ -3649,42 +4283,16 @@
           <w:szCs w:val="16"/>
           <w:color w:val="17212B"/>
         </w:rPr>
-        <w:t xml:space="preserve">图1  自绘留出集定位与总正确率折线；SFT+工具列是同一模型的推理时辅助，其余列为模型独立回答。</w:t>
-      </w:r>
-    </w:p>
-    <w:p>
-      <w:pPr>
-        <w:keepLines/>
-        <w:spacing w:after="45" w:line="240" w:lineRule="auto"/>
-      </w:pPr>
-      <w:r>
-        <w:rPr>
-          <w:rFonts w:ascii="Arial" w:hAnsi="Arial" w:eastAsia="微软雅黑"/>
-          <w:sz w:val="16"/>
-          <w:szCs w:val="16"/>
-          <w:color w:val="17212B"/>
-        </w:rPr>
-        <w:t xml:space="preserve">日志节选：</w:t>
-        <w:br/>
-        <w:t xml:space="preserve">[baseline] loc=0/8 count=0/4 exist=0/3 total=0/15 IoU=0.0000</w:t>
-        <w:br/>
-        <w:t xml:space="preserve">[sft_eval] loc=0/8 count=2/4 exist=2/3 total=4/15 IoU=0.0000</w:t>
-        <w:br/>
-        <w:t xml:space="preserve">[sft_tool_eval] loc=0/8 count=4/4 exist=3/3 total=7/15 IoU=0.0000</w:t>
-        <w:br/>
-        <w:t xml:space="preserve">[rsi1] pool=17 added=2 heldout=7/15</w:t>
-        <w:br/>
-        <w:t xml:space="preserve">[rsi2] pool=17 added=0 heldout=4/15</w:t>
-        <w:br/>
-        <w:t xml:space="preserve">[complete] lab06</w:t>
+        <w:t xml:space="preserve">图1  自绘开发阶段独立成绩及最终测试；工具条件单列。</w:t>
       </w:r>
     </w:p>
     <w:p>
       <w:pPr>
         <w:pStyle w:val="1"/>
         <w:keepNext/>
+        <w:pageBreakBefore/>
         <w:keepLines/>
-        <w:spacing w:after="70" w:line="240" w:lineRule="auto"/>
+        <w:spacing w:after="65" w:line="240" w:lineRule="auto"/>
       </w:pPr>
       <w:r>
         <w:rPr>
@@ -3710,7 +4318,7 @@
           <w:szCs w:val="19"/>
           <w:color w:val="17212B"/>
         </w:rPr>
-        <w:t xml:space="preserve">10步SFT将总分0/15变为4/15，定位仍为0/8；工具提示后的定位为0/8，总分7/15。两轮再训后定位依次0/8、0/8。基线常把“4×4”当算术题。试跑曾直接提示答案并从无效复述计算IoU；审查后取消这两种做法并重跑。正式IoU只从独立完整的有效坐标计算；旧试跑另存，不混入表6。</w:t>
+        <w:t xml:space="preserve">原10步中定位只有6次更新，8条种子覆盖6格且缺第二行；两轮没有新增定位样本。延长原种子至400步后种子8/8，但开发仅10/128；补齐128图的中文/紧凑编码仅8/128、11/128。说明格式学会、训练拟合，均不能证明学会看图定位。</w:t>
       </w:r>
     </w:p>
     <w:p>
@@ -3725,7 +4333,7 @@
           <w:szCs w:val="19"/>
           <w:color w:val="17212B"/>
         </w:rPr>
-        <w:t xml:space="preserve">表6计数按指南的数量口径判分：E10、E11出现重复数字，虽数量一致但表达异常。剔除这类异常后，工具辅助的完整回答为5/15；不能只用数量命中宣称输出质量提高。</w:t>
+        <w:t xml:space="preserve">视觉适配固定128图训练后训练抽样16/16、开发16/128；变化图最佳开发为78/128（step4000）。开发重复比较可能乐观，所以最终结论以未参与选择的184题为准。变化图同时增加数量、多样性和课程安排，不能只归因于一个因素。</w:t>
       </w:r>
     </w:p>
     <w:p>
@@ -3740,7 +4348,52 @@
           <w:szCs w:val="19"/>
           <w:color w:val="17212B"/>
         </w:rPr>
-        <w:t xml:space="preserve">解析式验证器只适用于本实验的纯色、无重叠几何图；同色异形靠角点判别，真实图片、遮挡、抗锯齿或颜色接近阈值时可能误判。此次4道计数题的标准答案均为1；两轮新增2条，涉及计数、存在性。15题、单一种子和两轮训练不足以证明泛化；纠错分数仍包含外部工具的核验反馈。</w:t>
+        <w:t xml:space="preserve">最终独立定位109/128，空白图16格诊断为1/16；空白图题干相同、格位均衡，作为题目偏置检查。两轮RSI是否提升以开发/留出独立回答判断，若回退则保留并由开发选择较早阶段，不挑最终测试最高分。</w:t>
+      </w:r>
+    </w:p>
+    <w:p>
+      <w:pPr>
+        <w:keepLines/>
+        <w:spacing w:after="50" w:line="240" w:lineRule="auto"/>
+      </w:pPr>
+      <w:r>
+        <w:rPr>
+          <w:rFonts w:ascii="Arial" w:hAnsi="Arial" w:eastAsia="微软雅黑"/>
+          <w:sz w:val="18"/>
+          <w:szCs w:val="18"/>
+          <w:color w:val="17212B"/>
+        </w:rPr>
+        <w:t xml:space="preserve">拓展B：自举样本再训后独立答对分别为第1轮5/7、第2轮8/8；这是训练反馈图复测，不能充作泛化成绩。</w:t>
+      </w:r>
+    </w:p>
+    <w:p>
+      <w:pPr>
+        <w:keepLines/>
+        <w:spacing w:after="50" w:line="240" w:lineRule="auto"/>
+      </w:pPr>
+      <w:r>
+        <w:rPr>
+          <w:rFonts w:ascii="Arial" w:hAnsi="Arial" w:eastAsia="微软雅黑"/>
+          <w:sz w:val="19"/>
+          <w:szCs w:val="19"/>
+          <w:color w:val="17212B"/>
+        </w:rPr>
+        <w:t xml:space="preserve">检测框提供外部视觉证据；候选核验在22道前序失败题上平均核验2.73次，首位命中0/22（失败子集），模型共评分195条候选。搜索全对依赖验证器，不能归为模型独立能力。自举保存核验后的生成/受限候选，未以GT替换。原计数全为1，新测试补齐0–4并拒绝重复数字。</w:t>
+      </w:r>
+    </w:p>
+    <w:p>
+      <w:pPr>
+        <w:keepLines/>
+        <w:spacing w:after="50" w:line="240" w:lineRule="auto"/>
+      </w:pPr>
+      <w:r>
+        <w:rPr>
+          <w:rFonts w:ascii="Arial" w:hAnsi="Arial" w:eastAsia="微软雅黑"/>
+          <w:sz w:val="18"/>
+          <w:szCs w:val="18"/>
+          <w:color w:val="17212B"/>
+        </w:rPr>
+        <w:t xml:space="preserve">纯CPU初跑遇到Windows GBK无法输出异常字符而中断，指定UTF-8后完整重跑。验证器适用纯色无重叠图，真实背景与遮挡未测；仅单次训练种子。128定位测试区间、逐格误差及全量像素核验见补充分析，不能外推通用能力。</w:t>
       </w:r>
     </w:p>
     <w:p>
@@ -3748,7 +4401,7 @@
         <w:pStyle w:val="1"/>
         <w:keepNext/>
         <w:keepLines/>
-        <w:spacing w:after="70" w:line="240" w:lineRule="auto"/>
+        <w:spacing w:after="65" w:line="240" w:lineRule="auto"/>
       </w:pPr>
       <w:r>
         <w:rPr>
@@ -3770,11 +4423,11 @@
       <w:r>
         <w:rPr>
           <w:rFonts w:ascii="Arial" w:hAnsi="Arial" w:eastAsia="微软雅黑"/>
-          <w:sz w:val="19"/>
-          <w:szCs w:val="19"/>
+          <w:sz w:val="18"/>
+          <w:szCs w:val="18"/>
           <w:color w:val="17212B"/>
         </w:rPr>
-        <w:t xml:space="preserve">1．8×8会把输出空间从16类扩大到64类，定位命中更难；若命中，格框更小，IoU可能上升，但也更易受边界误差影响。</w:t>
+        <w:t xml:space="preserve">1．解析验证器无需训练、便于追溯；遮挡、同色连通和近似颜色是边界。本次4000新图核验无误判；实际遇到旧E10/E11重复1也被宽松数值解析接受，已严格格式化。真实图可换检测器/OCR，低置信度拒绝入池，闭环仍可成立。</w:t>
       </w:r>
     </w:p>
     <w:p>
@@ -3785,11 +4438,11 @@
       <w:r>
         <w:rPr>
           <w:rFonts w:ascii="Arial" w:hAnsi="Arial" w:eastAsia="微软雅黑"/>
-          <w:sz w:val="19"/>
-          <w:szCs w:val="19"/>
+          <w:sz w:val="18"/>
+          <w:szCs w:val="18"/>
           <w:color w:val="17212B"/>
         </w:rPr>
-        <w:t xml:space="preserve">2．同色目标重叠、边框断裂或目标颜色偏离阈值会使连通块分裂/合并。此次用角点判别并对全部45道生成题与GT核对，45/45一致；真实图尚未验证。</w:t>
+        <w:t xml:space="preserve">2．表6的SFT独立定位8/8，检测框辅助8/8，RSI两轮独立8/8、8/8；参数更新与即时工具收益分别由这些对照体现。</w:t>
       </w:r>
     </w:p>
     <w:p>
@@ -3800,11 +4453,11 @@
       <w:r>
         <w:rPr>
           <w:rFonts w:ascii="Arial" w:hAnsi="Arial" w:eastAsia="微软雅黑"/>
-          <w:sz w:val="19"/>
-          <w:szCs w:val="19"/>
+          <w:sz w:val="18"/>
+          <w:szCs w:val="18"/>
           <w:color w:val="17212B"/>
         </w:rPr>
-        <w:t xml:space="preserve">3．合成图的绘制参数可直接给出种子标签，验证通过的反馈近乎无人工标注成本；迁移真实图片后需人工复核或更强视觉工具，成本和噪声都会上升。</w:t>
+        <w:t xml:space="preserve">3．最终测试高亮自查在19次中改对9题；检测框重答在31次中通过9题（处理的是不同失败子集）。自查重看自己的候选，验证器则提供独立外部证据，更符合第11章调用工具并用返回结果行动的定义。</w:t>
       </w:r>
     </w:p>
     <w:p>
@@ -3815,11 +4468,56 @@
       <w:r>
         <w:rPr>
           <w:rFonts w:ascii="Arial" w:hAnsi="Arial" w:eastAsia="微软雅黑"/>
-          <w:sz w:val="19"/>
-          <w:szCs w:val="19"/>
+          <w:sz w:val="18"/>
+          <w:szCs w:val="18"/>
           <w:color w:val="17212B"/>
         </w:rPr>
-        <w:t xml:space="preserve">4．ChartQA可解析数据表或OCR数值，按坐标轴刻度、单位、聚合公式复算答案；当文字识别置信度低或图表不规范时返回“不确定”，避免错误样本入池。</w:t>
+        <w:t xml:space="preserve">4．两轮新增7、1条。第二轮增益受重复题去重、分布窄、短步数和多任务遗忘影响；核验错误也可能污染池，但本次审计未发现。出现回退就保留并按开发集选阶段。</w:t>
+      </w:r>
+    </w:p>
+    <w:p>
+      <w:pPr>
+        <w:keepLines/>
+        <w:spacing w:after="50" w:line="240" w:lineRule="auto"/>
+      </w:pPr>
+      <w:r>
+        <w:rPr>
+          <w:rFonts w:ascii="Arial" w:hAnsi="Arial" w:eastAsia="微软雅黑"/>
+          <w:sz w:val="18"/>
+          <w:szCs w:val="18"/>
+          <w:color w:val="17212B"/>
+        </w:rPr>
+        <w:t xml:space="preserve">5．离散格位降低小模型输出与解析难度。4×4→8×8→16×16使答案从16→64→256类；格变小可减轻离散误差，命中时IoU可能提高，但每类覆盖、训练量及边界敏感性均增加。</w:t>
+      </w:r>
+    </w:p>
+    <w:p>
+      <w:pPr>
+        <w:keepLines/>
+        <w:spacing w:after="50" w:line="240" w:lineRule="auto"/>
+      </w:pPr>
+      <w:r>
+        <w:rPr>
+          <w:rFonts w:ascii="Arial" w:hAnsi="Arial" w:eastAsia="微软雅黑"/>
+          <w:sz w:val="18"/>
+          <w:szCs w:val="18"/>
+          <w:color w:val="17212B"/>
+        </w:rPr>
+        <w:t xml:space="preserve">6．无GT可用预训练模型提出候选，以高置信度检测/多源一致性核验，少量人工复核启动；未验证样本不入池。合成参数和可靠验证器提供低标注成本教师，但训练算力、工具调用及真实图复核并不免费。</w:t>
+      </w:r>
+    </w:p>
+    <w:p>
+      <w:pPr>
+        <w:keepLines/>
+        <w:spacing w:after="50" w:line="240" w:lineRule="auto"/>
+      </w:pPr>
+      <w:r>
+        <w:rPr>
+          <w:rFonts w:ascii="Arial" w:hAnsi="Arial" w:eastAsia="微软雅黑"/>
+          <w:sz w:val="18"/>
+          <w:szCs w:val="18"/>
+          <w:color w:val="17212B"/>
+        </w:rPr>
+        <w:t xml:space="preserve">样板补充：ChartQA用OCR/表格提取数值，按坐标轴、单位及聚合公式复算，证据冲突时拒绝入池。以上同时覆盖指南六题与样板四题。</w:t>
       </w:r>
     </w:p>
     <w:p>
@@ -3827,7 +4525,7 @@
         <w:pStyle w:val="1"/>
         <w:keepNext/>
         <w:keepLines/>
-        <w:spacing w:after="70" w:line="240" w:lineRule="auto"/>
+        <w:spacing w:after="65" w:line="240" w:lineRule="auto"/>
       </w:pPr>
       <w:r>
         <w:rPr>
@@ -3853,7 +4551,7 @@
           <w:szCs w:val="19"/>
           <w:color w:val="17212B"/>
         </w:rPr>
-        <w:t xml:space="preserve">本次留出集独立定位：基线0/8→SFT0/8→两轮0/8、0/8；同模型加工具后为0/8。应按上述数字分别评估参数更新与工具反馈；此次尚未观察到模型独立定位的提升。下一步应扩充训练图和定位样本、延长SFT步数，并用多种子留出集与人工核验的真实图片检验效果。</w:t>
+        <w:t xml:space="preserve">定位提升主要来自视觉适配与多样图SFT：原0/8→8/8；RSI开发106→104→100/128，未见泛化增益。最终独立109/128、检测框辅助120/128，后者体现工具贡献。教学上值得观察闭环边界；工程上纯色图直接解析更省算力，当前准确率不足以支撑精准定位。局限为合成分布、验证器覆盖与格位误差；下一步做真实图核验、多种子复测。</w:t>
       </w:r>
     </w:p>
     <w:sectPr>

</xml_diff>

<commit_message>
lab06: optimize joint training and validate fresh paired test
</commit_message>
<xml_diff>
--- a/lab06/report/2024311281_孙驰_实验作业六.docx
+++ b/lab06/report/2024311281_孙驰_实验作业六.docx
@@ -5,7 +5,7 @@
     <w:p>
       <w:pPr>
         <w:keepLines/>
-        <w:spacing w:after="45" w:line="240" w:lineRule="auto"/>
+        <w:spacing w:after="40" w:line="240" w:lineRule="auto"/>
         <w:jc w:val="center"/>
       </w:pPr>
       <w:r>
@@ -23,7 +23,7 @@
     <w:p>
       <w:pPr>
         <w:keepLines/>
-        <w:spacing w:after="70" w:line="240" w:lineRule="auto"/>
+        <w:spacing w:after="65" w:line="240" w:lineRule="auto"/>
         <w:jc w:val="center"/>
       </w:pPr>
       <w:r>
@@ -269,7 +269,7 @@
                 <w:szCs w:val="17"/>
                 <w:color w:val="17212B"/>
               </w:rPr>
-              <w:t xml:space="preserve">代码与记录</w:t>
+              <w:t xml:space="preserve">代码与证据</w:t>
             </w:r>
           </w:p>
         </w:tc>
@@ -308,7 +308,7 @@
         <w:pStyle w:val="1"/>
         <w:keepNext/>
         <w:keepLines/>
-        <w:spacing w:after="65" w:line="240" w:lineRule="auto"/>
+        <w:spacing w:after="55" w:line="240" w:lineRule="auto"/>
       </w:pPr>
       <w:r>
         <w:rPr>
@@ -334,7 +334,7 @@
           <w:szCs w:val="19"/>
           <w:color w:val="17212B"/>
         </w:rPr>
-        <w:t xml:space="preserve">完成256×256合成图的4×4网格定位、计数和存在性判断，比较基线、SFT、工具纠错及两轮RSI。先按指南10步设置复现，再针对定位0/8开展数据、输出编码、视觉适配和图像多样性对照；以留出新图检验改进，保留失败记录。</w:t>
+        <w:t xml:space="preserve">完成256×256合成图的4×4定位、计数和存在性判断，运行高亮自查、像素核验、纠错入池和两轮再训练。保留指南默认10步参照，随后诊断定位失败并连续优化。改进模型在同一份全新368题上比上一版多答对30题；模型与工具收益分开统计。</w:t>
       </w:r>
     </w:p>
     <w:p>
@@ -342,7 +342,7 @@
         <w:pStyle w:val="1"/>
         <w:keepNext/>
         <w:keepLines/>
-        <w:spacing w:after="65" w:line="240" w:lineRule="auto"/>
+        <w:spacing w:after="55" w:line="240" w:lineRule="auto"/>
       </w:pPr>
       <w:r>
         <w:rPr>
@@ -368,7 +368,7 @@
           <w:szCs w:val="19"/>
           <w:color w:val="17212B"/>
         </w:rPr>
-        <w:t xml:space="preserve">Python 3.10.20；torch 2.6.0+cu124；transformers 4.57.6；peft 0.17.1；bitsandbytes 0.48.1。SmolVLM-256M离线权重，NF4双重量化、BF16计算，固定512px单视图；原始图仍为指南256px，修正样板480px笔误。</w:t>
+        <w:t xml:space="preserve">Python 3.10.20；torch 2.6.0+cu124；transformers 4.57.6；peft 0.17.1；bitsandbytes 0.48.1。SmolVLM-256M离线基座，NF4双重量化、BF16计算，512px单视图；原图为指南256px，修正样板480px笔误。</w:t>
       </w:r>
     </w:p>
     <w:tbl>
@@ -385,8 +385,8 @@
         <w:tblLayout w:type="fixed"/>
       </w:tblPr>
       <w:tblGrid>
-        <w:gridCol w:w="3700"/>
-        <w:gridCol w:w="5300"/>
+        <w:gridCol w:w="3300"/>
+        <w:gridCol w:w="5700"/>
       </w:tblGrid>
       <w:tr>
         <w:trPr>
@@ -395,7 +395,7 @@
         </w:trPr>
         <w:tc>
           <w:tcPr>
-            <w:tcW w:w="3700" w:type="dxa"/>
+            <w:tcW w:w="3300" w:type="dxa"/>
             <w:shd w:fill="DCEAF2"/>
             <w:vAlign w:val="center"/>
             <w:tcMar>
@@ -419,13 +419,13 @@
                 <w:b/>
                 <w:bCs/>
               </w:rPr>
-              <w:t xml:space="preserve">命令／脚本</w:t>
+              <w:t xml:space="preserve">脚本／阶段</w:t>
             </w:r>
           </w:p>
         </w:tc>
         <w:tc>
           <w:tcPr>
-            <w:tcW w:w="5300" w:type="dxa"/>
+            <w:tcW w:w="5700" w:type="dxa"/>
             <w:shd w:fill="DCEAF2"/>
             <w:vAlign w:val="center"/>
             <w:tcMar>
@@ -449,7 +449,7 @@
                 <w:b/>
                 <w:bCs/>
               </w:rPr>
-              <w:t xml:space="preserve">配置与产物</w:t>
+              <w:t xml:space="preserve">实际配置</w:t>
             </w:r>
           </w:p>
         </w:tc>
@@ -460,7 +460,7 @@
         </w:trPr>
         <w:tc>
           <w:tcPr>
-            <w:tcW w:w="3700" w:type="dxa"/>
+            <w:tcW w:w="3300" w:type="dxa"/>
             <w:shd w:fill="FFFFFF"/>
             <w:vAlign w:val="center"/>
             <w:tcMar>
@@ -482,13 +482,13 @@
                 <w:szCs w:val="16"/>
                 <w:color w:val="17212B"/>
               </w:rPr>
-              <w:t xml:space="preserve">run_hpc.slurm</w:t>
+              <w:t xml:space="preserve">run_hpc.slurm（默认）</w:t>
             </w:r>
           </w:p>
         </w:tc>
         <w:tc>
           <w:tcPr>
-            <w:tcW w:w="5300" w:type="dxa"/>
+            <w:tcW w:w="5700" w:type="dxa"/>
             <w:shd w:fill="FFFFFF"/>
             <w:vAlign w:val="center"/>
             <w:tcMar>
@@ -510,7 +510,7 @@
                 <w:szCs w:val="16"/>
                 <w:color w:val="17212B"/>
               </w:rPr>
-              <w:t xml:space="preserve">40张训练图、15张评测图；15种子；10步SFT、2×10步RSI</w:t>
+              <w:t xml:space="preserve">40训练图、15评测图、15种子；SFT 10步；RSI 2×10步</w:t>
             </w:r>
           </w:p>
         </w:tc>
@@ -521,7 +521,7 @@
         </w:trPr>
         <w:tc>
           <w:tcPr>
-            <w:tcW w:w="3700" w:type="dxa"/>
+            <w:tcW w:w="3300" w:type="dxa"/>
             <w:shd w:fill="F8FAFC"/>
             <w:vAlign w:val="center"/>
             <w:tcMar>
@@ -543,13 +543,13 @@
                 <w:szCs w:val="16"/>
                 <w:color w:val="17212B"/>
               </w:rPr>
-              <w:t xml:space="preserve">run_improvement／run_visual_grounding.slurm</w:t>
+              <w:t xml:space="preserve">视觉与变化图适配（V1）</w:t>
             </w:r>
           </w:p>
         </w:tc>
         <w:tc>
           <w:tcPr>
-            <w:tcW w:w="5300" w:type="dxa"/>
+            <w:tcW w:w="5700" w:type="dxa"/>
             <w:shd w:fill="F8FAFC"/>
             <w:vAlign w:val="center"/>
             <w:tcMar>
@@ -571,7 +571,7 @@
                 <w:szCs w:val="16"/>
                 <w:color w:val="17212B"/>
               </w:rPr>
-              <w:t xml:space="preserve">语言LoRA三组各400步；视觉+连接层LoRA 1200步</w:t>
+              <w:t xml:space="preserve">视觉+连接层+语言LoRA；1200固定图更新、4000变化图更新及联合SFT</w:t>
             </w:r>
           </w:p>
         </w:tc>
@@ -582,7 +582,7 @@
         </w:trPr>
         <w:tc>
           <w:tcPr>
-            <w:tcW w:w="3700" w:type="dxa"/>
+            <w:tcW w:w="3300" w:type="dxa"/>
             <w:shd w:fill="FFFFFF"/>
             <w:vAlign w:val="center"/>
             <w:tcMar>
@@ -604,13 +604,13 @@
                 <w:szCs w:val="16"/>
                 <w:color w:val="17212B"/>
               </w:rPr>
-              <w:t xml:space="preserve">run_augmented_grounding／run_final.slurm</w:t>
+              <w:t xml:space="preserve">run_optimize_v2.slurm（V2）</w:t>
             </w:r>
           </w:p>
         </w:tc>
         <w:tc>
           <w:tcPr>
-            <w:tcW w:w="5300" w:type="dxa"/>
+            <w:tcW w:w="5700" w:type="dxa"/>
             <w:shd w:fill="FFFFFF"/>
             <w:vAlign w:val="center"/>
             <w:tcMar>
@@ -632,7 +632,68 @@
                 <w:szCs w:val="16"/>
                 <w:color w:val="17212B"/>
               </w:rPr>
-              <w:t xml:space="preserve">4000张变化图课程训练；联合SFT 400步、RSI 2×80步</w:t>
+              <w:t xml:space="preserve">3840张新训练图；1600次优化器更新×2累积；RSI 2×200次更新</w:t>
+            </w:r>
+          </w:p>
+        </w:tc>
+      </w:tr>
+      <w:tr>
+        <w:trPr>
+          <w:cantSplit/>
+        </w:trPr>
+        <w:tc>
+          <w:tcPr>
+            <w:tcW w:w="3300" w:type="dxa"/>
+            <w:shd w:fill="F8FAFC"/>
+            <w:vAlign w:val="center"/>
+            <w:tcMar>
+              <w:top w:w="30" w:type="dxa"/>
+              <w:bottom w:w="30" w:type="dxa"/>
+              <w:left w:w="55" w:type="dxa"/>
+              <w:right w:w="55" w:type="dxa"/>
+            </w:tcMar>
+          </w:tcPr>
+          <w:p>
+            <w:pPr>
+              <w:keepLines/>
+              <w:spacing w:after="0" w:line="240" w:lineRule="auto"/>
+            </w:pPr>
+            <w:r>
+              <w:rPr>
+                <w:rFonts w:ascii="Arial" w:hAnsi="Arial" w:eastAsia="微软雅黑"/>
+                <w:sz w:val="16"/>
+                <w:szCs w:val="16"/>
+                <w:color w:val="17212B"/>
+              </w:rPr>
+              <w:t xml:space="preserve">run_v2_evaluation.slurm</w:t>
+            </w:r>
+          </w:p>
+        </w:tc>
+        <w:tc>
+          <w:tcPr>
+            <w:tcW w:w="5700" w:type="dxa"/>
+            <w:shd w:fill="F8FAFC"/>
+            <w:vAlign w:val="center"/>
+            <w:tcMar>
+              <w:top w:w="30" w:type="dxa"/>
+              <w:bottom w:w="30" w:type="dxa"/>
+              <w:left w:w="55" w:type="dxa"/>
+              <w:right w:w="55" w:type="dxa"/>
+            </w:tcMar>
+          </w:tcPr>
+          <w:p>
+            <w:pPr>
+              <w:keepLines/>
+              <w:spacing w:after="0" w:line="240" w:lineRule="auto"/>
+            </w:pPr>
+            <w:r>
+              <w:rPr>
+                <w:rFonts w:ascii="Arial" w:hAnsi="Arial" w:eastAsia="微软雅黑"/>
+                <w:sz w:val="16"/>
+                <w:szCs w:val="16"/>
+                <w:color w:val="17212B"/>
+              </w:rPr>
+              <w:t xml:space="preserve">从已保存选择记录续评，不重训、不更换模型或测试题</w:t>
             </w:r>
           </w:p>
         </w:tc>
@@ -650,7 +711,7 @@
           <w:szCs w:val="18"/>
           <w:color w:val="17212B"/>
         </w:rPr>
-        <w:t xml:space="preserve">扩展HPC累计103.7GPU分钟（含开发），最终作业15397耗时00:25:43、退出码0:0，结束后队列为空。CPU为Python 3.11.16/torch 2.14.0+cpu，FP32、8线程完整六阶段耗时11.5分钟，6/6退出码0；与NF4成绩分开。</w:t>
+        <w:t xml:space="preserve">HPC训练作业15408达到1小时限时，全部训练及选择已完成；作业15427仅续评，COMPLETED、退出码0:0。两作业累计77.5GPU分钟，分配已释放。CPU/FP32默认六阶段另行验证，8线程耗时690.6秒、6/6成功。</w:t>
       </w:r>
     </w:p>
     <w:p>
@@ -658,7 +719,7 @@
         <w:pStyle w:val="1"/>
         <w:keepNext/>
         <w:keepLines/>
-        <w:spacing w:after="65" w:line="240" w:lineRule="auto"/>
+        <w:spacing w:after="55" w:line="240" w:lineRule="auto"/>
       </w:pPr>
       <w:r>
         <w:rPr>
@@ -684,37 +745,7 @@
           <w:szCs w:val="19"/>
           <w:color w:val="17212B"/>
         </w:rPr>
-        <w:t xml:space="preserve">目标框中心按r=floor(cy/64)+1、c=floor(cx/64)+1求1起始行列，输出rXcY，评分映射为中文坐标；仅完整有效答案计分。IoU为预测格框与目标对象框的交并比，正确格不等于IoU=1。prompt标签置−100，只训练答案token。</w:t>
-      </w:r>
-    </w:p>
-    <w:p>
-      <w:pPr>
-        <w:keepLines/>
-        <w:spacing w:after="50" w:line="240" w:lineRule="auto"/>
-      </w:pPr>
-      <w:r>
-        <w:rPr>
-          <w:rFonts w:ascii="Arial" w:hAnsi="Arial" w:eastAsia="微软雅黑"/>
-          <w:sz w:val="19"/>
-          <w:szCs w:val="19"/>
-          <w:color w:val="17212B"/>
-        </w:rPr>
-        <w:t xml:space="preserve">默认语言q/k/v/o LoRA有921600个参数。扩展到视觉注意力、跨模态连接层及语言模块后，可训练1614336个参数，占0.6255%；非重入检查点与首步非零梯度检查保证视觉模块实际更新。固定128图明显过拟合后，改用逐步不同的4000图，从单目标递进到2–4目标。</w:t>
-      </w:r>
-    </w:p>
-    <w:p>
-      <w:pPr>
-        <w:keepLines/>
-        <w:spacing w:after="50" w:line="240" w:lineRule="auto"/>
-      </w:pPr>
-      <w:r>
-        <w:rPr>
-          <w:rFonts w:ascii="Arial" w:hAnsi="Arial" w:eastAsia="微软雅黑"/>
-          <w:sz w:val="19"/>
-          <w:szCs w:val="19"/>
-          <w:color w:val="17212B"/>
-        </w:rPr>
-        <w:t xml:space="preserve">定位训练、开发验证、最终测试各覆盖16格×8类别；验证及测试各128张，另补0–4计数与均衡存在性，总计各184题，图像哈希不跨集重复。按开发定位率、再按总正确率选阶段，平分取较早者；最终测试不参与选型或自举。</w:t>
+        <w:t xml:space="preserve">框中心(cx,cy)映射为1起始r=floor(cy/64)+1、c=floor(cx/64)+1。模型输出rXcY，严格解析后映射中文坐标；IoU比较预测格框与目标框，格位正确时也通常小于1。问题token标签为−100，只学习答案。</w:t>
       </w:r>
     </w:p>
     <w:p>
@@ -729,30 +760,56 @@
           <w:szCs w:val="18"/>
           <w:color w:val="17212B"/>
         </w:rPr>
-        <w:t xml:space="preserve">RSI反馈只用训练图：紫框自查、检测框提示后仍错，则模型给16格/0–4/有无的合法候选评分，验证器依次核验；仅通过核验、首次纠正且未重复的候选入池，来源注明自查、检测框或候选核验。弱提示、检测框、有限候选核验均单列；搜索依赖工具。</w:t>
+        <w:t xml:space="preserve">默认语言LoRA参数921600；扩展视觉注意力、连接层与语言层后为1614336（0.6255%）。非重入检查点、三模块非零梯度、累积梯度除2及范数裁剪1保证训练有效。V2用3840新图，SFT实际3200微步：定位1920、计数960、存在320；半数定位图强化同色异形等干扰。</w:t>
       </w:r>
     </w:p>
     <w:p>
       <w:pPr>
         <w:keepLines/>
-        <w:spacing w:after="25" w:line="240" w:lineRule="auto"/>
+        <w:spacing w:after="50" w:line="240" w:lineRule="auto"/>
       </w:pPr>
       <w:r>
         <w:rPr>
           <w:rFonts w:ascii="Arial" w:hAnsi="Arial" w:eastAsia="微软雅黑"/>
-          <w:sz w:val="14"/>
-          <w:szCs w:val="14"/>
+          <w:sz w:val="18"/>
+          <w:szCs w:val="18"/>
           <w:color w:val="17212B"/>
         </w:rPr>
-        <w:t xml:space="preserve">运行日志节选（完整输出见provenance/final-15397.log）：</w:t>
+        <w:t xml:space="preserve">V2从V1 SFT继续，学习率3e−5余弦降至3e−6；开发集仍为128定位+40计数+16存在。比较400/800/1600更新，再从开发最优SFT做两轮RSI；每轮184张新反馈图另加15历史题。仅像素核验通过的模型纠错回答入池，3e−6训练，每8微步重放1次，其余抽常规池；不采用穷举候选纠错。</w:t>
+      </w:r>
+    </w:p>
+    <w:p>
+      <w:pPr>
+        <w:keepLines/>
+        <w:spacing w:after="50" w:line="240" w:lineRule="auto"/>
+      </w:pPr>
+      <w:r>
+        <w:rPr>
+          <w:rFonts w:ascii="Arial" w:hAnsi="Arial" w:eastAsia="微软雅黑"/>
+          <w:sz w:val="18"/>
+          <w:szCs w:val="18"/>
+          <w:color w:val="17212B"/>
+        </w:rPr>
+        <w:t xml:space="preserve">全部新图逐张核验并排除历史及跨集RGB重复。按开发定位率、再总正确率选择，平分取早阶段；选择落盘后才生成新368题。V1与V2同图、同量化、同提示、同解码比较。旧最终184题已公开，仅留作历史；本次是累计改进，不能把收益归于某个单独改动。</w:t>
+      </w:r>
+    </w:p>
+    <w:p>
+      <w:pPr>
+        <w:keepLines/>
+        <w:spacing w:after="20" w:line="240" w:lineRule="auto"/>
+      </w:pPr>
+      <w:r>
+        <w:rPr>
+          <w:rFonts w:ascii="Arial" w:hAnsi="Arial" w:eastAsia="微软雅黑"/>
+          <w:sz w:val="13"/>
+          <w:szCs w:val="13"/>
+          <w:color w:val="17212B"/>
+        </w:rPr>
+        <w:t xml:space="preserve">真实日志节选（截取定位字段，完整输出见provenance）：</w:t>
         <w:br/>
-        <w:t xml:space="preserve">[rsi1] pool=4119 added=7 corrected=15/15</w:t>
+        <w:t xml:space="preserve">[eval] v1_fresh_test {'loc': {'correct': 201, 'n': 256, 'valid': 256} …</w:t>
         <w:br/>
-        <w:t xml:space="preserve">[rsi2] pool=4120 added=1 corrected=15/15</w:t>
-        <w:br/>
-        <w:t xml:space="preserve">[final] selected=sft loc=109/128 total=144/184</w:t>
-        <w:br/>
-        <w:t xml:space="preserve">[complete] optimized SFT, two RSI rounds and sealed final test</w:t>
+        <w:t xml:space="preserve">[eval] v2_fresh_test {'loc': {'correct': 215, 'n': 256, 'valid': 256} …</w:t>
       </w:r>
     </w:p>
     <w:p>
@@ -761,7 +818,7 @@
         <w:keepNext/>
         <w:pageBreakBefore/>
         <w:keepLines/>
-        <w:spacing w:after="65" w:line="240" w:lineRule="auto"/>
+        <w:spacing w:after="55" w:line="240" w:lineRule="auto"/>
       </w:pPr>
       <w:r>
         <w:rPr>
@@ -779,7 +836,7 @@
       <w:pPr>
         <w:keepNext/>
         <w:keepLines/>
-        <w:spacing w:after="30" w:line="240" w:lineRule="auto"/>
+        <w:spacing w:after="25" w:line="240" w:lineRule="auto"/>
       </w:pPr>
       <w:r>
         <w:rPr>
@@ -790,7 +847,7 @@
           <w:b/>
           <w:bCs/>
         </w:rPr>
-        <w:t xml:space="preserve">表6  指南15题的默认参照与扩展对照（定位8、计数4、存在性3）</w:t>
+        <w:t xml:space="preserve">表6  指南15题默认五阶段及扩展对照（定位8／计数4／存在3）</w:t>
       </w:r>
     </w:p>
     <w:tbl>
@@ -1893,7 +1950,7 @@
                 <w:szCs w:val="16"/>
                 <w:color w:val="17212B"/>
               </w:rPr>
-              <w:t xml:space="preserve">改进SFT独立</w:t>
+              <w:t xml:space="preserve">V2+弱提示</w:t>
             </w:r>
           </w:p>
         </w:tc>
@@ -1977,7 +2034,7 @@
                 <w:szCs w:val="16"/>
                 <w:color w:val="17212B"/>
               </w:rPr>
-              <w:t xml:space="preserve">2/3</w:t>
+              <w:t xml:space="preserve">3/3</w:t>
             </w:r>
           </w:p>
         </w:tc>
@@ -2005,7 +2062,7 @@
                 <w:szCs w:val="16"/>
                 <w:color w:val="17212B"/>
               </w:rPr>
-              <w:t xml:space="preserve">12/15</w:t>
+              <w:t xml:space="preserve">13/15</w:t>
             </w:r>
           </w:p>
         </w:tc>
@@ -2066,7 +2123,7 @@
                 <w:szCs w:val="16"/>
                 <w:color w:val="17212B"/>
               </w:rPr>
-              <w:t xml:space="preserve">改进SFT+弱提示</w:t>
+              <w:t xml:space="preserve">V2+检测框</w:t>
             </w:r>
           </w:p>
         </w:tc>
@@ -2239,353 +2296,7 @@
                 <w:szCs w:val="16"/>
                 <w:color w:val="17212B"/>
               </w:rPr>
-              <w:t xml:space="preserve">改进SFT+检测框</w:t>
-            </w:r>
-          </w:p>
-        </w:tc>
-        <w:tc>
-          <w:tcPr>
-            <w:tcW w:w="1000" w:type="dxa"/>
-            <w:shd w:fill="F8FAFC"/>
-            <w:vAlign w:val="center"/>
-            <w:tcMar>
-              <w:top w:w="30" w:type="dxa"/>
-              <w:bottom w:w="30" w:type="dxa"/>
-              <w:left w:w="55" w:type="dxa"/>
-              <w:right w:w="55" w:type="dxa"/>
-            </w:tcMar>
-          </w:tcPr>
-          <w:p>
-            <w:pPr>
-              <w:keepLines/>
-              <w:spacing w:after="0" w:line="240" w:lineRule="auto"/>
-            </w:pPr>
-            <w:r>
-              <w:rPr>
-                <w:rFonts w:ascii="Arial" w:hAnsi="Arial" w:eastAsia="微软雅黑"/>
-                <w:sz w:val="16"/>
-                <w:szCs w:val="16"/>
-                <w:color w:val="17212B"/>
-              </w:rPr>
-              <w:t xml:space="preserve">8/8</w:t>
-            </w:r>
-          </w:p>
-        </w:tc>
-        <w:tc>
-          <w:tcPr>
-            <w:tcW w:w="1000" w:type="dxa"/>
-            <w:shd w:fill="F8FAFC"/>
-            <w:vAlign w:val="center"/>
-            <w:tcMar>
-              <w:top w:w="30" w:type="dxa"/>
-              <w:bottom w:w="30" w:type="dxa"/>
-              <w:left w:w="55" w:type="dxa"/>
-              <w:right w:w="55" w:type="dxa"/>
-            </w:tcMar>
-          </w:tcPr>
-          <w:p>
-            <w:pPr>
-              <w:keepLines/>
-              <w:spacing w:after="0" w:line="240" w:lineRule="auto"/>
-            </w:pPr>
-            <w:r>
-              <w:rPr>
-                <w:rFonts w:ascii="Arial" w:hAnsi="Arial" w:eastAsia="微软雅黑"/>
-                <w:sz w:val="16"/>
-                <w:szCs w:val="16"/>
-                <w:color w:val="17212B"/>
-              </w:rPr>
-              <w:t xml:space="preserve">3/4</w:t>
-            </w:r>
-          </w:p>
-        </w:tc>
-        <w:tc>
-          <w:tcPr>
-            <w:tcW w:w="1000" w:type="dxa"/>
-            <w:shd w:fill="F8FAFC"/>
-            <w:vAlign w:val="center"/>
-            <w:tcMar>
-              <w:top w:w="30" w:type="dxa"/>
-              <w:bottom w:w="30" w:type="dxa"/>
-              <w:left w:w="55" w:type="dxa"/>
-              <w:right w:w="55" w:type="dxa"/>
-            </w:tcMar>
-          </w:tcPr>
-          <w:p>
-            <w:pPr>
-              <w:keepLines/>
-              <w:spacing w:after="0" w:line="240" w:lineRule="auto"/>
-            </w:pPr>
-            <w:r>
-              <w:rPr>
-                <w:rFonts w:ascii="Arial" w:hAnsi="Arial" w:eastAsia="微软雅黑"/>
-                <w:sz w:val="16"/>
-                <w:szCs w:val="16"/>
-                <w:color w:val="17212B"/>
-              </w:rPr>
-              <w:t xml:space="preserve">3/3</w:t>
-            </w:r>
-          </w:p>
-        </w:tc>
-        <w:tc>
-          <w:tcPr>
-            <w:tcW w:w="1200" w:type="dxa"/>
-            <w:shd w:fill="F8FAFC"/>
-            <w:vAlign w:val="center"/>
-            <w:tcMar>
-              <w:top w:w="30" w:type="dxa"/>
-              <w:bottom w:w="30" w:type="dxa"/>
-              <w:left w:w="55" w:type="dxa"/>
-              <w:right w:w="55" w:type="dxa"/>
-            </w:tcMar>
-          </w:tcPr>
-          <w:p>
-            <w:pPr>
-              <w:keepLines/>
-              <w:spacing w:after="0" w:line="240" w:lineRule="auto"/>
-            </w:pPr>
-            <w:r>
-              <w:rPr>
-                <w:rFonts w:ascii="Arial" w:hAnsi="Arial" w:eastAsia="微软雅黑"/>
-                <w:sz w:val="16"/>
-                <w:szCs w:val="16"/>
-                <w:color w:val="17212B"/>
-              </w:rPr>
-              <w:t xml:space="preserve">14/15</w:t>
-            </w:r>
-          </w:p>
-        </w:tc>
-        <w:tc>
-          <w:tcPr>
-            <w:tcW w:w="2100" w:type="dxa"/>
-            <w:shd w:fill="F8FAFC"/>
-            <w:vAlign w:val="center"/>
-            <w:tcMar>
-              <w:top w:w="30" w:type="dxa"/>
-              <w:bottom w:w="30" w:type="dxa"/>
-              <w:left w:w="55" w:type="dxa"/>
-              <w:right w:w="55" w:type="dxa"/>
-            </w:tcMar>
-          </w:tcPr>
-          <w:p>
-            <w:pPr>
-              <w:keepLines/>
-              <w:spacing w:after="0" w:line="240" w:lineRule="auto"/>
-            </w:pPr>
-            <w:r>
-              <w:rPr>
-                <w:rFonts w:ascii="Arial" w:hAnsi="Arial" w:eastAsia="微软雅黑"/>
-                <w:sz w:val="16"/>
-                <w:szCs w:val="16"/>
-                <w:color w:val="17212B"/>
-              </w:rPr>
-              <w:t xml:space="preserve">0.393</w:t>
-            </w:r>
-          </w:p>
-        </w:tc>
-      </w:tr>
-      <w:tr>
-        <w:trPr>
-          <w:cantSplit/>
-        </w:trPr>
-        <w:tc>
-          <w:tcPr>
-            <w:tcW w:w="2700" w:type="dxa"/>
-            <w:shd w:fill="FFFFFF"/>
-            <w:vAlign w:val="center"/>
-            <w:tcMar>
-              <w:top w:w="30" w:type="dxa"/>
-              <w:bottom w:w="30" w:type="dxa"/>
-              <w:left w:w="55" w:type="dxa"/>
-              <w:right w:w="55" w:type="dxa"/>
-            </w:tcMar>
-          </w:tcPr>
-          <w:p>
-            <w:pPr>
-              <w:keepLines/>
-              <w:spacing w:after="0" w:line="240" w:lineRule="auto"/>
-            </w:pPr>
-            <w:r>
-              <w:rPr>
-                <w:rFonts w:ascii="Arial" w:hAnsi="Arial" w:eastAsia="微软雅黑"/>
-                <w:sz w:val="16"/>
-                <w:szCs w:val="16"/>
-                <w:color w:val="17212B"/>
-              </w:rPr>
-              <w:t xml:space="preserve">改进SFT+候选核验</w:t>
-            </w:r>
-          </w:p>
-        </w:tc>
-        <w:tc>
-          <w:tcPr>
-            <w:tcW w:w="1000" w:type="dxa"/>
-            <w:shd w:fill="FFFFFF"/>
-            <w:vAlign w:val="center"/>
-            <w:tcMar>
-              <w:top w:w="30" w:type="dxa"/>
-              <w:bottom w:w="30" w:type="dxa"/>
-              <w:left w:w="55" w:type="dxa"/>
-              <w:right w:w="55" w:type="dxa"/>
-            </w:tcMar>
-          </w:tcPr>
-          <w:p>
-            <w:pPr>
-              <w:keepLines/>
-              <w:spacing w:after="0" w:line="240" w:lineRule="auto"/>
-            </w:pPr>
-            <w:r>
-              <w:rPr>
-                <w:rFonts w:ascii="Arial" w:hAnsi="Arial" w:eastAsia="微软雅黑"/>
-                <w:sz w:val="16"/>
-                <w:szCs w:val="16"/>
-                <w:color w:val="17212B"/>
-              </w:rPr>
-              <w:t xml:space="preserve">8/8</w:t>
-            </w:r>
-          </w:p>
-        </w:tc>
-        <w:tc>
-          <w:tcPr>
-            <w:tcW w:w="1000" w:type="dxa"/>
-            <w:shd w:fill="FFFFFF"/>
-            <w:vAlign w:val="center"/>
-            <w:tcMar>
-              <w:top w:w="30" w:type="dxa"/>
-              <w:bottom w:w="30" w:type="dxa"/>
-              <w:left w:w="55" w:type="dxa"/>
-              <w:right w:w="55" w:type="dxa"/>
-            </w:tcMar>
-          </w:tcPr>
-          <w:p>
-            <w:pPr>
-              <w:keepLines/>
-              <w:spacing w:after="0" w:line="240" w:lineRule="auto"/>
-            </w:pPr>
-            <w:r>
-              <w:rPr>
-                <w:rFonts w:ascii="Arial" w:hAnsi="Arial" w:eastAsia="微软雅黑"/>
-                <w:sz w:val="16"/>
-                <w:szCs w:val="16"/>
-                <w:color w:val="17212B"/>
-              </w:rPr>
-              <w:t xml:space="preserve">4/4</w:t>
-            </w:r>
-          </w:p>
-        </w:tc>
-        <w:tc>
-          <w:tcPr>
-            <w:tcW w:w="1000" w:type="dxa"/>
-            <w:shd w:fill="FFFFFF"/>
-            <w:vAlign w:val="center"/>
-            <w:tcMar>
-              <w:top w:w="30" w:type="dxa"/>
-              <w:bottom w:w="30" w:type="dxa"/>
-              <w:left w:w="55" w:type="dxa"/>
-              <w:right w:w="55" w:type="dxa"/>
-            </w:tcMar>
-          </w:tcPr>
-          <w:p>
-            <w:pPr>
-              <w:keepLines/>
-              <w:spacing w:after="0" w:line="240" w:lineRule="auto"/>
-            </w:pPr>
-            <w:r>
-              <w:rPr>
-                <w:rFonts w:ascii="Arial" w:hAnsi="Arial" w:eastAsia="微软雅黑"/>
-                <w:sz w:val="16"/>
-                <w:szCs w:val="16"/>
-                <w:color w:val="17212B"/>
-              </w:rPr>
-              <w:t xml:space="preserve">3/3</w:t>
-            </w:r>
-          </w:p>
-        </w:tc>
-        <w:tc>
-          <w:tcPr>
-            <w:tcW w:w="1200" w:type="dxa"/>
-            <w:shd w:fill="FFFFFF"/>
-            <w:vAlign w:val="center"/>
-            <w:tcMar>
-              <w:top w:w="30" w:type="dxa"/>
-              <w:bottom w:w="30" w:type="dxa"/>
-              <w:left w:w="55" w:type="dxa"/>
-              <w:right w:w="55" w:type="dxa"/>
-            </w:tcMar>
-          </w:tcPr>
-          <w:p>
-            <w:pPr>
-              <w:keepLines/>
-              <w:spacing w:after="0" w:line="240" w:lineRule="auto"/>
-            </w:pPr>
-            <w:r>
-              <w:rPr>
-                <w:rFonts w:ascii="Arial" w:hAnsi="Arial" w:eastAsia="微软雅黑"/>
-                <w:sz w:val="16"/>
-                <w:szCs w:val="16"/>
-                <w:color w:val="17212B"/>
-              </w:rPr>
-              <w:t xml:space="preserve">15/15</w:t>
-            </w:r>
-          </w:p>
-        </w:tc>
-        <w:tc>
-          <w:tcPr>
-            <w:tcW w:w="2100" w:type="dxa"/>
-            <w:shd w:fill="FFFFFF"/>
-            <w:vAlign w:val="center"/>
-            <w:tcMar>
-              <w:top w:w="30" w:type="dxa"/>
-              <w:bottom w:w="30" w:type="dxa"/>
-              <w:left w:w="55" w:type="dxa"/>
-              <w:right w:w="55" w:type="dxa"/>
-            </w:tcMar>
-          </w:tcPr>
-          <w:p>
-            <w:pPr>
-              <w:keepLines/>
-              <w:spacing w:after="0" w:line="240" w:lineRule="auto"/>
-            </w:pPr>
-            <w:r>
-              <w:rPr>
-                <w:rFonts w:ascii="Arial" w:hAnsi="Arial" w:eastAsia="微软雅黑"/>
-                <w:sz w:val="16"/>
-                <w:szCs w:val="16"/>
-                <w:color w:val="17212B"/>
-              </w:rPr>
-              <w:t xml:space="preserve">0.393</w:t>
-            </w:r>
-          </w:p>
-        </w:tc>
-      </w:tr>
-      <w:tr>
-        <w:trPr>
-          <w:cantSplit/>
-        </w:trPr>
-        <w:tc>
-          <w:tcPr>
-            <w:tcW w:w="2700" w:type="dxa"/>
-            <w:shd w:fill="F8FAFC"/>
-            <w:vAlign w:val="center"/>
-            <w:tcMar>
-              <w:top w:w="30" w:type="dxa"/>
-              <w:bottom w:w="30" w:type="dxa"/>
-              <w:left w:w="55" w:type="dxa"/>
-              <w:right w:w="55" w:type="dxa"/>
-            </w:tcMar>
-          </w:tcPr>
-          <w:p>
-            <w:pPr>
-              <w:keepLines/>
-              <w:spacing w:after="0" w:line="240" w:lineRule="auto"/>
-            </w:pPr>
-            <w:r>
-              <w:rPr>
-                <w:rFonts w:ascii="Arial" w:hAnsi="Arial" w:eastAsia="微软雅黑"/>
-                <w:sz w:val="16"/>
-                <w:szCs w:val="16"/>
-                <w:color w:val="17212B"/>
-              </w:rPr>
-              <w:t xml:space="preserve">RSI第1轮独立</w:t>
+              <w:t xml:space="preserve">V2 RSI第1轮*</w:t>
             </w:r>
           </w:p>
         </w:tc>
@@ -2669,7 +2380,7 @@
                 <w:szCs w:val="16"/>
                 <w:color w:val="17212B"/>
               </w:rPr>
-              <w:t xml:space="preserve">2/3</w:t>
+              <w:t xml:space="preserve">3/3</w:t>
             </w:r>
           </w:p>
         </w:tc>
@@ -2697,7 +2408,7 @@
                 <w:szCs w:val="16"/>
                 <w:color w:val="17212B"/>
               </w:rPr>
-              <w:t xml:space="preserve">12/15</w:t>
+              <w:t xml:space="preserve">13/15</w:t>
             </w:r>
           </w:p>
         </w:tc>
@@ -2758,7 +2469,7 @@
                 <w:szCs w:val="16"/>
                 <w:color w:val="17212B"/>
               </w:rPr>
-              <w:t xml:space="preserve">RSI第2轮独立</w:t>
+              <w:t xml:space="preserve">V2 RSI第2轮</w:t>
             </w:r>
           </w:p>
         </w:tc>
@@ -2907,7 +2618,7 @@
     <w:p>
       <w:pPr>
         <w:keepLines/>
-        <w:spacing w:after="25" w:line="240" w:lineRule="auto"/>
+        <w:spacing w:after="20" w:line="240" w:lineRule="auto"/>
       </w:pPr>
       <w:r>
         <w:rPr>
@@ -2916,14 +2627,14 @@
           <w:szCs w:val="16"/>
           <w:color w:val="17212B"/>
         </w:rPr>
-        <w:t xml:space="preserve">默认两轮：池15→17→17，新增2、0条，轮末独立7/15、4/15。下表为扩展闭环。</w:t>
+        <w:t xml:space="preserve">* 第一轮RSI即开发集已选模型；独立13/15，8道定位全对。</w:t>
       </w:r>
     </w:p>
     <w:p>
       <w:pPr>
         <w:keepNext/>
         <w:keepLines/>
-        <w:spacing w:after="30" w:line="240" w:lineRule="auto"/>
+        <w:spacing w:after="25" w:line="240" w:lineRule="auto"/>
       </w:pPr>
       <w:r>
         <w:rPr>
@@ -2934,7 +2645,7 @@
           <w:b/>
           <w:bCs/>
         </w:rPr>
-        <w:t xml:space="preserve">表7  扩展两轮反馈（轮末独立依次12/15、13/15，见表6）</w:t>
+        <w:t xml:space="preserve">表7  默认与V2两轮反馈（自查／工具列为重答尝试次数）</w:t>
       </w:r>
     </w:p>
     <w:tbl>
@@ -2951,12 +2662,13 @@
         <w:tblLayout w:type="fixed"/>
       </w:tblPr>
       <w:tblGrid>
-        <w:gridCol w:w="900"/>
+        <w:gridCol w:w="1200"/>
         <w:gridCol w:w="1400"/>
+        <w:gridCol w:w="1150"/>
+        <w:gridCol w:w="1900"/>
+        <w:gridCol w:w="1300"/>
+        <w:gridCol w:w="650"/>
         <w:gridCol w:w="1400"/>
-        <w:gridCol w:w="2700"/>
-        <w:gridCol w:w="1500"/>
-        <w:gridCol w:w="1100"/>
       </w:tblGrid>
       <w:tr>
         <w:trPr>
@@ -2965,7 +2677,7 @@
         </w:trPr>
         <w:tc>
           <w:tcPr>
-            <w:tcW w:w="900" w:type="dxa"/>
+            <w:tcW w:w="1200" w:type="dxa"/>
             <w:shd w:fill="DCEAF2"/>
             <w:vAlign w:val="center"/>
             <w:tcMar>
@@ -2983,8 +2695,8 @@
             <w:r>
               <w:rPr>
                 <w:rFonts w:ascii="Arial" w:hAnsi="Arial" w:eastAsia="微软雅黑"/>
-                <w:sz w:val="16"/>
-                <w:szCs w:val="16"/>
+                <w:sz w:val="15"/>
+                <w:szCs w:val="15"/>
                 <w:color w:val="17212B"/>
                 <w:b/>
                 <w:bCs/>
@@ -3013,13 +2725,133 @@
             <w:r>
               <w:rPr>
                 <w:rFonts w:ascii="Arial" w:hAnsi="Arial" w:eastAsia="微软雅黑"/>
-                <w:sz w:val="16"/>
-                <w:szCs w:val="16"/>
+                <w:sz w:val="15"/>
+                <w:szCs w:val="15"/>
                 <w:color w:val="17212B"/>
                 <w:b/>
                 <w:bCs/>
               </w:rPr>
               <w:t xml:space="preserve">池规模</w:t>
+            </w:r>
+          </w:p>
+        </w:tc>
+        <w:tc>
+          <w:tcPr>
+            <w:tcW w:w="1150" w:type="dxa"/>
+            <w:shd w:fill="DCEAF2"/>
+            <w:vAlign w:val="center"/>
+            <w:tcMar>
+              <w:top w:w="30" w:type="dxa"/>
+              <w:bottom w:w="30" w:type="dxa"/>
+              <w:left w:w="55" w:type="dxa"/>
+              <w:right w:w="55" w:type="dxa"/>
+            </w:tcMar>
+          </w:tcPr>
+          <w:p>
+            <w:pPr>
+              <w:keepLines/>
+              <w:spacing w:after="0" w:line="240" w:lineRule="auto"/>
+            </w:pPr>
+            <w:r>
+              <w:rPr>
+                <w:rFonts w:ascii="Arial" w:hAnsi="Arial" w:eastAsia="微软雅黑"/>
+                <w:sz w:val="15"/>
+                <w:szCs w:val="15"/>
+                <w:color w:val="17212B"/>
+                <w:b/>
+                <w:bCs/>
+              </w:rPr>
+              <w:t xml:space="preserve">直接对</w:t>
+            </w:r>
+          </w:p>
+        </w:tc>
+        <w:tc>
+          <w:tcPr>
+            <w:tcW w:w="1900" w:type="dxa"/>
+            <w:shd w:fill="DCEAF2"/>
+            <w:vAlign w:val="center"/>
+            <w:tcMar>
+              <w:top w:w="30" w:type="dxa"/>
+              <w:bottom w:w="30" w:type="dxa"/>
+              <w:left w:w="55" w:type="dxa"/>
+              <w:right w:w="55" w:type="dxa"/>
+            </w:tcMar>
+          </w:tcPr>
+          <w:p>
+            <w:pPr>
+              <w:keepLines/>
+              <w:spacing w:after="0" w:line="240" w:lineRule="auto"/>
+            </w:pPr>
+            <w:r>
+              <w:rPr>
+                <w:rFonts w:ascii="Arial" w:hAnsi="Arial" w:eastAsia="微软雅黑"/>
+                <w:sz w:val="15"/>
+                <w:szCs w:val="15"/>
+                <w:color w:val="17212B"/>
+                <w:b/>
+                <w:bCs/>
+              </w:rPr>
+              <w:t xml:space="preserve">自查／工具次数</w:t>
+            </w:r>
+          </w:p>
+        </w:tc>
+        <w:tc>
+          <w:tcPr>
+            <w:tcW w:w="1300" w:type="dxa"/>
+            <w:shd w:fill="DCEAF2"/>
+            <w:vAlign w:val="center"/>
+            <w:tcMar>
+              <w:top w:w="30" w:type="dxa"/>
+              <w:bottom w:w="30" w:type="dxa"/>
+              <w:left w:w="55" w:type="dxa"/>
+              <w:right w:w="55" w:type="dxa"/>
+            </w:tcMar>
+          </w:tcPr>
+          <w:p>
+            <w:pPr>
+              <w:keepLines/>
+              <w:spacing w:after="0" w:line="240" w:lineRule="auto"/>
+            </w:pPr>
+            <w:r>
+              <w:rPr>
+                <w:rFonts w:ascii="Arial" w:hAnsi="Arial" w:eastAsia="微软雅黑"/>
+                <w:sz w:val="15"/>
+                <w:szCs w:val="15"/>
+                <w:color w:val="17212B"/>
+                <w:b/>
+                <w:bCs/>
+              </w:rPr>
+              <w:t xml:space="preserve">纠错后对</w:t>
+            </w:r>
+          </w:p>
+        </w:tc>
+        <w:tc>
+          <w:tcPr>
+            <w:tcW w:w="650" w:type="dxa"/>
+            <w:shd w:fill="DCEAF2"/>
+            <w:vAlign w:val="center"/>
+            <w:tcMar>
+              <w:top w:w="30" w:type="dxa"/>
+              <w:bottom w:w="30" w:type="dxa"/>
+              <w:left w:w="55" w:type="dxa"/>
+              <w:right w:w="55" w:type="dxa"/>
+            </w:tcMar>
+          </w:tcPr>
+          <w:p>
+            <w:pPr>
+              <w:keepLines/>
+              <w:spacing w:after="0" w:line="240" w:lineRule="auto"/>
+            </w:pPr>
+            <w:r>
+              <w:rPr>
+                <w:rFonts w:ascii="Arial" w:hAnsi="Arial" w:eastAsia="微软雅黑"/>
+                <w:sz w:val="15"/>
+                <w:szCs w:val="15"/>
+                <w:color w:val="17212B"/>
+                <w:b/>
+                <w:bCs/>
+              </w:rPr>
+              <w:t xml:space="preserve">新增</w:t>
             </w:r>
           </w:p>
         </w:tc>
@@ -3043,103 +2875,13 @@
             <w:r>
               <w:rPr>
                 <w:rFonts w:ascii="Arial" w:hAnsi="Arial" w:eastAsia="微软雅黑"/>
-                <w:sz w:val="16"/>
-                <w:szCs w:val="16"/>
+                <w:sz w:val="15"/>
+                <w:szCs w:val="15"/>
                 <w:color w:val="17212B"/>
                 <w:b/>
                 <w:bCs/>
               </w:rPr>
-              <w:t xml:space="preserve">直接对/15</w:t>
-            </w:r>
-          </w:p>
-        </w:tc>
-        <w:tc>
-          <w:tcPr>
-            <w:tcW w:w="2700" w:type="dxa"/>
-            <w:shd w:fill="DCEAF2"/>
-            <w:vAlign w:val="center"/>
-            <w:tcMar>
-              <w:top w:w="30" w:type="dxa"/>
-              <w:bottom w:w="30" w:type="dxa"/>
-              <w:left w:w="55" w:type="dxa"/>
-              <w:right w:w="55" w:type="dxa"/>
-            </w:tcMar>
-          </w:tcPr>
-          <w:p>
-            <w:pPr>
-              <w:keepLines/>
-              <w:spacing w:after="0" w:line="240" w:lineRule="auto"/>
-            </w:pPr>
-            <w:r>
-              <w:rPr>
-                <w:rFonts w:ascii="Arial" w:hAnsi="Arial" w:eastAsia="微软雅黑"/>
-                <w:sz w:val="16"/>
-                <w:szCs w:val="16"/>
-                <w:color w:val="17212B"/>
-                <w:b/>
-                <w:bCs/>
-              </w:rPr>
-              <w:t xml:space="preserve">自查/框/搜索次数</w:t>
-            </w:r>
-          </w:p>
-        </w:tc>
-        <w:tc>
-          <w:tcPr>
-            <w:tcW w:w="1500" w:type="dxa"/>
-            <w:shd w:fill="DCEAF2"/>
-            <w:vAlign w:val="center"/>
-            <w:tcMar>
-              <w:top w:w="30" w:type="dxa"/>
-              <w:bottom w:w="30" w:type="dxa"/>
-              <w:left w:w="55" w:type="dxa"/>
-              <w:right w:w="55" w:type="dxa"/>
-            </w:tcMar>
-          </w:tcPr>
-          <w:p>
-            <w:pPr>
-              <w:keepLines/>
-              <w:spacing w:after="0" w:line="240" w:lineRule="auto"/>
-            </w:pPr>
-            <w:r>
-              <w:rPr>
-                <w:rFonts w:ascii="Arial" w:hAnsi="Arial" w:eastAsia="微软雅黑"/>
-                <w:sz w:val="16"/>
-                <w:szCs w:val="16"/>
-                <w:color w:val="17212B"/>
-                <w:b/>
-                <w:bCs/>
-              </w:rPr>
-              <w:t xml:space="preserve">纠错后/15</w:t>
-            </w:r>
-          </w:p>
-        </w:tc>
-        <w:tc>
-          <w:tcPr>
-            <w:tcW w:w="1100" w:type="dxa"/>
-            <w:shd w:fill="DCEAF2"/>
-            <w:vAlign w:val="center"/>
-            <w:tcMar>
-              <w:top w:w="30" w:type="dxa"/>
-              <w:bottom w:w="30" w:type="dxa"/>
-              <w:left w:w="55" w:type="dxa"/>
-              <w:right w:w="55" w:type="dxa"/>
-            </w:tcMar>
-          </w:tcPr>
-          <w:p>
-            <w:pPr>
-              <w:keepLines/>
-              <w:spacing w:after="0" w:line="240" w:lineRule="auto"/>
-            </w:pPr>
-            <w:r>
-              <w:rPr>
-                <w:rFonts w:ascii="Arial" w:hAnsi="Arial" w:eastAsia="微软雅黑"/>
-                <w:sz w:val="16"/>
-                <w:szCs w:val="16"/>
-                <w:color w:val="17212B"/>
-                <w:b/>
-                <w:bCs/>
-              </w:rPr>
-              <w:t xml:space="preserve">新增</w:t>
+              <w:t xml:space="preserve">轮末独立</w:t>
             </w:r>
           </w:p>
         </w:tc>
@@ -3150,7 +2892,7 @@
         </w:trPr>
         <w:tc>
           <w:tcPr>
-            <w:tcW w:w="900" w:type="dxa"/>
+            <w:tcW w:w="1200" w:type="dxa"/>
             <w:shd w:fill="FFFFFF"/>
             <w:vAlign w:val="center"/>
             <w:tcMar>
@@ -3168,11 +2910,11 @@
             <w:r>
               <w:rPr>
                 <w:rFonts w:ascii="Arial" w:hAnsi="Arial" w:eastAsia="微软雅黑"/>
-                <w:sz w:val="16"/>
-                <w:szCs w:val="16"/>
+                <w:sz w:val="15"/>
+                <w:szCs w:val="15"/>
                 <w:color w:val="17212B"/>
               </w:rPr>
-              <w:t xml:space="preserve">1</w:t>
+              <w:t xml:space="preserve">默认1</w:t>
             </w:r>
           </w:p>
         </w:tc>
@@ -3196,11 +2938,123 @@
             <w:r>
               <w:rPr>
                 <w:rFonts w:ascii="Arial" w:hAnsi="Arial" w:eastAsia="微软雅黑"/>
-                <w:sz w:val="16"/>
-                <w:szCs w:val="16"/>
+                <w:sz w:val="15"/>
+                <w:szCs w:val="15"/>
                 <w:color w:val="17212B"/>
               </w:rPr>
-              <w:t xml:space="preserve">4119</w:t>
+              <w:t xml:space="preserve">17</w:t>
+            </w:r>
+          </w:p>
+        </w:tc>
+        <w:tc>
+          <w:tcPr>
+            <w:tcW w:w="1150" w:type="dxa"/>
+            <w:shd w:fill="FFFFFF"/>
+            <w:vAlign w:val="center"/>
+            <w:tcMar>
+              <w:top w:w="30" w:type="dxa"/>
+              <w:bottom w:w="30" w:type="dxa"/>
+              <w:left w:w="55" w:type="dxa"/>
+              <w:right w:w="55" w:type="dxa"/>
+            </w:tcMar>
+          </w:tcPr>
+          <w:p>
+            <w:pPr>
+              <w:keepLines/>
+              <w:spacing w:after="0" w:line="240" w:lineRule="auto"/>
+            </w:pPr>
+            <w:r>
+              <w:rPr>
+                <w:rFonts w:ascii="Arial" w:hAnsi="Arial" w:eastAsia="微软雅黑"/>
+                <w:sz w:val="15"/>
+                <w:szCs w:val="15"/>
+                <w:color w:val="17212B"/>
+              </w:rPr>
+              <w:t xml:space="preserve">5/15</w:t>
+            </w:r>
+          </w:p>
+        </w:tc>
+        <w:tc>
+          <w:tcPr>
+            <w:tcW w:w="1900" w:type="dxa"/>
+            <w:shd w:fill="FFFFFF"/>
+            <w:vAlign w:val="center"/>
+            <w:tcMar>
+              <w:top w:w="30" w:type="dxa"/>
+              <w:bottom w:w="30" w:type="dxa"/>
+              <w:left w:w="55" w:type="dxa"/>
+              <w:right w:w="55" w:type="dxa"/>
+            </w:tcMar>
+          </w:tcPr>
+          <w:p>
+            <w:pPr>
+              <w:keepLines/>
+              <w:spacing w:after="0" w:line="240" w:lineRule="auto"/>
+            </w:pPr>
+            <w:r>
+              <w:rPr>
+                <w:rFonts w:ascii="Arial" w:hAnsi="Arial" w:eastAsia="微软雅黑"/>
+                <w:sz w:val="15"/>
+                <w:szCs w:val="15"/>
+                <w:color w:val="17212B"/>
+              </w:rPr>
+              <w:t xml:space="preserve">0／10</w:t>
+            </w:r>
+          </w:p>
+        </w:tc>
+        <w:tc>
+          <w:tcPr>
+            <w:tcW w:w="1300" w:type="dxa"/>
+            <w:shd w:fill="FFFFFF"/>
+            <w:vAlign w:val="center"/>
+            <w:tcMar>
+              <w:top w:w="30" w:type="dxa"/>
+              <w:bottom w:w="30" w:type="dxa"/>
+              <w:left w:w="55" w:type="dxa"/>
+              <w:right w:w="55" w:type="dxa"/>
+            </w:tcMar>
+          </w:tcPr>
+          <w:p>
+            <w:pPr>
+              <w:keepLines/>
+              <w:spacing w:after="0" w:line="240" w:lineRule="auto"/>
+            </w:pPr>
+            <w:r>
+              <w:rPr>
+                <w:rFonts w:ascii="Arial" w:hAnsi="Arial" w:eastAsia="微软雅黑"/>
+                <w:sz w:val="15"/>
+                <w:szCs w:val="15"/>
+                <w:color w:val="17212B"/>
+              </w:rPr>
+              <w:t xml:space="preserve">7/15</w:t>
+            </w:r>
+          </w:p>
+        </w:tc>
+        <w:tc>
+          <w:tcPr>
+            <w:tcW w:w="650" w:type="dxa"/>
+            <w:shd w:fill="FFFFFF"/>
+            <w:vAlign w:val="center"/>
+            <w:tcMar>
+              <w:top w:w="30" w:type="dxa"/>
+              <w:bottom w:w="30" w:type="dxa"/>
+              <w:left w:w="55" w:type="dxa"/>
+              <w:right w:w="55" w:type="dxa"/>
+            </w:tcMar>
+          </w:tcPr>
+          <w:p>
+            <w:pPr>
+              <w:keepLines/>
+              <w:spacing w:after="0" w:line="240" w:lineRule="auto"/>
+            </w:pPr>
+            <w:r>
+              <w:rPr>
+                <w:rFonts w:ascii="Arial" w:hAnsi="Arial" w:eastAsia="微软雅黑"/>
+                <w:sz w:val="15"/>
+                <w:szCs w:val="15"/>
+                <w:color w:val="17212B"/>
+              </w:rPr>
+              <w:t xml:space="preserve">2</w:t>
             </w:r>
           </w:p>
         </w:tc>
@@ -3224,95 +3078,11 @@
             <w:r>
               <w:rPr>
                 <w:rFonts w:ascii="Arial" w:hAnsi="Arial" w:eastAsia="微软雅黑"/>
-                <w:sz w:val="16"/>
-                <w:szCs w:val="16"/>
+                <w:sz w:val="15"/>
+                <w:szCs w:val="15"/>
                 <w:color w:val="17212B"/>
               </w:rPr>
-              <w:t xml:space="preserve">8</w:t>
-            </w:r>
-          </w:p>
-        </w:tc>
-        <w:tc>
-          <w:tcPr>
-            <w:tcW w:w="2700" w:type="dxa"/>
-            <w:shd w:fill="FFFFFF"/>
-            <w:vAlign w:val="center"/>
-            <w:tcMar>
-              <w:top w:w="30" w:type="dxa"/>
-              <w:bottom w:w="30" w:type="dxa"/>
-              <w:left w:w="55" w:type="dxa"/>
-              <w:right w:w="55" w:type="dxa"/>
-            </w:tcMar>
-          </w:tcPr>
-          <w:p>
-            <w:pPr>
-              <w:keepLines/>
-              <w:spacing w:after="0" w:line="240" w:lineRule="auto"/>
-            </w:pPr>
-            <w:r>
-              <w:rPr>
-                <w:rFonts w:ascii="Arial" w:hAnsi="Arial" w:eastAsia="微软雅黑"/>
-                <w:sz w:val="16"/>
-                <w:szCs w:val="16"/>
-                <w:color w:val="17212B"/>
-              </w:rPr>
-              <w:t xml:space="preserve">2/7/4</w:t>
-            </w:r>
-          </w:p>
-        </w:tc>
-        <w:tc>
-          <w:tcPr>
-            <w:tcW w:w="1500" w:type="dxa"/>
-            <w:shd w:fill="FFFFFF"/>
-            <w:vAlign w:val="center"/>
-            <w:tcMar>
-              <w:top w:w="30" w:type="dxa"/>
-              <w:bottom w:w="30" w:type="dxa"/>
-              <w:left w:w="55" w:type="dxa"/>
-              <w:right w:w="55" w:type="dxa"/>
-            </w:tcMar>
-          </w:tcPr>
-          <w:p>
-            <w:pPr>
-              <w:keepLines/>
-              <w:spacing w:after="0" w:line="240" w:lineRule="auto"/>
-            </w:pPr>
-            <w:r>
-              <w:rPr>
-                <w:rFonts w:ascii="Arial" w:hAnsi="Arial" w:eastAsia="微软雅黑"/>
-                <w:sz w:val="16"/>
-                <w:szCs w:val="16"/>
-                <w:color w:val="17212B"/>
-              </w:rPr>
-              <w:t xml:space="preserve">15</w:t>
-            </w:r>
-          </w:p>
-        </w:tc>
-        <w:tc>
-          <w:tcPr>
-            <w:tcW w:w="1100" w:type="dxa"/>
-            <w:shd w:fill="FFFFFF"/>
-            <w:vAlign w:val="center"/>
-            <w:tcMar>
-              <w:top w:w="30" w:type="dxa"/>
-              <w:bottom w:w="30" w:type="dxa"/>
-              <w:left w:w="55" w:type="dxa"/>
-              <w:right w:w="55" w:type="dxa"/>
-            </w:tcMar>
-          </w:tcPr>
-          <w:p>
-            <w:pPr>
-              <w:keepLines/>
-              <w:spacing w:after="0" w:line="240" w:lineRule="auto"/>
-            </w:pPr>
-            <w:r>
-              <w:rPr>
-                <w:rFonts w:ascii="Arial" w:hAnsi="Arial" w:eastAsia="微软雅黑"/>
-                <w:sz w:val="16"/>
-                <w:szCs w:val="16"/>
-                <w:color w:val="17212B"/>
-              </w:rPr>
-              <w:t xml:space="preserve">7</w:t>
+              <w:t xml:space="preserve">7/15</w:t>
             </w:r>
           </w:p>
         </w:tc>
@@ -3323,7 +3093,7 @@
         </w:trPr>
         <w:tc>
           <w:tcPr>
-            <w:tcW w:w="900" w:type="dxa"/>
+            <w:tcW w:w="1200" w:type="dxa"/>
             <w:shd w:fill="F8FAFC"/>
             <w:vAlign w:val="center"/>
             <w:tcMar>
@@ -3341,11 +3111,11 @@
             <w:r>
               <w:rPr>
                 <w:rFonts w:ascii="Arial" w:hAnsi="Arial" w:eastAsia="微软雅黑"/>
-                <w:sz w:val="16"/>
-                <w:szCs w:val="16"/>
+                <w:sz w:val="15"/>
+                <w:szCs w:val="15"/>
                 <w:color w:val="17212B"/>
               </w:rPr>
-              <w:t xml:space="preserve">2</w:t>
+              <w:t xml:space="preserve">默认2</w:t>
             </w:r>
           </w:p>
         </w:tc>
@@ -3369,11 +3139,123 @@
             <w:r>
               <w:rPr>
                 <w:rFonts w:ascii="Arial" w:hAnsi="Arial" w:eastAsia="微软雅黑"/>
-                <w:sz w:val="16"/>
-                <w:szCs w:val="16"/>
+                <w:sz w:val="15"/>
+                <w:szCs w:val="15"/>
                 <w:color w:val="17212B"/>
               </w:rPr>
-              <w:t xml:space="preserve">4120</w:t>
+              <w:t xml:space="preserve">17</w:t>
+            </w:r>
+          </w:p>
+        </w:tc>
+        <w:tc>
+          <w:tcPr>
+            <w:tcW w:w="1150" w:type="dxa"/>
+            <w:shd w:fill="F8FAFC"/>
+            <w:vAlign w:val="center"/>
+            <w:tcMar>
+              <w:top w:w="30" w:type="dxa"/>
+              <w:bottom w:w="30" w:type="dxa"/>
+              <w:left w:w="55" w:type="dxa"/>
+              <w:right w:w="55" w:type="dxa"/>
+            </w:tcMar>
+          </w:tcPr>
+          <w:p>
+            <w:pPr>
+              <w:keepLines/>
+              <w:spacing w:after="0" w:line="240" w:lineRule="auto"/>
+            </w:pPr>
+            <w:r>
+              <w:rPr>
+                <w:rFonts w:ascii="Arial" w:hAnsi="Arial" w:eastAsia="微软雅黑"/>
+                <w:sz w:val="15"/>
+                <w:szCs w:val="15"/>
+                <w:color w:val="17212B"/>
+              </w:rPr>
+              <w:t xml:space="preserve">6/15</w:t>
+            </w:r>
+          </w:p>
+        </w:tc>
+        <w:tc>
+          <w:tcPr>
+            <w:tcW w:w="1900" w:type="dxa"/>
+            <w:shd w:fill="F8FAFC"/>
+            <w:vAlign w:val="center"/>
+            <w:tcMar>
+              <w:top w:w="30" w:type="dxa"/>
+              <w:bottom w:w="30" w:type="dxa"/>
+              <w:left w:w="55" w:type="dxa"/>
+              <w:right w:w="55" w:type="dxa"/>
+            </w:tcMar>
+          </w:tcPr>
+          <w:p>
+            <w:pPr>
+              <w:keepLines/>
+              <w:spacing w:after="0" w:line="240" w:lineRule="auto"/>
+            </w:pPr>
+            <w:r>
+              <w:rPr>
+                <w:rFonts w:ascii="Arial" w:hAnsi="Arial" w:eastAsia="微软雅黑"/>
+                <w:sz w:val="15"/>
+                <w:szCs w:val="15"/>
+                <w:color w:val="17212B"/>
+              </w:rPr>
+              <w:t xml:space="preserve">1／9</w:t>
+            </w:r>
+          </w:p>
+        </w:tc>
+        <w:tc>
+          <w:tcPr>
+            <w:tcW w:w="1300" w:type="dxa"/>
+            <w:shd w:fill="F8FAFC"/>
+            <w:vAlign w:val="center"/>
+            <w:tcMar>
+              <w:top w:w="30" w:type="dxa"/>
+              <w:bottom w:w="30" w:type="dxa"/>
+              <w:left w:w="55" w:type="dxa"/>
+              <w:right w:w="55" w:type="dxa"/>
+            </w:tcMar>
+          </w:tcPr>
+          <w:p>
+            <w:pPr>
+              <w:keepLines/>
+              <w:spacing w:after="0" w:line="240" w:lineRule="auto"/>
+            </w:pPr>
+            <w:r>
+              <w:rPr>
+                <w:rFonts w:ascii="Arial" w:hAnsi="Arial" w:eastAsia="微软雅黑"/>
+                <w:sz w:val="15"/>
+                <w:szCs w:val="15"/>
+                <w:color w:val="17212B"/>
+              </w:rPr>
+              <w:t xml:space="preserve">7/15</w:t>
+            </w:r>
+          </w:p>
+        </w:tc>
+        <w:tc>
+          <w:tcPr>
+            <w:tcW w:w="650" w:type="dxa"/>
+            <w:shd w:fill="F8FAFC"/>
+            <w:vAlign w:val="center"/>
+            <w:tcMar>
+              <w:top w:w="30" w:type="dxa"/>
+              <w:bottom w:w="30" w:type="dxa"/>
+              <w:left w:w="55" w:type="dxa"/>
+              <w:right w:w="55" w:type="dxa"/>
+            </w:tcMar>
+          </w:tcPr>
+          <w:p>
+            <w:pPr>
+              <w:keepLines/>
+              <w:spacing w:after="0" w:line="240" w:lineRule="auto"/>
+            </w:pPr>
+            <w:r>
+              <w:rPr>
+                <w:rFonts w:ascii="Arial" w:hAnsi="Arial" w:eastAsia="微软雅黑"/>
+                <w:sz w:val="15"/>
+                <w:szCs w:val="15"/>
+                <w:color w:val="17212B"/>
+              </w:rPr>
+              <w:t xml:space="preserve">0</w:t>
             </w:r>
           </w:p>
         </w:tc>
@@ -3397,17 +3279,223 @@
             <w:r>
               <w:rPr>
                 <w:rFonts w:ascii="Arial" w:hAnsi="Arial" w:eastAsia="微软雅黑"/>
-                <w:sz w:val="16"/>
-                <w:szCs w:val="16"/>
+                <w:sz w:val="15"/>
+                <w:szCs w:val="15"/>
                 <w:color w:val="17212B"/>
               </w:rPr>
-              <w:t xml:space="preserve">12</w:t>
+              <w:t xml:space="preserve">4/15</w:t>
+            </w:r>
+          </w:p>
+        </w:tc>
+      </w:tr>
+      <w:tr>
+        <w:trPr>
+          <w:cantSplit/>
+        </w:trPr>
+        <w:tc>
+          <w:tcPr>
+            <w:tcW w:w="1200" w:type="dxa"/>
+            <w:shd w:fill="FFFFFF"/>
+            <w:vAlign w:val="center"/>
+            <w:tcMar>
+              <w:top w:w="30" w:type="dxa"/>
+              <w:bottom w:w="30" w:type="dxa"/>
+              <w:left w:w="55" w:type="dxa"/>
+              <w:right w:w="55" w:type="dxa"/>
+            </w:tcMar>
+          </w:tcPr>
+          <w:p>
+            <w:pPr>
+              <w:keepLines/>
+              <w:spacing w:after="0" w:line="240" w:lineRule="auto"/>
+            </w:pPr>
+            <w:r>
+              <w:rPr>
+                <w:rFonts w:ascii="Arial" w:hAnsi="Arial" w:eastAsia="微软雅黑"/>
+                <w:sz w:val="15"/>
+                <w:szCs w:val="15"/>
+                <w:color w:val="17212B"/>
+              </w:rPr>
+              <w:t xml:space="preserve">V2第1轮</w:t>
             </w:r>
           </w:p>
         </w:tc>
         <w:tc>
           <w:tcPr>
-            <w:tcW w:w="2700" w:type="dxa"/>
+            <w:tcW w:w="1400" w:type="dxa"/>
+            <w:shd w:fill="FFFFFF"/>
+            <w:vAlign w:val="center"/>
+            <w:tcMar>
+              <w:top w:w="30" w:type="dxa"/>
+              <w:bottom w:w="30" w:type="dxa"/>
+              <w:left w:w="55" w:type="dxa"/>
+              <w:right w:w="55" w:type="dxa"/>
+            </w:tcMar>
+          </w:tcPr>
+          <w:p>
+            <w:pPr>
+              <w:keepLines/>
+              <w:spacing w:after="0" w:line="240" w:lineRule="auto"/>
+            </w:pPr>
+            <w:r>
+              <w:rPr>
+                <w:rFonts w:ascii="Arial" w:hAnsi="Arial" w:eastAsia="微软雅黑"/>
+                <w:sz w:val="15"/>
+                <w:szCs w:val="15"/>
+                <w:color w:val="17212B"/>
+              </w:rPr>
+              <w:t xml:space="preserve">3840+15</w:t>
+            </w:r>
+          </w:p>
+        </w:tc>
+        <w:tc>
+          <w:tcPr>
+            <w:tcW w:w="1150" w:type="dxa"/>
+            <w:shd w:fill="FFFFFF"/>
+            <w:vAlign w:val="center"/>
+            <w:tcMar>
+              <w:top w:w="30" w:type="dxa"/>
+              <w:bottom w:w="30" w:type="dxa"/>
+              <w:left w:w="55" w:type="dxa"/>
+              <w:right w:w="55" w:type="dxa"/>
+            </w:tcMar>
+          </w:tcPr>
+          <w:p>
+            <w:pPr>
+              <w:keepLines/>
+              <w:spacing w:after="0" w:line="240" w:lineRule="auto"/>
+            </w:pPr>
+            <w:r>
+              <w:rPr>
+                <w:rFonts w:ascii="Arial" w:hAnsi="Arial" w:eastAsia="微软雅黑"/>
+                <w:sz w:val="15"/>
+                <w:szCs w:val="15"/>
+                <w:color w:val="17212B"/>
+              </w:rPr>
+              <w:t xml:space="preserve">153/199</w:t>
+            </w:r>
+          </w:p>
+        </w:tc>
+        <w:tc>
+          <w:tcPr>
+            <w:tcW w:w="1900" w:type="dxa"/>
+            <w:shd w:fill="FFFFFF"/>
+            <w:vAlign w:val="center"/>
+            <w:tcMar>
+              <w:top w:w="30" w:type="dxa"/>
+              <w:bottom w:w="30" w:type="dxa"/>
+              <w:left w:w="55" w:type="dxa"/>
+              <w:right w:w="55" w:type="dxa"/>
+            </w:tcMar>
+          </w:tcPr>
+          <w:p>
+            <w:pPr>
+              <w:keepLines/>
+              <w:spacing w:after="0" w:line="240" w:lineRule="auto"/>
+            </w:pPr>
+            <w:r>
+              <w:rPr>
+                <w:rFonts w:ascii="Arial" w:hAnsi="Arial" w:eastAsia="微软雅黑"/>
+                <w:sz w:val="15"/>
+                <w:szCs w:val="15"/>
+                <w:color w:val="17212B"/>
+              </w:rPr>
+              <w:t xml:space="preserve">25／36</w:t>
+            </w:r>
+          </w:p>
+        </w:tc>
+        <w:tc>
+          <w:tcPr>
+            <w:tcW w:w="1300" w:type="dxa"/>
+            <w:shd w:fill="FFFFFF"/>
+            <w:vAlign w:val="center"/>
+            <w:tcMar>
+              <w:top w:w="30" w:type="dxa"/>
+              <w:bottom w:w="30" w:type="dxa"/>
+              <w:left w:w="55" w:type="dxa"/>
+              <w:right w:w="55" w:type="dxa"/>
+            </w:tcMar>
+          </w:tcPr>
+          <w:p>
+            <w:pPr>
+              <w:keepLines/>
+              <w:spacing w:after="0" w:line="240" w:lineRule="auto"/>
+            </w:pPr>
+            <w:r>
+              <w:rPr>
+                <w:rFonts w:ascii="Arial" w:hAnsi="Arial" w:eastAsia="微软雅黑"/>
+                <w:sz w:val="15"/>
+                <w:szCs w:val="15"/>
+                <w:color w:val="17212B"/>
+              </w:rPr>
+              <w:t xml:space="preserve">168/199</w:t>
+            </w:r>
+          </w:p>
+        </w:tc>
+        <w:tc>
+          <w:tcPr>
+            <w:tcW w:w="650" w:type="dxa"/>
+            <w:shd w:fill="FFFFFF"/>
+            <w:vAlign w:val="center"/>
+            <w:tcMar>
+              <w:top w:w="30" w:type="dxa"/>
+              <w:bottom w:w="30" w:type="dxa"/>
+              <w:left w:w="55" w:type="dxa"/>
+              <w:right w:w="55" w:type="dxa"/>
+            </w:tcMar>
+          </w:tcPr>
+          <w:p>
+            <w:pPr>
+              <w:keepLines/>
+              <w:spacing w:after="0" w:line="240" w:lineRule="auto"/>
+            </w:pPr>
+            <w:r>
+              <w:rPr>
+                <w:rFonts w:ascii="Arial" w:hAnsi="Arial" w:eastAsia="微软雅黑"/>
+                <w:sz w:val="15"/>
+                <w:szCs w:val="15"/>
+                <w:color w:val="17212B"/>
+              </w:rPr>
+              <w:t xml:space="preserve">15</w:t>
+            </w:r>
+          </w:p>
+        </w:tc>
+        <w:tc>
+          <w:tcPr>
+            <w:tcW w:w="1400" w:type="dxa"/>
+            <w:shd w:fill="FFFFFF"/>
+            <w:vAlign w:val="center"/>
+            <w:tcMar>
+              <w:top w:w="30" w:type="dxa"/>
+              <w:bottom w:w="30" w:type="dxa"/>
+              <w:left w:w="55" w:type="dxa"/>
+              <w:right w:w="55" w:type="dxa"/>
+            </w:tcMar>
+          </w:tcPr>
+          <w:p>
+            <w:pPr>
+              <w:keepLines/>
+              <w:spacing w:after="0" w:line="240" w:lineRule="auto"/>
+            </w:pPr>
+            <w:r>
+              <w:rPr>
+                <w:rFonts w:ascii="Arial" w:hAnsi="Arial" w:eastAsia="微软雅黑"/>
+                <w:sz w:val="15"/>
+                <w:szCs w:val="15"/>
+                <w:color w:val="17212B"/>
+              </w:rPr>
+              <w:t xml:space="preserve">13/15</w:t>
+            </w:r>
+          </w:p>
+        </w:tc>
+      </w:tr>
+      <w:tr>
+        <w:trPr>
+          <w:cantSplit/>
+        </w:trPr>
+        <w:tc>
+          <w:tcPr>
+            <w:tcW w:w="1200" w:type="dxa"/>
             <w:shd w:fill="F8FAFC"/>
             <w:vAlign w:val="center"/>
             <w:tcMar>
@@ -3425,17 +3513,17 @@
             <w:r>
               <w:rPr>
                 <w:rFonts w:ascii="Arial" w:hAnsi="Arial" w:eastAsia="微软雅黑"/>
-                <w:sz w:val="16"/>
-                <w:szCs w:val="16"/>
+                <w:sz w:val="15"/>
+                <w:szCs w:val="15"/>
                 <w:color w:val="17212B"/>
               </w:rPr>
-              <w:t xml:space="preserve">2/3/2</w:t>
+              <w:t xml:space="preserve">V2第2轮</w:t>
             </w:r>
           </w:p>
         </w:tc>
         <w:tc>
           <w:tcPr>
-            <w:tcW w:w="1500" w:type="dxa"/>
+            <w:tcW w:w="1400" w:type="dxa"/>
             <w:shd w:fill="F8FAFC"/>
             <w:vAlign w:val="center"/>
             <w:tcMar>
@@ -3453,17 +3541,17 @@
             <w:r>
               <w:rPr>
                 <w:rFonts w:ascii="Arial" w:hAnsi="Arial" w:eastAsia="微软雅黑"/>
-                <w:sz w:val="16"/>
-                <w:szCs w:val="16"/>
+                <w:sz w:val="15"/>
+                <w:szCs w:val="15"/>
                 <w:color w:val="17212B"/>
               </w:rPr>
-              <w:t xml:space="preserve">15</w:t>
+              <w:t xml:space="preserve">3840+27</w:t>
             </w:r>
           </w:p>
         </w:tc>
         <w:tc>
           <w:tcPr>
-            <w:tcW w:w="1100" w:type="dxa"/>
+            <w:tcW w:w="1150" w:type="dxa"/>
             <w:shd w:fill="F8FAFC"/>
             <w:vAlign w:val="center"/>
             <w:tcMar>
@@ -3481,16 +3569,143 @@
             <w:r>
               <w:rPr>
                 <w:rFonts w:ascii="Arial" w:hAnsi="Arial" w:eastAsia="微软雅黑"/>
-                <w:sz w:val="16"/>
-                <w:szCs w:val="16"/>
+                <w:sz w:val="15"/>
+                <w:szCs w:val="15"/>
                 <w:color w:val="17212B"/>
               </w:rPr>
-              <w:t xml:space="preserve">1</w:t>
+              <w:t xml:space="preserve">148/199</w:t>
+            </w:r>
+          </w:p>
+        </w:tc>
+        <w:tc>
+          <w:tcPr>
+            <w:tcW w:w="1900" w:type="dxa"/>
+            <w:shd w:fill="F8FAFC"/>
+            <w:vAlign w:val="center"/>
+            <w:tcMar>
+              <w:top w:w="30" w:type="dxa"/>
+              <w:bottom w:w="30" w:type="dxa"/>
+              <w:left w:w="55" w:type="dxa"/>
+              <w:right w:w="55" w:type="dxa"/>
+            </w:tcMar>
+          </w:tcPr>
+          <w:p>
+            <w:pPr>
+              <w:keepLines/>
+              <w:spacing w:after="0" w:line="240" w:lineRule="auto"/>
+            </w:pPr>
+            <w:r>
+              <w:rPr>
+                <w:rFonts w:ascii="Arial" w:hAnsi="Arial" w:eastAsia="微软雅黑"/>
+                <w:sz w:val="15"/>
+                <w:szCs w:val="15"/>
+                <w:color w:val="17212B"/>
+              </w:rPr>
+              <w:t xml:space="preserve">29／46</w:t>
+            </w:r>
+          </w:p>
+        </w:tc>
+        <w:tc>
+          <w:tcPr>
+            <w:tcW w:w="1300" w:type="dxa"/>
+            <w:shd w:fill="F8FAFC"/>
+            <w:vAlign w:val="center"/>
+            <w:tcMar>
+              <w:top w:w="30" w:type="dxa"/>
+              <w:bottom w:w="30" w:type="dxa"/>
+              <w:left w:w="55" w:type="dxa"/>
+              <w:right w:w="55" w:type="dxa"/>
+            </w:tcMar>
+          </w:tcPr>
+          <w:p>
+            <w:pPr>
+              <w:keepLines/>
+              <w:spacing w:after="0" w:line="240" w:lineRule="auto"/>
+            </w:pPr>
+            <w:r>
+              <w:rPr>
+                <w:rFonts w:ascii="Arial" w:hAnsi="Arial" w:eastAsia="微软雅黑"/>
+                <w:sz w:val="15"/>
+                <w:szCs w:val="15"/>
+                <w:color w:val="17212B"/>
+              </w:rPr>
+              <w:t xml:space="preserve">164/199</w:t>
+            </w:r>
+          </w:p>
+        </w:tc>
+        <w:tc>
+          <w:tcPr>
+            <w:tcW w:w="650" w:type="dxa"/>
+            <w:shd w:fill="F8FAFC"/>
+            <w:vAlign w:val="center"/>
+            <w:tcMar>
+              <w:top w:w="30" w:type="dxa"/>
+              <w:bottom w:w="30" w:type="dxa"/>
+              <w:left w:w="55" w:type="dxa"/>
+              <w:right w:w="55" w:type="dxa"/>
+            </w:tcMar>
+          </w:tcPr>
+          <w:p>
+            <w:pPr>
+              <w:keepLines/>
+              <w:spacing w:after="0" w:line="240" w:lineRule="auto"/>
+            </w:pPr>
+            <w:r>
+              <w:rPr>
+                <w:rFonts w:ascii="Arial" w:hAnsi="Arial" w:eastAsia="微软雅黑"/>
+                <w:sz w:val="15"/>
+                <w:szCs w:val="15"/>
+                <w:color w:val="17212B"/>
+              </w:rPr>
+              <w:t xml:space="preserve">12</w:t>
+            </w:r>
+          </w:p>
+        </w:tc>
+        <w:tc>
+          <w:tcPr>
+            <w:tcW w:w="1400" w:type="dxa"/>
+            <w:shd w:fill="F8FAFC"/>
+            <w:vAlign w:val="center"/>
+            <w:tcMar>
+              <w:top w:w="30" w:type="dxa"/>
+              <w:bottom w:w="30" w:type="dxa"/>
+              <w:left w:w="55" w:type="dxa"/>
+              <w:right w:w="55" w:type="dxa"/>
+            </w:tcMar>
+          </w:tcPr>
+          <w:p>
+            <w:pPr>
+              <w:keepLines/>
+              <w:spacing w:after="0" w:line="240" w:lineRule="auto"/>
+            </w:pPr>
+            <w:r>
+              <w:rPr>
+                <w:rFonts w:ascii="Arial" w:hAnsi="Arial" w:eastAsia="微软雅黑"/>
+                <w:sz w:val="15"/>
+                <w:szCs w:val="15"/>
+                <w:color w:val="17212B"/>
+              </w:rPr>
+              <w:t xml:space="preserve">13/15</w:t>
             </w:r>
           </w:p>
         </w:tc>
       </w:tr>
     </w:tbl>
+    <w:p>
+      <w:pPr>
+        <w:keepLines/>
+        <w:spacing w:after="25" w:line="240" w:lineRule="auto"/>
+      </w:pPr>
+      <w:r>
+        <w:rPr>
+          <w:rFonts w:ascii="Arial" w:hAnsi="Arial" w:eastAsia="微软雅黑"/>
+          <w:sz w:val="16"/>
+          <w:szCs w:val="16"/>
+          <w:color w:val="17212B"/>
+        </w:rPr>
+        <w:t xml:space="preserve">默认初始池15；V2常规池3840，验证池0→15→27。两轮各50重放微步，分别覆盖15、27条；入池答案保留自查／检测框来源，不用GT替代。</w:t>
+      </w:r>
+    </w:p>
     <w:p>
       <w:pPr>
         <w:keepLines/>
@@ -3503,14 +3718,140 @@
           <w:szCs w:val="18"/>
           <w:color w:val="17212B"/>
         </w:rPr>
-        <w:t xml:space="preserve">按开发集选择sft。最终独立测试：定位109/128、计数22/40、存在性13/16，总计144/184；定位IoU=0.325。同模型弱提示、检测框、候选核验的定位依次118/128、120/128、128/128；工具分数单列。</w:t>
+        <w:t xml:space="preserve">开发集选rsi1。全新同题测试：定位201→215/256、计数31→45/80、存在28→30/32，总计260→290/368；V2定位IoU 0.320。检测框辅助定位233/256、总计315/368。</w:t>
       </w:r>
     </w:p>
     <w:p>
       <w:pPr>
         <w:keepNext/>
         <w:keepLines/>
-        <w:spacing w:after="30" w:line="240" w:lineRule="auto"/>
+        <w:jc w:val="center"/>
+        <w:spacing w:after="30"/>
+      </w:pPr>
+      <w:r>
+        <w:pict>
+          <v:shape id="lab06_accuracy" type="#_x0000_t75" style="width:440pt;height:132.0pt">
+            <v:imagedata r:id="rId9" o:title="accuracy"/>
+          </v:shape>
+        </w:pict>
+      </w:r>
+    </w:p>
+    <w:p>
+      <w:pPr>
+        <w:keepLines/>
+        <w:spacing w:after="25" w:line="240" w:lineRule="auto"/>
+        <w:jc w:val="center"/>
+      </w:pPr>
+      <w:r>
+        <w:rPr>
+          <w:rFonts w:ascii="Arial" w:hAnsi="Arial" w:eastAsia="微软雅黑"/>
+          <w:sz w:val="16"/>
+          <w:szCs w:val="16"/>
+          <w:color w:val="17212B"/>
+        </w:rPr>
+        <w:t xml:space="preserve">图1  开发阶段与同题新测试；独立模型和工具条件分列。</w:t>
+      </w:r>
+    </w:p>
+    <w:p>
+      <w:pPr>
+        <w:pStyle w:val="1"/>
+        <w:keepNext/>
+        <w:pageBreakBefore/>
+        <w:keepLines/>
+        <w:spacing w:after="55" w:line="240" w:lineRule="auto"/>
+      </w:pPr>
+      <w:r>
+        <w:rPr>
+          <w:rFonts w:ascii="Arial" w:hAnsi="Arial" w:eastAsia="微软雅黑"/>
+          <w:sz w:val="22"/>
+          <w:szCs w:val="22"/>
+          <w:color w:val="008577"/>
+          <w:b/>
+          <w:bCs/>
+        </w:rPr>
+        <w:t xml:space="preserve">五、结果分析与问题调试</w:t>
+      </w:r>
+    </w:p>
+    <w:p>
+      <w:pPr>
+        <w:keepLines/>
+        <w:spacing w:after="50" w:line="240" w:lineRule="auto"/>
+      </w:pPr>
+      <w:r>
+        <w:rPr>
+          <w:rFonts w:ascii="Arial" w:hAnsi="Arial" w:eastAsia="微软雅黑"/>
+          <w:sz w:val="19"/>
+          <w:szCs w:val="19"/>
+          <w:color w:val="17212B"/>
+        </w:rPr>
+        <w:t xml:space="preserve">原10步只有6次定位更新，8条种子仅覆盖6格、没有第二行；两轮新增2条均非定位。延长种子400步虽训练8/8，开发仅10/128；固定128图视觉适配训练抽样16/16，开发16/128。变化图和联合训练后V1旧独立测试109/128，说明训练拟合与新图能力必须分开看。</w:t>
+      </w:r>
+    </w:p>
+    <w:p>
+      <w:pPr>
+        <w:keepLines/>
+        <w:spacing w:after="50" w:line="240" w:lineRule="auto"/>
+      </w:pPr>
+      <w:r>
+        <w:rPr>
+          <w:rFonts w:ascii="Arial" w:hAnsi="Arial" w:eastAsia="微软雅黑"/>
+          <w:sz w:val="19"/>
+          <w:szCs w:val="19"/>
+          <w:color w:val="17212B"/>
+        </w:rPr>
+        <w:t xml:space="preserve">V2开发定位依次106→108→111→110→112→111/128；计数22→26→29→34→28→28/40。SFT1600总分159/184最高，但预定定位优先规则选择RSI1（155/184）；没有根据新测试改规则。SFT800→RSI1仅定位多1题，不能声称RSI获得稳定显著提升。</w:t>
+      </w:r>
+    </w:p>
+    <w:p>
+      <w:pPr>
+        <w:keepLines/>
+        <w:spacing w:after="50" w:line="240" w:lineRule="auto"/>
+      </w:pPr>
+      <w:r>
+        <w:rPr>
+          <w:rFonts w:ascii="Arial" w:hAnsi="Arial" w:eastAsia="微软雅黑"/>
+          <w:sz w:val="19"/>
+          <w:szCs w:val="19"/>
+          <w:color w:val="17212B"/>
+        </w:rPr>
+        <w:t xml:space="preserve">同题新测试V2定位84.0%，较V1提高5.5个百分点；定位纠正24题、损失10题，配对精确检验p=0.024；总分配对p&lt;0.001。定位Wilson 95%区间79.0%–88.0%，仅反映本合成集抽样，不含训练种子波动。</w:t>
+      </w:r>
+    </w:p>
+    <w:p>
+      <w:pPr>
+        <w:keepLines/>
+        <w:spacing w:after="50" w:line="240" w:lineRule="auto"/>
+      </w:pPr>
+      <w:r>
+        <w:rPr>
+          <w:rFonts w:ascii="Arial" w:hAnsi="Arial" w:eastAsia="微软雅黑"/>
+          <w:sz w:val="18"/>
+          <w:szCs w:val="18"/>
+          <w:color w:val="17212B"/>
+        </w:rPr>
+        <w:t xml:space="preserve">两轮自举图训练后独立复测分别4/15、11/27；分母不同，不能当同题增幅。空白同题16格探针1/16。像素框由外部算法识别，工具成绩不能充作模型能力；V1历史穷举核验184/184主要由完整答案空间与验证器保证。</w:t>
+      </w:r>
+    </w:p>
+    <w:p>
+      <w:pPr>
+        <w:keepLines/>
+        <w:spacing w:after="50" w:line="240" w:lineRule="auto"/>
+      </w:pPr>
+      <w:r>
+        <w:rPr>
+          <w:rFonts w:ascii="Arial" w:hAnsi="Arial" w:eastAsia="微软雅黑"/>
+          <w:sz w:val="18"/>
+          <w:szCs w:val="18"/>
+          <w:color w:val="17212B"/>
+        </w:rPr>
+        <w:t xml:space="preserve">训练限时后只续评，保留15408原日志、全部源代码快照及15427选择哈希；不覆盖失败记录。CPU初跑GBK输出异常，固定UTF-8后六阶段完整通过。扩展测试补齐0–4并拒绝重复数字，避免原四道计数均为1造成常数答案高分。</w:t>
+      </w:r>
+    </w:p>
+    <w:p>
+      <w:pPr>
+        <w:keepNext/>
+        <w:keepLines/>
+        <w:spacing w:after="25" w:line="240" w:lineRule="auto"/>
       </w:pPr>
       <w:r>
         <w:rPr>
@@ -3521,7 +3862,7 @@
           <w:b/>
           <w:bCs/>
         </w:rPr>
-        <w:t xml:space="preserve">代表性路径（E为旧评测，F为最终测试题，逐题原文可查）</w:t>
+        <w:t xml:space="preserve">代表性路径（新测试题号缩写，逐题图文与原始输出均留存）</w:t>
       </w:r>
     </w:p>
     <w:tbl>
@@ -3539,9 +3880,9 @@
       </w:tblPr>
       <w:tblGrid>
         <w:gridCol w:w="1300"/>
-        <w:gridCol w:w="1850"/>
-        <w:gridCol w:w="3800"/>
-        <w:gridCol w:w="2050"/>
+        <w:gridCol w:w="2600"/>
+        <w:gridCol w:w="3300"/>
+        <w:gridCol w:w="1800"/>
       </w:tblGrid>
       <w:tr>
         <w:trPr>
@@ -3580,7 +3921,7 @@
         </w:tc>
         <w:tc>
           <w:tcPr>
-            <w:tcW w:w="1850" w:type="dxa"/>
+            <w:tcW w:w="2600" w:type="dxa"/>
             <w:shd w:fill="DCEAF2"/>
             <w:vAlign w:val="center"/>
             <w:tcMar>
@@ -3610,7 +3951,7 @@
         </w:tc>
         <w:tc>
           <w:tcPr>
-            <w:tcW w:w="3800" w:type="dxa"/>
+            <w:tcW w:w="3300" w:type="dxa"/>
             <w:shd w:fill="DCEAF2"/>
             <w:vAlign w:val="center"/>
             <w:tcMar>
@@ -3640,7 +3981,7 @@
         </w:tc>
         <w:tc>
           <w:tcPr>
-            <w:tcW w:w="2050" w:type="dxa"/>
+            <w:tcW w:w="1800" w:type="dxa"/>
             <w:shd w:fill="DCEAF2"/>
             <w:vAlign w:val="center"/>
             <w:tcMar>
@@ -3664,7 +4005,7 @@
                 <w:b/>
                 <w:bCs/>
               </w:rPr>
-              <w:t xml:space="preserve">GT／判断</w:t>
+              <w:t xml:space="preserve">GT</w:t>
             </w:r>
           </w:p>
         </w:tc>
@@ -3703,7 +4044,7 @@
         </w:tc>
         <w:tc>
           <w:tcPr>
-            <w:tcW w:w="1850" w:type="dxa"/>
+            <w:tcW w:w="2600" w:type="dxa"/>
             <w:shd w:fill="FFFFFF"/>
             <w:vAlign w:val="center"/>
             <w:tcMar>
@@ -3725,13 +4066,13 @@
                 <w:szCs w:val="15"/>
                 <w:color w:val="17212B"/>
               </w:rPr>
-              <w:t xml:space="preserve">E00 绿圆</w:t>
+              <w:t xml:space="preserve">loc_00000 红方</w:t>
             </w:r>
           </w:p>
         </w:tc>
         <w:tc>
           <w:tcPr>
-            <w:tcW w:w="3800" w:type="dxa"/>
+            <w:tcW w:w="3300" w:type="dxa"/>
             <w:shd w:fill="FFFFFF"/>
             <w:vAlign w:val="center"/>
             <w:tcMar>
@@ -3753,13 +4094,13 @@
                 <w:szCs w:val="15"/>
                 <w:color w:val="17212B"/>
               </w:rPr>
-              <w:t xml:space="preserve">r3c4 → r3c4</w:t>
+              <w:t xml:space="preserve">r3c2 → r3c2</w:t>
             </w:r>
           </w:p>
         </w:tc>
         <w:tc>
           <w:tcPr>
-            <w:tcW w:w="2050" w:type="dxa"/>
+            <w:tcW w:w="1800" w:type="dxa"/>
             <w:shd w:fill="FFFFFF"/>
             <w:vAlign w:val="center"/>
             <w:tcMar>
@@ -3781,7 +4122,7 @@
                 <w:szCs w:val="15"/>
                 <w:color w:val="17212B"/>
               </w:rPr>
-              <w:t xml:space="preserve">第3行第4列／正确</w:t>
+              <w:t xml:space="preserve">第3行第2列</w:t>
             </w:r>
           </w:p>
         </w:tc>
@@ -3814,13 +4155,13 @@
                 <w:szCs w:val="15"/>
                 <w:color w:val="17212B"/>
               </w:rPr>
-              <w:t xml:space="preserve">自查改对</w:t>
+              <w:t xml:space="preserve">高亮改对</w:t>
             </w:r>
           </w:p>
         </w:tc>
         <w:tc>
           <w:tcPr>
-            <w:tcW w:w="1850" w:type="dxa"/>
+            <w:tcW w:w="2600" w:type="dxa"/>
             <w:shd w:fill="F8FAFC"/>
             <w:vAlign w:val="center"/>
             <w:tcMar>
@@ -3842,13 +4183,13 @@
                 <w:szCs w:val="15"/>
                 <w:color w:val="17212B"/>
               </w:rPr>
-              <w:t xml:space="preserve">F02_00 红圆</w:t>
+              <w:t xml:space="preserve">loc_00040 绿方</w:t>
             </w:r>
           </w:p>
         </w:tc>
         <w:tc>
           <w:tcPr>
-            <w:tcW w:w="3800" w:type="dxa"/>
+            <w:tcW w:w="3300" w:type="dxa"/>
             <w:shd w:fill="F8FAFC"/>
             <w:vAlign w:val="center"/>
             <w:tcMar>
@@ -3870,13 +4211,13 @@
                 <w:szCs w:val="15"/>
                 <w:color w:val="17212B"/>
               </w:rPr>
-              <w:t xml:space="preserve">r1c1 → r1c3</w:t>
+              <w:t xml:space="preserve">r4c4 → r4c2</w:t>
             </w:r>
           </w:p>
         </w:tc>
         <w:tc>
           <w:tcPr>
-            <w:tcW w:w="2050" w:type="dxa"/>
+            <w:tcW w:w="1800" w:type="dxa"/>
             <w:shd w:fill="F8FAFC"/>
             <w:vAlign w:val="center"/>
             <w:tcMar>
@@ -3898,7 +4239,7 @@
                 <w:szCs w:val="15"/>
                 <w:color w:val="17212B"/>
               </w:rPr>
-              <w:t xml:space="preserve">第1行第3列／正确</w:t>
+              <w:t xml:space="preserve">第4行第2列</w:t>
             </w:r>
           </w:p>
         </w:tc>
@@ -3931,13 +4272,13 @@
                 <w:szCs w:val="15"/>
                 <w:color w:val="17212B"/>
               </w:rPr>
-              <w:t xml:space="preserve">检测框改对</w:t>
+              <w:t xml:space="preserve">框提示改对</w:t>
             </w:r>
           </w:p>
         </w:tc>
         <w:tc>
           <w:tcPr>
-            <w:tcW w:w="1850" w:type="dxa"/>
+            <w:tcW w:w="2600" w:type="dxa"/>
             <w:shd w:fill="FFFFFF"/>
             <w:vAlign w:val="center"/>
             <w:tcMar>
@@ -3959,13 +4300,13 @@
                 <w:szCs w:val="15"/>
                 <w:color w:val="17212B"/>
               </w:rPr>
-              <w:t xml:space="preserve">E10 绿方</w:t>
+              <w:t xml:space="preserve">loc_00002 绿圆</w:t>
             </w:r>
           </w:p>
         </w:tc>
         <w:tc>
           <w:tcPr>
-            <w:tcW w:w="3800" w:type="dxa"/>
+            <w:tcW w:w="3300" w:type="dxa"/>
             <w:shd w:fill="FFFFFF"/>
             <w:vAlign w:val="center"/>
             <w:tcMar>
@@ -3987,13 +4328,13 @@
                 <w:szCs w:val="15"/>
                 <w:color w:val="17212B"/>
               </w:rPr>
-              <w:t xml:space="preserve">0 → 1</w:t>
+              <w:t xml:space="preserve">r2c3 → r2c4</w:t>
             </w:r>
           </w:p>
         </w:tc>
         <w:tc>
           <w:tcPr>
-            <w:tcW w:w="2050" w:type="dxa"/>
+            <w:tcW w:w="1800" w:type="dxa"/>
             <w:shd w:fill="FFFFFF"/>
             <w:vAlign w:val="center"/>
             <w:tcMar>
@@ -4015,7 +4356,7 @@
                 <w:szCs w:val="15"/>
                 <w:color w:val="17212B"/>
               </w:rPr>
-              <w:t xml:space="preserve">1个／正确</w:t>
+              <w:t xml:space="preserve">第2行第4列</w:t>
             </w:r>
           </w:p>
         </w:tc>
@@ -4048,13 +4389,13 @@
                 <w:szCs w:val="15"/>
                 <w:color w:val="17212B"/>
               </w:rPr>
-              <w:t xml:space="preserve">候选核验</w:t>
+              <w:t xml:space="preserve">工具仍错</w:t>
             </w:r>
           </w:p>
         </w:tc>
         <w:tc>
           <w:tcPr>
-            <w:tcW w:w="1850" w:type="dxa"/>
+            <w:tcW w:w="2600" w:type="dxa"/>
             <w:shd w:fill="F8FAFC"/>
             <w:vAlign w:val="center"/>
             <w:tcMar>
@@ -4076,13 +4417,13 @@
                 <w:szCs w:val="15"/>
                 <w:color w:val="17212B"/>
               </w:rPr>
-              <w:t xml:space="preserve">E08 红圆</w:t>
+              <w:t xml:space="preserve">loc_00005 绿方</w:t>
             </w:r>
           </w:p>
         </w:tc>
         <w:tc>
           <w:tcPr>
-            <w:tcW w:w="3800" w:type="dxa"/>
+            <w:tcW w:w="3300" w:type="dxa"/>
             <w:shd w:fill="F8FAFC"/>
             <w:vAlign w:val="center"/>
             <w:tcMar>
@@ -4104,13 +4445,13 @@
                 <w:szCs w:val="15"/>
                 <w:color w:val="17212B"/>
               </w:rPr>
-              <w:t xml:space="preserve">2 → 1</w:t>
+              <w:t xml:space="preserve">r4c4 → r4c4</w:t>
             </w:r>
           </w:p>
         </w:tc>
         <w:tc>
           <w:tcPr>
-            <w:tcW w:w="2050" w:type="dxa"/>
+            <w:tcW w:w="1800" w:type="dxa"/>
             <w:shd w:fill="F8FAFC"/>
             <w:vAlign w:val="center"/>
             <w:tcMar>
@@ -4132,124 +4473,7 @@
                 <w:szCs w:val="15"/>
                 <w:color w:val="17212B"/>
               </w:rPr>
-              <w:t xml:space="preserve">1个／正确</w:t>
-            </w:r>
-          </w:p>
-        </w:tc>
-      </w:tr>
-      <w:tr>
-        <w:trPr>
-          <w:cantSplit/>
-        </w:trPr>
-        <w:tc>
-          <w:tcPr>
-            <w:tcW w:w="1300" w:type="dxa"/>
-            <w:shd w:fill="FFFFFF"/>
-            <w:vAlign w:val="center"/>
-            <w:tcMar>
-              <w:top w:w="30" w:type="dxa"/>
-              <w:bottom w:w="30" w:type="dxa"/>
-              <w:left w:w="55" w:type="dxa"/>
-              <w:right w:w="55" w:type="dxa"/>
-            </w:tcMar>
-          </w:tcPr>
-          <w:p>
-            <w:pPr>
-              <w:keepLines/>
-              <w:spacing w:after="0" w:line="240" w:lineRule="auto"/>
-            </w:pPr>
-            <w:r>
-              <w:rPr>
-                <w:rFonts w:ascii="Arial" w:hAnsi="Arial" w:eastAsia="微软雅黑"/>
-                <w:sz w:val="15"/>
-                <w:szCs w:val="15"/>
-                <w:color w:val="17212B"/>
-              </w:rPr>
-              <w:t xml:space="preserve">检测框仍错</w:t>
-            </w:r>
-          </w:p>
-        </w:tc>
-        <w:tc>
-          <w:tcPr>
-            <w:tcW w:w="1850" w:type="dxa"/>
-            <w:shd w:fill="FFFFFF"/>
-            <w:vAlign w:val="center"/>
-            <w:tcMar>
-              <w:top w:w="30" w:type="dxa"/>
-              <w:bottom w:w="30" w:type="dxa"/>
-              <w:left w:w="55" w:type="dxa"/>
-              <w:right w:w="55" w:type="dxa"/>
-            </w:tcMar>
-          </w:tcPr>
-          <w:p>
-            <w:pPr>
-              <w:keepLines/>
-              <w:spacing w:after="0" w:line="240" w:lineRule="auto"/>
-            </w:pPr>
-            <w:r>
-              <w:rPr>
-                <w:rFonts w:ascii="Arial" w:hAnsi="Arial" w:eastAsia="微软雅黑"/>
-                <w:sz w:val="15"/>
-                <w:szCs w:val="15"/>
-                <w:color w:val="17212B"/>
-              </w:rPr>
-              <w:t xml:space="preserve">E08 红圆</w:t>
-            </w:r>
-          </w:p>
-        </w:tc>
-        <w:tc>
-          <w:tcPr>
-            <w:tcW w:w="3800" w:type="dxa"/>
-            <w:shd w:fill="FFFFFF"/>
-            <w:vAlign w:val="center"/>
-            <w:tcMar>
-              <w:top w:w="30" w:type="dxa"/>
-              <w:bottom w:w="30" w:type="dxa"/>
-              <w:left w:w="55" w:type="dxa"/>
-              <w:right w:w="55" w:type="dxa"/>
-            </w:tcMar>
-          </w:tcPr>
-          <w:p>
-            <w:pPr>
-              <w:keepLines/>
-              <w:spacing w:after="0" w:line="240" w:lineRule="auto"/>
-            </w:pPr>
-            <w:r>
-              <w:rPr>
-                <w:rFonts w:ascii="Arial" w:hAnsi="Arial" w:eastAsia="微软雅黑"/>
-                <w:sz w:val="15"/>
-                <w:szCs w:val="15"/>
-                <w:color w:val="17212B"/>
-              </w:rPr>
-              <w:t xml:space="preserve">2 → 2</w:t>
-            </w:r>
-          </w:p>
-        </w:tc>
-        <w:tc>
-          <w:tcPr>
-            <w:tcW w:w="2050" w:type="dxa"/>
-            <w:shd w:fill="FFFFFF"/>
-            <w:vAlign w:val="center"/>
-            <w:tcMar>
-              <w:top w:w="30" w:type="dxa"/>
-              <w:bottom w:w="30" w:type="dxa"/>
-              <w:left w:w="55" w:type="dxa"/>
-              <w:right w:w="55" w:type="dxa"/>
-            </w:tcMar>
-          </w:tcPr>
-          <w:p>
-            <w:pPr>
-              <w:keepLines/>
-              <w:spacing w:after="0" w:line="240" w:lineRule="auto"/>
-            </w:pPr>
-            <w:r>
-              <w:rPr>
-                <w:rFonts w:ascii="Arial" w:hAnsi="Arial" w:eastAsia="微软雅黑"/>
-                <w:sz w:val="15"/>
-                <w:szCs w:val="15"/>
-                <w:color w:val="17212B"/>
-              </w:rPr>
-              <w:t xml:space="preserve">1个／仍错</w:t>
+              <w:t xml:space="preserve">第4行第3列</w:t>
             </w:r>
           </w:p>
         </w:tc>
@@ -4257,151 +4481,10 @@
     </w:tbl>
     <w:p>
       <w:pPr>
-        <w:keepNext/>
-        <w:keepLines/>
-        <w:jc w:val="center"/>
-        <w:spacing w:after="30"/>
-      </w:pPr>
-      <w:r>
-        <w:pict>
-          <v:shape id="lab06_accuracy" type="#_x0000_t75" style="width:440pt;height:132.0pt">
-            <v:imagedata r:id="rId9" o:title="accuracy"/>
-          </v:shape>
-        </w:pict>
-      </w:r>
-    </w:p>
-    <w:p>
-      <w:pPr>
-        <w:keepLines/>
-        <w:spacing w:after="30" w:line="240" w:lineRule="auto"/>
-        <w:jc w:val="center"/>
-      </w:pPr>
-      <w:r>
-        <w:rPr>
-          <w:rFonts w:ascii="Arial" w:hAnsi="Arial" w:eastAsia="微软雅黑"/>
-          <w:sz w:val="16"/>
-          <w:szCs w:val="16"/>
-          <w:color w:val="17212B"/>
-        </w:rPr>
-        <w:t xml:space="preserve">图1  自绘开发阶段独立成绩及最终测试；工具条件单列。</w:t>
-      </w:r>
-    </w:p>
-    <w:p>
-      <w:pPr>
-        <w:pStyle w:val="1"/>
-        <w:keepNext/>
-        <w:pageBreakBefore/>
-        <w:keepLines/>
-        <w:spacing w:after="65" w:line="240" w:lineRule="auto"/>
-      </w:pPr>
-      <w:r>
-        <w:rPr>
-          <w:rFonts w:ascii="Arial" w:hAnsi="Arial" w:eastAsia="微软雅黑"/>
-          <w:sz w:val="22"/>
-          <w:szCs w:val="22"/>
-          <w:color w:val="008577"/>
-          <w:b/>
-          <w:bCs/>
-        </w:rPr>
-        <w:t xml:space="preserve">五、结果分析与问题调试</w:t>
-      </w:r>
-    </w:p>
-    <w:p>
-      <w:pPr>
-        <w:keepLines/>
-        <w:spacing w:after="50" w:line="240" w:lineRule="auto"/>
-      </w:pPr>
-      <w:r>
-        <w:rPr>
-          <w:rFonts w:ascii="Arial" w:hAnsi="Arial" w:eastAsia="微软雅黑"/>
-          <w:sz w:val="19"/>
-          <w:szCs w:val="19"/>
-          <w:color w:val="17212B"/>
-        </w:rPr>
-        <w:t xml:space="preserve">原10步中定位只有6次更新，8条种子覆盖6格且缺第二行；两轮没有新增定位样本。延长原种子至400步后种子8/8，但开发仅10/128；补齐128图的中文/紧凑编码仅8/128、11/128。说明格式学会、训练拟合，均不能证明学会看图定位。</w:t>
-      </w:r>
-    </w:p>
-    <w:p>
-      <w:pPr>
-        <w:keepLines/>
-        <w:spacing w:after="50" w:line="240" w:lineRule="auto"/>
-      </w:pPr>
-      <w:r>
-        <w:rPr>
-          <w:rFonts w:ascii="Arial" w:hAnsi="Arial" w:eastAsia="微软雅黑"/>
-          <w:sz w:val="19"/>
-          <w:szCs w:val="19"/>
-          <w:color w:val="17212B"/>
-        </w:rPr>
-        <w:t xml:space="preserve">视觉适配固定128图训练后训练抽样16/16、开发16/128；变化图最佳开发为78/128（step4000）。开发重复比较可能乐观，所以最终结论以未参与选择的184题为准。变化图同时增加数量、多样性和课程安排，不能只归因于一个因素。</w:t>
-      </w:r>
-    </w:p>
-    <w:p>
-      <w:pPr>
-        <w:keepLines/>
-        <w:spacing w:after="50" w:line="240" w:lineRule="auto"/>
-      </w:pPr>
-      <w:r>
-        <w:rPr>
-          <w:rFonts w:ascii="Arial" w:hAnsi="Arial" w:eastAsia="微软雅黑"/>
-          <w:sz w:val="19"/>
-          <w:szCs w:val="19"/>
-          <w:color w:val="17212B"/>
-        </w:rPr>
-        <w:t xml:space="preserve">最终独立定位109/128，空白图16格诊断为1/16；空白图题干相同、格位均衡，作为题目偏置检查。两轮RSI是否提升以开发/留出独立回答判断，若回退则保留并由开发选择较早阶段，不挑最终测试最高分。</w:t>
-      </w:r>
-    </w:p>
-    <w:p>
-      <w:pPr>
-        <w:keepLines/>
-        <w:spacing w:after="50" w:line="240" w:lineRule="auto"/>
-      </w:pPr>
-      <w:r>
-        <w:rPr>
-          <w:rFonts w:ascii="Arial" w:hAnsi="Arial" w:eastAsia="微软雅黑"/>
-          <w:sz w:val="18"/>
-          <w:szCs w:val="18"/>
-          <w:color w:val="17212B"/>
-        </w:rPr>
-        <w:t xml:space="preserve">拓展B：自举样本再训后独立答对分别为第1轮5/7、第2轮8/8；这是训练反馈图复测，不能充作泛化成绩。</w:t>
-      </w:r>
-    </w:p>
-    <w:p>
-      <w:pPr>
-        <w:keepLines/>
-        <w:spacing w:after="50" w:line="240" w:lineRule="auto"/>
-      </w:pPr>
-      <w:r>
-        <w:rPr>
-          <w:rFonts w:ascii="Arial" w:hAnsi="Arial" w:eastAsia="微软雅黑"/>
-          <w:sz w:val="19"/>
-          <w:szCs w:val="19"/>
-          <w:color w:val="17212B"/>
-        </w:rPr>
-        <w:t xml:space="preserve">检测框提供外部视觉证据；候选核验在22道前序失败题上平均核验2.73次，首位命中0/22（失败子集），模型共评分195条候选。搜索全对依赖验证器，不能归为模型独立能力。自举保存核验后的生成/受限候选，未以GT替换。原计数全为1，新测试补齐0–4并拒绝重复数字。</w:t>
-      </w:r>
-    </w:p>
-    <w:p>
-      <w:pPr>
-        <w:keepLines/>
-        <w:spacing w:after="50" w:line="240" w:lineRule="auto"/>
-      </w:pPr>
-      <w:r>
-        <w:rPr>
-          <w:rFonts w:ascii="Arial" w:hAnsi="Arial" w:eastAsia="微软雅黑"/>
-          <w:sz w:val="18"/>
-          <w:szCs w:val="18"/>
-          <w:color w:val="17212B"/>
-        </w:rPr>
-        <w:t xml:space="preserve">纯CPU初跑遇到Windows GBK无法输出异常字符而中断，指定UTF-8后完整重跑。验证器适用纯色无重叠图，真实背景与遮挡未测；仅单次训练种子。128定位测试区间、逐格误差及全量像素核验见补充分析，不能外推通用能力。</w:t>
-      </w:r>
-    </w:p>
-    <w:p>
-      <w:pPr>
         <w:pStyle w:val="1"/>
         <w:keepNext/>
         <w:keepLines/>
-        <w:spacing w:after="65" w:line="240" w:lineRule="auto"/>
+        <w:spacing w:after="55" w:line="240" w:lineRule="auto"/>
       </w:pPr>
       <w:r>
         <w:rPr>
@@ -4427,7 +4510,7 @@
           <w:szCs w:val="18"/>
           <w:color w:val="17212B"/>
         </w:rPr>
-        <w:t xml:space="preserve">1．解析验证器无需训练、便于追溯；遮挡、同色连通和近似颜色是边界。本次4000新图核验无误判；实际遇到旧E10/E11重复1也被宽松数值解析接受，已严格格式化。真实图可换检测器/OCR，低置信度拒绝入池，闭环仍可成立。</w:t>
+        <w:t xml:space="preserve">1．解析式验证器无需训练，便于追溯；但同色连通、遮挡、边框断裂和近似颜色可能误判。本次新图均核验一致；原E10/E11重复数字被宽松解析接受的缺陷已用严格格式检查修正。真实图可换检测器/OCR，低置信度拒绝入池。</w:t>
       </w:r>
     </w:p>
     <w:p>
@@ -4442,7 +4525,7 @@
           <w:szCs w:val="18"/>
           <w:color w:val="17212B"/>
         </w:rPr>
-        <w:t xml:space="preserve">2．表6的SFT独立定位8/8，检测框辅助8/8，RSI两轮独立8/8、8/8；参数更新与即时工具收益分别由这些对照体现。</w:t>
+        <w:t xml:space="preserve">2．默认SFT、工具、两轮RSI定位均0/8；扩展V1、V2及其两轮为8/8。新测试独立定位与框辅助成绩单列；关闭工具后的新图结果才反映参数是否学会。3．高亮自查重看自身候选，验证器提供独立外部证据；后者更符合第11章调用工具并据返回结果行动的定义。</w:t>
       </w:r>
     </w:p>
     <w:p>
@@ -4457,7 +4540,7 @@
           <w:szCs w:val="18"/>
           <w:color w:val="17212B"/>
         </w:rPr>
-        <w:t xml:space="preserve">3．最终测试高亮自查在19次中改对9题；检测框重答在31次中通过9题（处理的是不同失败子集）。自查重看自己的候选，验证器则提供独立外部证据，更符合第11章调用工具并用返回结果行动的定义。</w:t>
+        <w:t xml:space="preserve">4．V2两轮新增15、12条，第二轮仍有定位与总分回退。纠错样本数量、分布、学习率、多任务遗忘和验证噪声都会影响上限；本次审计未见入池标签污染，不据此保证更长递归必然更好。</w:t>
       </w:r>
     </w:p>
     <w:p>
@@ -4472,7 +4555,7 @@
           <w:szCs w:val="18"/>
           <w:color w:val="17212B"/>
         </w:rPr>
-        <w:t xml:space="preserve">4．两轮新增7、1条。第二轮增益受重复题去重、分布窄、短步数和多任务遗忘影响；核验错误也可能污染池，但本次审计未发现。出现回退就保留并按开发集选阶段。</w:t>
+        <w:t xml:space="preserve">5．离散格位减轻小模型坐标回归与解析负担。4×4→8×8→16×16使类别16→64→256，格框变小可能提高命中时IoU，但覆盖样本、训练量和边界敏感性增加。6．无GT可用预训练模型提候选、独立检测或多源一致性核验并少量人工复核启动；低标注成本不等于算力和工具免费。</w:t>
       </w:r>
     </w:p>
     <w:p>
@@ -4487,37 +4570,7 @@
           <w:szCs w:val="18"/>
           <w:color w:val="17212B"/>
         </w:rPr>
-        <w:t xml:space="preserve">5．离散格位降低小模型输出与解析难度。4×4→8×8→16×16使答案从16→64→256类；格变小可减轻离散误差，命中时IoU可能提高，但每类覆盖、训练量及边界敏感性均增加。</w:t>
-      </w:r>
-    </w:p>
-    <w:p>
-      <w:pPr>
-        <w:keepLines/>
-        <w:spacing w:after="50" w:line="240" w:lineRule="auto"/>
-      </w:pPr>
-      <w:r>
-        <w:rPr>
-          <w:rFonts w:ascii="Arial" w:hAnsi="Arial" w:eastAsia="微软雅黑"/>
-          <w:sz w:val="18"/>
-          <w:szCs w:val="18"/>
-          <w:color w:val="17212B"/>
-        </w:rPr>
-        <w:t xml:space="preserve">6．无GT可用预训练模型提出候选，以高置信度检测/多源一致性核验，少量人工复核启动；未验证样本不入池。合成参数和可靠验证器提供低标注成本教师，但训练算力、工具调用及真实图复核并不免费。</w:t>
-      </w:r>
-    </w:p>
-    <w:p>
-      <w:pPr>
-        <w:keepLines/>
-        <w:spacing w:after="50" w:line="240" w:lineRule="auto"/>
-      </w:pPr>
-      <w:r>
-        <w:rPr>
-          <w:rFonts w:ascii="Arial" w:hAnsi="Arial" w:eastAsia="微软雅黑"/>
-          <w:sz w:val="18"/>
-          <w:szCs w:val="18"/>
-          <w:color w:val="17212B"/>
-        </w:rPr>
-        <w:t xml:space="preserve">样板补充：ChartQA用OCR/表格提取数值，按坐标轴、单位及聚合公式复算，证据冲突时拒绝入池。以上同时覆盖指南六题与样板四题。</w:t>
+        <w:t xml:space="preserve">样板补充：ChartQA用OCR/表格提取数值，按坐标轴、单位和聚合公式复算；证据冲突拒绝入池。以上覆盖指南六题与样板四题。</w:t>
       </w:r>
     </w:p>
     <w:p>
@@ -4525,7 +4578,7 @@
         <w:pStyle w:val="1"/>
         <w:keepNext/>
         <w:keepLines/>
-        <w:spacing w:after="65" w:line="240" w:lineRule="auto"/>
+        <w:spacing w:after="55" w:line="240" w:lineRule="auto"/>
       </w:pPr>
       <w:r>
         <w:rPr>
@@ -4551,7 +4604,7 @@
           <w:szCs w:val="19"/>
           <w:color w:val="17212B"/>
         </w:rPr>
-        <w:t xml:space="preserve">定位提升主要来自视觉适配与多样图SFT：原0/8→8/8；RSI开发106→104→100/128，未见泛化增益。最终独立109/128、检测框辅助120/128，后者体现工具贡献。教学上值得观察闭环边界；工程上纯色图直接解析更省算力，当前准确率不足以支撑精准定位。局限为合成分布、验证器覆盖与格位误差；下一步做真实图核验、多种子复测。</w:t>
+        <w:t xml:space="preserve">默认实验完整保留。多样图和视觉适配解决了原定位0/8；继续联合训练及保守RSI，使全新同题总分260→290/368、定位201→215/256。RSI仅有小幅开发定位收益，第二轮回退，不能夸大。教学上闭环值得复现；纯色图工程应用直接解析更便宜。仍有41道定位错误，且仅单训练种子、合成分布，下一步应做真实图核验与多种子复测。</w:t>
       </w:r>
     </w:p>
     <w:sectPr>

</xml_diff>

<commit_message>
lab06: complete final report requirements and submission review
</commit_message>
<xml_diff>
--- a/lab06/report/2024311281_孙驰_实验作业六.docx
+++ b/lab06/report/2024311281_孙驰_实验作业六.docx
@@ -334,7 +334,26 @@
           <w:szCs w:val="19"/>
           <w:color w:val="17212B"/>
         </w:rPr>
-        <w:t xml:space="preserve">完成256×256合成图的4×4定位、计数和存在性判断，运行高亮自查、像素核验、纠错入池和两轮再训练。保留指南默认10步参照，随后诊断定位失败并连续优化。改进模型在同一份全新368题上比上一版多答对30题；模型与工具收益分开统计。</w:t>
+        <w:t xml:space="preserve">按第11讲Harness反馈与Hermes自进化思路，完成256×256图的4×4定位、计数及存在性判断，保留指南10步参照和两轮RSI。改进模型在同一份全新368题多答对30题；分清参数学习与工具纠错的收益。</w:t>
+      </w:r>
+    </w:p>
+    <w:p>
+      <w:pPr>
+        <w:keepLines/>
+        <w:spacing w:after="25" w:line="240" w:lineRule="auto"/>
+      </w:pPr>
+      <w:r>
+        <w:rPr>
+          <w:rFonts w:ascii="Arial" w:hAnsi="Arial" w:eastAsia="微软雅黑"/>
+          <w:sz w:val="16"/>
+          <w:szCs w:val="16"/>
+          <w:color w:val="17212B"/>
+        </w:rPr>
+        <w:t xml:space="preserve">主要工作：1．构造均衡图像，核验标签与数据隔离。</w:t>
+        <w:br/>
+        <w:t xml:space="preserve">2．完成LoRA适配、高亮自查、工具核验及两轮自举训练。</w:t>
+        <w:br/>
+        <w:t xml:space="preserve">3．复核逐题结果、失败案例与模型／工具收益。</w:t>
       </w:r>
     </w:p>
     <w:p>
@@ -702,6 +721,23 @@
     <w:p>
       <w:pPr>
         <w:keepLines/>
+        <w:spacing w:after="25" w:line="240" w:lineRule="auto"/>
+      </w:pPr>
+      <w:r>
+        <w:rPr>
+          <w:rFonts w:ascii="Arial" w:hAnsi="Arial" w:eastAsia="微软雅黑"/>
+          <w:sz w:val="15"/>
+          <w:szCs w:val="15"/>
+          <w:color w:val="17212B"/>
+        </w:rPr>
+        <w:t xml:space="preserve">默认调用前缀：python hw6_rsi_localize.py --mode；按顺序执行：</w:t>
+        <w:br/>
+        <w:t xml:space="preserve">make_data；make_sft；infer；sft --steps 10；eval；rsi --rounds 2 --steps 10。</w:t>
+      </w:r>
+    </w:p>
+    <w:p>
+      <w:pPr>
+        <w:keepLines/>
         <w:spacing w:after="50" w:line="240" w:lineRule="auto"/>
       </w:pPr>
       <w:r>
@@ -711,7 +747,7 @@
           <w:szCs w:val="18"/>
           <w:color w:val="17212B"/>
         </w:rPr>
-        <w:t xml:space="preserve">HPC训练作业15408达到1小时限时，全部训练及选择已完成；作业15427仅续评，COMPLETED、退出码0:0。两作业累计77.5GPU分钟，分配已释放。CPU/FP32默认六阶段另行验证，8线程耗时690.6秒、6/6成功。</w:t>
+        <w:t xml:space="preserve">15408训练及选择完成后达到1小时限时；15427仅续评，COMPLETED/0:0。两作业累计77.5GPU分钟，分配已释放。CPU/FP32以8线程完整复跑六阶段，690.6秒、6/6成功。</w:t>
       </w:r>
     </w:p>
     <w:p>
@@ -760,7 +796,7 @@
           <w:szCs w:val="18"/>
           <w:color w:val="17212B"/>
         </w:rPr>
-        <w:t xml:space="preserve">默认语言LoRA参数921600；扩展视觉注意力、连接层与语言层后为1614336（0.6255%）。非重入检查点、三模块非零梯度、累积梯度除2及范数裁剪1保证训练有效。V2用3840新图，SFT实际3200微步：定位1920、计数960、存在320；半数定位图强化同色异形等干扰。</w:t>
+        <w:t xml:space="preserve">LoRA均r=8、α=16、dropout=0.05。默认语言参数921600（0.3580%）；视觉+连接层+语言扩展为1614336（0.6255%）。非重入检查点、三模块非零梯度、累积梯度除2和裁剪1保证更新。V2池3840图，SFT实际3200微步：定位1920、计数960、存在320；半数定位图强化同色异形干扰。</w:t>
       </w:r>
     </w:p>
     <w:p>
@@ -791,25 +827,6 @@
           <w:color w:val="17212B"/>
         </w:rPr>
         <w:t xml:space="preserve">全部新图逐张核验并排除历史及跨集RGB重复。按开发定位率、再总正确率选择，平分取早阶段；选择落盘后才生成新368题。V1与V2同图、同量化、同提示、同解码比较。旧最终184题已公开，仅留作历史；本次是累计改进，不能把收益归于某个单独改动。</w:t>
-      </w:r>
-    </w:p>
-    <w:p>
-      <w:pPr>
-        <w:keepLines/>
-        <w:spacing w:after="20" w:line="240" w:lineRule="auto"/>
-      </w:pPr>
-      <w:r>
-        <w:rPr>
-          <w:rFonts w:ascii="Arial" w:hAnsi="Arial" w:eastAsia="微软雅黑"/>
-          <w:sz w:val="13"/>
-          <w:szCs w:val="13"/>
-          <w:color w:val="17212B"/>
-        </w:rPr>
-        <w:t xml:space="preserve">真实日志节选（截取定位字段，完整输出见provenance）：</w:t>
-        <w:br/>
-        <w:t xml:space="preserve">[eval] v1_fresh_test {'loc': {'correct': 201, 'n': 256, 'valid': 256} …</w:t>
-        <w:br/>
-        <w:t xml:space="preserve">[eval] v2_fresh_test {'loc': {'correct': 215, 'n': 256, 'valid': 256} …</w:t>
       </w:r>
     </w:p>
     <w:p>
@@ -847,7 +864,7 @@
           <w:b/>
           <w:bCs/>
         </w:rPr>
-        <w:t xml:space="preserve">表6  指南15题默认五阶段及扩展对照（定位8／计数4／存在3）</w:t>
+        <w:t xml:space="preserve">表6  指南15题评测（默认五阶段为A30/NF4，扩展另列）</w:t>
       </w:r>
     </w:p>
     <w:tbl>
@@ -3723,6 +3740,40 @@
     </w:p>
     <w:p>
       <w:pPr>
+        <w:keepLines/>
+        <w:spacing w:after="25" w:line="240" w:lineRule="auto"/>
+      </w:pPr>
+      <w:r>
+        <w:rPr>
+          <w:rFonts w:ascii="Arial" w:hAnsi="Arial" w:eastAsia="微软雅黑"/>
+          <w:sz w:val="16"/>
+          <w:szCs w:val="16"/>
+          <w:color w:val="17212B"/>
+        </w:rPr>
+        <w:t xml:space="preserve">纠错转移：默认工具触发11次，错→对3、对→错0；V2新测试触发78/368，自查8/41、框重答17/70改对，错→对25、对→错0，净增25。两路处理不同失败子集，成功率不能直接横比。</w:t>
+      </w:r>
+    </w:p>
+    <w:p>
+      <w:pPr>
+        <w:keepLines/>
+        <w:spacing w:after="20" w:line="240" w:lineRule="auto"/>
+      </w:pPr>
+      <w:r>
+        <w:rPr>
+          <w:rFonts w:ascii="Arial" w:hAnsi="Arial" w:eastAsia="微软雅黑"/>
+          <w:sz w:val="13"/>
+          <w:szCs w:val="13"/>
+          <w:color w:val="17212B"/>
+        </w:rPr>
+        <w:t xml:space="preserve">真实日志节选（截取定位字段，完整输出见provenance）：</w:t>
+        <w:br/>
+        <w:t xml:space="preserve">[eval] v1_fresh_test {'loc': {'correct': 201, 'n': 256, 'valid': 256} …</w:t>
+        <w:br/>
+        <w:t xml:space="preserve">[eval] v2_fresh_test {'loc': {'correct': 215, 'n': 256, 'valid': 256} …</w:t>
+      </w:r>
+    </w:p>
+    <w:p>
+      <w:pPr>
         <w:keepNext/>
         <w:keepLines/>
         <w:jc w:val="center"/>
@@ -3844,7 +3895,7 @@
           <w:szCs w:val="18"/>
           <w:color w:val="17212B"/>
         </w:rPr>
-        <w:t xml:space="preserve">训练限时后只续评，保留15408原日志、全部源代码快照及15427选择哈希；不覆盖失败记录。CPU初跑GBK输出异常，固定UTF-8后六阶段完整通过。扩展测试补齐0–4并拒绝重复数字，避免原四道计数均为1造成常数答案高分。</w:t>
+        <w:t xml:space="preserve">定位41错中，25为相邻格、32落在其他对象格（两类可重叠），主要为位置偏差与干扰混淆。15408限时后只续评，选择哈希不变；CPU初跑GBK异常，UTF-8后六阶段通过。新计数补0–4并拒绝重复数字，避免常数回答高分。</w:t>
       </w:r>
     </w:p>
     <w:p>

</xml_diff>